<commit_message>
Se agrega ignacio individual + grupales
</commit_message>
<xml_diff>
--- a/Fase 2/Evidencias Grupales/2.6_GuiaEstudiante_Fase 2_Informe Final Proyecto APT.docx
+++ b/Fase 2/Evidencias Grupales/2.6_GuiaEstudiante_Fase 2_Informe Final Proyecto APT.docx
@@ -1,6 +1,6 @@
 
 <file path=word/document.xml><?xml version="1.0" encoding="utf-8"?>
-<w:document xmlns:wpc="http://schemas.microsoft.com/office/word/2010/wordprocessingCanvas" xmlns:cx="http://schemas.microsoft.com/office/drawing/2014/chartex" xmlns:mc="http://schemas.openxmlformats.org/markup-compatibility/2006" xmlns:o="urn:schemas-microsoft-com:office:office" xmlns:r="http://schemas.openxmlformats.org/officeDocument/2006/relationships" xmlns:m="http://schemas.openxmlformats.org/officeDocument/2006/math" xmlns:v="urn:schemas-microsoft-com:vml" xmlns:wp14="http://schemas.microsoft.com/office/word/2010/wordprocessingDrawing" xmlns:wp="http://schemas.openxmlformats.org/drawingml/2006/wordprocessingDrawing" xmlns:w10="urn:schemas-microsoft-com:office:word" xmlns:w="http://schemas.openxmlformats.org/wordprocessingml/2006/main" xmlns:w14="http://schemas.microsoft.com/office/word/2010/wordml" xmlns:w15="http://schemas.microsoft.com/office/word/2012/wordml" xmlns:w16se="http://schemas.microsoft.com/office/word/2015/wordml/symex" xmlns:wpg="http://schemas.microsoft.com/office/word/2010/wordprocessingGroup" xmlns:wpi="http://schemas.microsoft.com/office/word/2010/wordprocessingInk" xmlns:wne="http://schemas.microsoft.com/office/word/2006/wordml" xmlns:wps="http://schemas.microsoft.com/office/word/2010/wordprocessingShape" mc:Ignorable="w14 w15 w16se wp14">
+<w:document xmlns:wpc="http://schemas.microsoft.com/office/word/2010/wordprocessingCanvas" xmlns:cx="http://schemas.microsoft.com/office/drawing/2014/chartex" xmlns:cx1="http://schemas.microsoft.com/office/drawing/2015/9/8/chartex" xmlns:cx2="http://schemas.microsoft.com/office/drawing/2015/10/21/chartex" xmlns:cx3="http://schemas.microsoft.com/office/drawing/2016/5/9/chartex" xmlns:cx4="http://schemas.microsoft.com/office/drawing/2016/5/10/chartex" xmlns:cx5="http://schemas.microsoft.com/office/drawing/2016/5/11/chartex" xmlns:cx6="http://schemas.microsoft.com/office/drawing/2016/5/12/chartex" xmlns:cx7="http://schemas.microsoft.com/office/drawing/2016/5/13/chartex" xmlns:cx8="http://schemas.microsoft.com/office/drawing/2016/5/14/chartex" xmlns:mc="http://schemas.openxmlformats.org/markup-compatibility/2006" xmlns:aink="http://schemas.microsoft.com/office/drawing/2016/ink" xmlns:am3d="http://schemas.microsoft.com/office/drawing/2017/model3d" xmlns:o="urn:schemas-microsoft-com:office:office" xmlns:oel="http://schemas.microsoft.com/office/2019/extlst" xmlns:r="http://schemas.openxmlformats.org/officeDocument/2006/relationships" xmlns:m="http://schemas.openxmlformats.org/officeDocument/2006/math" xmlns:v="urn:schemas-microsoft-com:vml" xmlns:wp14="http://schemas.microsoft.com/office/word/2010/wordprocessingDrawing" xmlns:wp="http://schemas.openxmlformats.org/drawingml/2006/wordprocessingDrawing" xmlns:w10="urn:schemas-microsoft-com:office:word" xmlns:w="http://schemas.openxmlformats.org/wordprocessingml/2006/main" xmlns:w14="http://schemas.microsoft.com/office/word/2010/wordml" xmlns:w15="http://schemas.microsoft.com/office/word/2012/wordml" xmlns:w16cex="http://schemas.microsoft.com/office/word/2018/wordml/cex" xmlns:w16cid="http://schemas.microsoft.com/office/word/2016/wordml/cid" xmlns:w16="http://schemas.microsoft.com/office/word/2018/wordml" xmlns:w16du="http://schemas.microsoft.com/office/word/2023/wordml/word16du" xmlns:w16sdtdh="http://schemas.microsoft.com/office/word/2020/wordml/sdtdatahash" xmlns:w16sdtfl="http://schemas.microsoft.com/office/word/2024/wordml/sdtformatlock" xmlns:w16se="http://schemas.microsoft.com/office/word/2015/wordml/symex" xmlns:wpg="http://schemas.microsoft.com/office/word/2010/wordprocessingGroup" xmlns:wpi="http://schemas.microsoft.com/office/word/2010/wordprocessingInk" xmlns:wne="http://schemas.microsoft.com/office/word/2006/wordml" xmlns:wps="http://schemas.microsoft.com/office/word/2010/wordprocessingShape" mc:Ignorable="w14 w15 w16se w16cid w16 w16cex w16sdtdh w16sdtfl w16du wp14">
   <w:body>
     <w:p>
       <w:r>
@@ -165,6 +165,7 @@
                                 </w:rPr>
                                 <w:t xml:space="preserve">Asignatura </w:t>
                               </w:r>
+                              <w:proofErr w:type="spellStart"/>
                               <w:r>
                                 <w:rPr>
                                   <w:b/>
@@ -174,8 +175,7 @@
                                 </w:rPr>
                                 <w:t>Capstone</w:t>
                               </w:r>
-                              <w:bookmarkStart w:id="0" w:name="_GoBack"/>
-                              <w:bookmarkEnd w:id="0"/>
+                              <w:proofErr w:type="spellEnd"/>
                             </w:p>
                           </w:txbxContent>
                         </wps:txbx>
@@ -240,7 +240,7 @@
           </mc:Choice>
           <mc:Fallback>
             <w:pict>
-              <v:group w14:anchorId="7466F1C2" id="Grupo 53" o:spid="_x0000_s1026" style="position:absolute;margin-left:-24.7pt;margin-top:3pt;width:491.25pt;height:123pt;z-index:251659264;mso-position-horizontal-relative:margin;mso-width-relative:margin;mso-height-relative:margin" coordsize="59912,15621" o:gfxdata="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">
+              <v:group w14:anchorId="7466F1C2" id="Grupo 53" o:spid="_x0000_s1026" style="position:absolute;margin-left:-24.7pt;margin-top:3pt;width:491.25pt;height:123pt;z-index:251659264;mso-position-horizontal-relative:margin;mso-width-relative:margin;mso-height-relative:margin" coordsize="59912,15621" o:gfxdata="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">
                 <v:shapetype id="_x0000_t202" coordsize="21600,21600" o:spt="202" path="m,l,21600r21600,l21600,xe">
                   <v:stroke joinstyle="miter"/>
                   <v:path gradientshapeok="t" o:connecttype="rect"/>
@@ -352,6 +352,7 @@
                           </w:rPr>
                           <w:t xml:space="preserve">Asignatura </w:t>
                         </w:r>
+                        <w:proofErr w:type="spellStart"/>
                         <w:r>
                           <w:rPr>
                             <w:b/>
@@ -361,8 +362,7 @@
                           </w:rPr>
                           <w:t>Capstone</w:t>
                         </w:r>
-                        <w:bookmarkStart w:id="1" w:name="_GoBack"/>
-                        <w:bookmarkEnd w:id="1"/>
+                        <w:proofErr w:type="spellEnd"/>
                       </w:p>
                     </w:txbxContent>
                   </v:textbox>
@@ -705,19 +705,40 @@
           <w:p>
             <w:pPr>
               <w:rPr>
-                <w:b/>
-              </w:rPr>
-            </w:pPr>
-            <w:r>
-              <w:rPr>
-                <w:rFonts w:ascii="Calibri" w:hAnsi="Calibri" w:cs="Arial"/>
-                <w:i/>
-                <w:color w:val="548DD4"/>
-                <w:sz w:val="20"/>
-                <w:szCs w:val="20"/>
-                <w:lang w:eastAsia="es-CL"/>
-              </w:rPr>
-              <w:t>Escribe el nombre de tu Proyecto APT.</w:t>
+                <w:bCs/>
+              </w:rPr>
+            </w:pPr>
+            <w:proofErr w:type="spellStart"/>
+            <w:r>
+              <w:rPr>
+                <w:bCs/>
+              </w:rPr>
+              <w:t>PortIA</w:t>
+            </w:r>
+            <w:proofErr w:type="spellEnd"/>
+            <w:r>
+              <w:rPr>
+                <w:bCs/>
+              </w:rPr>
+              <w:t xml:space="preserve"> </w:t>
+            </w:r>
+            <w:r>
+              <w:rPr>
+                <w:bCs/>
+              </w:rPr>
+              <w:t xml:space="preserve">- </w:t>
+            </w:r>
+            <w:r>
+              <w:rPr>
+                <w:bCs/>
+              </w:rPr>
+              <w:t>Sistema de Gestión de Contenedores y Alertas de Multas Portuarias</w:t>
+            </w:r>
+            <w:r>
+              <w:rPr>
+                <w:bCs/>
+              </w:rPr>
+              <w:t xml:space="preserve"> </w:t>
             </w:r>
           </w:p>
         </w:tc>
@@ -755,41 +776,20 @@
           <w:p>
             <w:pPr>
               <w:rPr>
-                <w:b/>
-              </w:rPr>
-            </w:pPr>
-            <w:r>
-              <w:rPr>
-                <w:rFonts w:ascii="Calibri" w:hAnsi="Calibri" w:cs="Arial"/>
-                <w:i/>
-                <w:color w:val="548DD4"/>
-                <w:sz w:val="20"/>
-                <w:szCs w:val="20"/>
-                <w:lang w:eastAsia="es-CL"/>
-              </w:rPr>
-              <w:t xml:space="preserve">Menciona la(s) área(s) de desempeño de tu Plan de Estudio que </w:t>
-            </w:r>
-            <w:r>
-              <w:rPr>
-                <w:rFonts w:ascii="Calibri" w:hAnsi="Calibri" w:cs="Arial"/>
-                <w:i/>
-                <w:color w:val="548DD4"/>
-                <w:sz w:val="20"/>
-                <w:szCs w:val="20"/>
-                <w:lang w:eastAsia="es-CL"/>
-              </w:rPr>
-              <w:t xml:space="preserve">abordaron </w:t>
-            </w:r>
-            <w:r>
-              <w:rPr>
-                <w:rFonts w:ascii="Calibri" w:hAnsi="Calibri" w:cs="Arial"/>
-                <w:i/>
-                <w:color w:val="548DD4"/>
-                <w:sz w:val="20"/>
-                <w:szCs w:val="20"/>
-                <w:lang w:eastAsia="es-CL"/>
-              </w:rPr>
-              <w:t>tu Proyecto APT.</w:t>
+                <w:bCs/>
+              </w:rPr>
+            </w:pPr>
+            <w:r>
+              <w:rPr>
+                <w:bCs/>
+              </w:rPr>
+              <w:t>Desarrollo de Software; Arquitectura de Software e Integración de Sistemas; Seguridad Informática.</w:t>
+            </w:r>
+            <w:r>
+              <w:rPr>
+                <w:bCs/>
+              </w:rPr>
+              <w:t xml:space="preserve"> </w:t>
             </w:r>
           </w:p>
         </w:tc>
@@ -835,41 +835,77 @@
           <w:p>
             <w:pPr>
               <w:rPr>
-                <w:b/>
-              </w:rPr>
-            </w:pPr>
-            <w:r>
-              <w:rPr>
-                <w:rFonts w:ascii="Calibri" w:hAnsi="Calibri" w:cs="Arial"/>
-                <w:i/>
-                <w:color w:val="548DD4"/>
-                <w:sz w:val="20"/>
-                <w:szCs w:val="20"/>
-                <w:lang w:eastAsia="es-CL"/>
-              </w:rPr>
-              <w:t xml:space="preserve">Menciona las competencias  de tu Plan de Estudio que </w:t>
-            </w:r>
-            <w:r>
-              <w:rPr>
-                <w:rFonts w:ascii="Calibri" w:hAnsi="Calibri" w:cs="Arial"/>
-                <w:i/>
-                <w:color w:val="548DD4"/>
-                <w:sz w:val="20"/>
-                <w:szCs w:val="20"/>
-                <w:lang w:eastAsia="es-CL"/>
-              </w:rPr>
-              <w:t>abordaste e</w:t>
-            </w:r>
-            <w:r>
-              <w:rPr>
-                <w:rFonts w:ascii="Calibri" w:hAnsi="Calibri" w:cs="Arial"/>
-                <w:i/>
-                <w:color w:val="548DD4"/>
-                <w:sz w:val="20"/>
-                <w:szCs w:val="20"/>
-                <w:lang w:eastAsia="es-CL"/>
-              </w:rPr>
-              <w:t>n tu Proyecto APT.</w:t>
+                <w:bCs/>
+              </w:rPr>
+            </w:pPr>
+            <w:r>
+              <w:rPr>
+                <w:bCs/>
+              </w:rPr>
+              <w:t>Desarrollar una solución de software utilizando técnicas que permitan sistematizar el proceso de desarrollo y mantenimiento, asegurando el logro de los objetivos.</w:t>
+            </w:r>
+          </w:p>
+          <w:p>
+            <w:pPr>
+              <w:rPr>
+                <w:bCs/>
+              </w:rPr>
+            </w:pPr>
+            <w:r>
+              <w:rPr>
+                <w:bCs/>
+              </w:rPr>
+              <w:t xml:space="preserve">Construir modelos de datos para soportar los requerimientos de la organización </w:t>
+            </w:r>
+            <w:r>
+              <w:rPr>
+                <w:bCs/>
+              </w:rPr>
+              <w:t>de acuerdo con</w:t>
+            </w:r>
+            <w:r>
+              <w:rPr>
+                <w:bCs/>
+              </w:rPr>
+              <w:t xml:space="preserve"> un diseño definido y escalable en el tiempo.</w:t>
+            </w:r>
+          </w:p>
+          <w:p>
+            <w:pPr>
+              <w:rPr>
+                <w:bCs/>
+              </w:rPr>
+            </w:pPr>
+            <w:r>
+              <w:rPr>
+                <w:bCs/>
+              </w:rPr>
+              <w:t xml:space="preserve">Gestionar proyectos informáticos, ofreciendo alternativas para la toma de decisiones </w:t>
+            </w:r>
+            <w:r>
+              <w:rPr>
+                <w:bCs/>
+              </w:rPr>
+              <w:t>de acuerdo con</w:t>
+            </w:r>
+            <w:r>
+              <w:rPr>
+                <w:bCs/>
+              </w:rPr>
+              <w:t xml:space="preserve"> los requerimientos de la organización.</w:t>
+            </w:r>
+          </w:p>
+          <w:p>
+            <w:pPr>
+              <w:rPr>
+                <w:bCs/>
+              </w:rPr>
+            </w:pPr>
+            <w:r>
+              <w:rPr>
+                <w:bCs/>
+              </w:rPr>
+              <w:t>Realizar pruebas de certificación tanto de los productos como de los procesos utilizando buenas prácticas definidas por la industria.</w:t>
             </w:r>
           </w:p>
         </w:tc>
@@ -971,6 +1007,7 @@
                 <w:color w:val="1F3864" w:themeColor="accent1" w:themeShade="80"/>
                 <w:sz w:val="18"/>
               </w:rPr>
+              <w:lastRenderedPageBreak/>
               <w:t xml:space="preserve">1. </w:t>
             </w:r>
             <w:r>
@@ -991,423 +1028,219 @@
           </w:tcPr>
           <w:p>
             <w:pPr>
+              <w:spacing w:after="60"/>
+              <w:jc w:val="both"/>
+            </w:pPr>
+            <w:r>
+              <w:rPr>
+                <w:rFonts w:ascii="Calibri" w:hAnsi="Calibri" w:cs="Arial"/>
+                <w:b/>
+                <w:sz w:val="18"/>
+                <w:szCs w:val="18"/>
+              </w:rPr>
+              <w:t xml:space="preserve">Problema que busca solucionar. </w:t>
+            </w:r>
+            <w:r>
+              <w:rPr>
+                <w:rFonts w:ascii="Calibri" w:hAnsi="Calibri" w:cs="Arial"/>
+                <w:sz w:val="18"/>
+                <w:szCs w:val="18"/>
+              </w:rPr>
+              <w:t xml:space="preserve">El comercio exterior chileno opera con datos fragmentados: la información crítica de un contenedor (número, naviera, ETA y días libres) viaja en documentos Bill </w:t>
+            </w:r>
+            <w:proofErr w:type="spellStart"/>
+            <w:r>
+              <w:rPr>
+                <w:rFonts w:ascii="Calibri" w:hAnsi="Calibri" w:cs="Arial"/>
+                <w:sz w:val="18"/>
+                <w:szCs w:val="18"/>
+              </w:rPr>
+              <w:t>of</w:t>
+            </w:r>
+            <w:proofErr w:type="spellEnd"/>
+            <w:r>
+              <w:rPr>
+                <w:rFonts w:ascii="Calibri" w:hAnsi="Calibri" w:cs="Arial"/>
+                <w:sz w:val="18"/>
+                <w:szCs w:val="18"/>
+              </w:rPr>
+              <w:t xml:space="preserve"> Lading (BL) en PDF, con un formato distinto por cada naviera, y se transcribe a mano a planillas Excel. Existen además cuatro “verdades” que no están conectadas: la documental (el PDF), la marítima (dónde está el barco), la portuaria (lo que registra el terminal) y la administrativa (el estado ante Aduana). Las multas de </w:t>
+            </w:r>
+            <w:r>
+              <w:rPr>
+                <w:rFonts w:ascii="Calibri" w:hAnsi="Calibri" w:cs="Arial"/>
+                <w:sz w:val="18"/>
+                <w:szCs w:val="18"/>
+              </w:rPr>
+              <w:t>sobreestadía (</w:t>
+            </w:r>
+            <w:r>
+              <w:rPr>
+                <w:rFonts w:ascii="Calibri" w:hAnsi="Calibri" w:cs="Arial"/>
+                <w:sz w:val="18"/>
+                <w:szCs w:val="18"/>
+              </w:rPr>
+              <w:t xml:space="preserve">contenedor que permanece en el puerto más días de los pactados) y de </w:t>
+            </w:r>
+            <w:r>
+              <w:rPr>
+                <w:rFonts w:ascii="Calibri" w:hAnsi="Calibri" w:cs="Arial"/>
+                <w:sz w:val="18"/>
+                <w:szCs w:val="18"/>
+              </w:rPr>
+              <w:t>detención (</w:t>
+            </w:r>
+            <w:r>
+              <w:rPr>
+                <w:rFonts w:ascii="Calibri" w:hAnsi="Calibri" w:cs="Arial"/>
+                <w:sz w:val="18"/>
+                <w:szCs w:val="18"/>
+              </w:rPr>
+              <w:t>contenedor que no se devuelve vacío a tiempo) se cobran sobre la verdad portuaria, pero hoy se gestionan con la documental, por lo que se reacciona tarde.</w:t>
+            </w:r>
+          </w:p>
+          <w:p>
+            <w:pPr>
+              <w:spacing w:after="60"/>
+              <w:jc w:val="both"/>
+            </w:pPr>
+            <w:r>
+              <w:rPr>
+                <w:rFonts w:ascii="Calibri" w:hAnsi="Calibri" w:cs="Arial"/>
+                <w:b/>
+                <w:sz w:val="18"/>
+                <w:szCs w:val="18"/>
+              </w:rPr>
+              <w:t xml:space="preserve">Relevancia para la profesión. </w:t>
+            </w:r>
+            <w:r>
+              <w:rPr>
+                <w:rFonts w:ascii="Calibri" w:hAnsi="Calibri" w:cs="Arial"/>
+                <w:sz w:val="18"/>
+                <w:szCs w:val="18"/>
+              </w:rPr>
+              <w:t>Es un problema real que combina las competencias centrales de un Ingeniero en Informática: análisis de requerimientos, arquitectura de software, integración de sistemas (mensajería, servicios externos, inteligencia artificial), modelado de datos, seguridad y gestión de proyectos. Además, la automatización de procesos con IA y la integración con sistemas de terceros son hoy una de las demandas más fuertes del campo laboral.</w:t>
+            </w:r>
+          </w:p>
+          <w:p>
+            <w:pPr>
+              <w:spacing w:after="60"/>
+              <w:jc w:val="both"/>
+            </w:pPr>
+            <w:r>
+              <w:rPr>
+                <w:rFonts w:ascii="Calibri" w:hAnsi="Calibri" w:cs="Arial"/>
+                <w:b/>
+                <w:sz w:val="18"/>
+                <w:szCs w:val="18"/>
+              </w:rPr>
+              <w:t xml:space="preserve">Ubicación y características. </w:t>
+            </w:r>
+            <w:r>
+              <w:rPr>
+                <w:rFonts w:ascii="Calibri" w:hAnsi="Calibri" w:cs="Arial"/>
+                <w:sz w:val="18"/>
+                <w:szCs w:val="18"/>
+              </w:rPr>
+              <w:t>Chile, en la operación logística de importación marítima, principalmente a través de los puertos de San Antonio y Valparaíso (terminales STI, TPS y DP World). El contexto son empresas importadoras medianas y grandes, que manejan entre 30 y 100 contenedores simultáneos, cada uno con su propio plazo de días libres, lo que puede significar hasta unas 500 acciones manuales de alta precisión al mes.</w:t>
+            </w:r>
+          </w:p>
+          <w:p>
+            <w:pPr>
+              <w:spacing w:after="60"/>
+              <w:jc w:val="both"/>
+            </w:pPr>
+            <w:r>
+              <w:rPr>
+                <w:rFonts w:ascii="Calibri" w:hAnsi="Calibri" w:cs="Arial"/>
+                <w:b/>
+                <w:sz w:val="18"/>
+                <w:szCs w:val="18"/>
+              </w:rPr>
+              <w:t xml:space="preserve">A quiénes afecta. </w:t>
+            </w:r>
+            <w:r>
+              <w:rPr>
+                <w:rFonts w:ascii="Calibri" w:hAnsi="Calibri" w:cs="Arial"/>
+                <w:sz w:val="18"/>
+                <w:szCs w:val="18"/>
+              </w:rPr>
+              <w:t>A los encargados de Comercio Exterior, que hoy coordinan la logística con Excel, correos y WhatsApp y cargan con una alta carga cognitiva; a sus jefaturas, que no tienen visibilidad consolidada del equipo; y a la empresa, que asume multas estimadas en 150</w:t>
+            </w:r>
+            <w:r>
+              <w:rPr>
+                <w:rFonts w:ascii="Calibri" w:hAnsi="Calibri" w:cs="Arial"/>
+                <w:sz w:val="18"/>
+                <w:szCs w:val="18"/>
+              </w:rPr>
+              <w:t>-</w:t>
+            </w:r>
+            <w:r>
+              <w:rPr>
+                <w:rFonts w:ascii="Calibri" w:hAnsi="Calibri" w:cs="Arial"/>
+                <w:sz w:val="18"/>
+                <w:szCs w:val="18"/>
+              </w:rPr>
+              <w:t>400 USD diarios por sobreestadía y 100–250 USD diarios por detención.</w:t>
+            </w:r>
+            <w:r>
+              <w:rPr>
+                <w:rFonts w:ascii="Calibri" w:hAnsi="Calibri" w:cs="Arial"/>
+                <w:sz w:val="18"/>
+                <w:szCs w:val="18"/>
+              </w:rPr>
+              <w:t xml:space="preserve"> </w:t>
+            </w:r>
+          </w:p>
+          <w:p>
+            <w:pPr>
               <w:pStyle w:val="paragraph"/>
-              <w:numPr>
-                <w:ilvl w:val="0"/>
-                <w:numId w:val="6"/>
-              </w:numPr>
-              <w:spacing w:before="0" w:beforeAutospacing="0" w:after="0" w:afterAutospacing="0"/>
-              <w:ind w:left="301" w:hanging="283"/>
-              <w:jc w:val="both"/>
-              <w:textAlignment w:val="baseline"/>
-              <w:rPr>
-                <w:rFonts w:ascii="Segoe UI" w:hAnsi="Segoe UI" w:cs="Segoe UI"/>
-                <w:color w:val="0070C0"/>
-                <w:sz w:val="18"/>
-                <w:szCs w:val="18"/>
-              </w:rPr>
-            </w:pPr>
-            <w:r>
-              <w:rPr>
-                <w:rStyle w:val="normaltextrun"/>
-                <w:rFonts w:ascii="Calibri" w:hAnsi="Calibri" w:cs="Calibri"/>
-                <w:i/>
-                <w:iCs/>
-                <w:color w:val="0070C0"/>
-                <w:sz w:val="18"/>
-                <w:szCs w:val="18"/>
-              </w:rPr>
-              <w:t>Señala qu</w:t>
-            </w:r>
-            <w:r>
-              <w:rPr>
-                <w:rStyle w:val="normaltextrun"/>
-                <w:rFonts w:ascii="Segoe UI" w:hAnsi="Segoe UI" w:cs="Segoe UI"/>
-                <w:i/>
-                <w:iCs/>
-                <w:color w:val="0070C0"/>
-                <w:sz w:val="18"/>
-                <w:szCs w:val="18"/>
-              </w:rPr>
-              <w:t>é</w:t>
-            </w:r>
-            <w:r>
-              <w:rPr>
-                <w:rStyle w:val="normaltextrun"/>
-                <w:rFonts w:ascii="Calibri" w:hAnsi="Calibri" w:cs="Calibri"/>
-                <w:i/>
-                <w:iCs/>
-                <w:color w:val="0070C0"/>
-                <w:sz w:val="18"/>
-                <w:szCs w:val="18"/>
-              </w:rPr>
-              <w:t xml:space="preserve"> problema busc</w:t>
-            </w:r>
-            <w:r>
-              <w:rPr>
-                <w:rStyle w:val="normaltextrun"/>
-                <w:rFonts w:ascii="Calibri" w:hAnsi="Calibri" w:cs="Calibri"/>
-                <w:i/>
-                <w:iCs/>
-                <w:color w:val="0070C0"/>
-                <w:sz w:val="18"/>
-                <w:szCs w:val="18"/>
-              </w:rPr>
-              <w:t>ó</w:t>
-            </w:r>
-            <w:r>
-              <w:rPr>
-                <w:rStyle w:val="normaltextrun"/>
-                <w:rFonts w:ascii="Calibri" w:hAnsi="Calibri" w:cs="Calibri"/>
-                <w:i/>
-                <w:iCs/>
-                <w:color w:val="0070C0"/>
-                <w:sz w:val="18"/>
-                <w:szCs w:val="18"/>
-              </w:rPr>
-              <w:t xml:space="preserve"> solucionar tu proyecto</w:t>
-            </w:r>
-            <w:r>
-              <w:rPr>
-                <w:rStyle w:val="normaltextrun"/>
-                <w:rFonts w:ascii="Calibri" w:hAnsi="Calibri" w:cs="Calibri"/>
-                <w:i/>
-                <w:iCs/>
-                <w:color w:val="0070C0"/>
-                <w:sz w:val="18"/>
-                <w:szCs w:val="18"/>
-              </w:rPr>
-              <w:t xml:space="preserve"> y</w:t>
-            </w:r>
-            <w:r>
-              <w:rPr>
-                <w:rStyle w:val="normaltextrun"/>
-                <w:rFonts w:ascii="Calibri" w:hAnsi="Calibri" w:cs="Calibri"/>
-                <w:i/>
-                <w:iCs/>
-                <w:color w:val="0070C0"/>
-                <w:sz w:val="18"/>
-                <w:szCs w:val="18"/>
-              </w:rPr>
-              <w:t xml:space="preserve"> </w:t>
-            </w:r>
-            <w:r>
-              <w:rPr>
-                <w:rStyle w:val="normaltextrun"/>
-                <w:rFonts w:ascii="Calibri" w:hAnsi="Calibri" w:cs="Calibri"/>
-                <w:i/>
-                <w:iCs/>
-                <w:color w:val="0070C0"/>
-                <w:sz w:val="18"/>
-                <w:szCs w:val="18"/>
-              </w:rPr>
-              <w:t>su</w:t>
-            </w:r>
-            <w:r>
-              <w:rPr>
-                <w:rStyle w:val="normaltextrun"/>
-                <w:rFonts w:ascii="Calibri" w:hAnsi="Calibri" w:cs="Calibri"/>
-                <w:i/>
-                <w:iCs/>
-                <w:color w:val="0070C0"/>
-                <w:sz w:val="18"/>
-                <w:szCs w:val="18"/>
-              </w:rPr>
-              <w:t xml:space="preserve"> relevancia para e</w:t>
-            </w:r>
-            <w:r>
-              <w:rPr>
-                <w:rStyle w:val="normaltextrun"/>
-                <w:rFonts w:ascii="Calibri" w:hAnsi="Calibri" w:cs="Calibri"/>
-                <w:i/>
-                <w:iCs/>
-                <w:color w:val="0070C0"/>
-                <w:sz w:val="18"/>
-                <w:szCs w:val="18"/>
-              </w:rPr>
-              <w:t>l</w:t>
-            </w:r>
-            <w:r>
-              <w:rPr>
-                <w:rStyle w:val="normaltextrun"/>
-                <w:rFonts w:ascii="Calibri" w:hAnsi="Calibri" w:cs="Calibri"/>
-                <w:i/>
-                <w:iCs/>
-                <w:color w:val="0070C0"/>
-                <w:sz w:val="18"/>
-                <w:szCs w:val="18"/>
-              </w:rPr>
-              <w:t xml:space="preserve"> contexto de la profesión</w:t>
-            </w:r>
-            <w:r>
-              <w:rPr>
-                <w:rStyle w:val="normaltextrun"/>
-                <w:rFonts w:ascii="Calibri" w:hAnsi="Calibri" w:cs="Calibri"/>
-                <w:i/>
-                <w:iCs/>
-                <w:color w:val="0070C0"/>
-                <w:sz w:val="18"/>
-                <w:szCs w:val="18"/>
-              </w:rPr>
-              <w:t>. Algunas preguntas que pueden ayudarte a responder este apartado son: </w:t>
-            </w:r>
-            <w:r>
-              <w:rPr>
-                <w:rStyle w:val="eop"/>
-                <w:rFonts w:ascii="Calibri" w:hAnsi="Calibri" w:cs="Calibri"/>
-                <w:color w:val="0070C0"/>
-                <w:sz w:val="18"/>
-                <w:szCs w:val="18"/>
-              </w:rPr>
-              <w:t> </w:t>
-            </w:r>
-          </w:p>
-          <w:p>
-            <w:pPr>
-              <w:pStyle w:val="paragraph"/>
-              <w:numPr>
-                <w:ilvl w:val="0"/>
-                <w:numId w:val="5"/>
-              </w:numPr>
               <w:spacing w:before="0" w:beforeAutospacing="0" w:after="0" w:afterAutospacing="0"/>
               <w:jc w:val="both"/>
               <w:textAlignment w:val="baseline"/>
               <w:rPr>
-                <w:rFonts w:ascii="Calibri" w:hAnsi="Calibri" w:cs="Calibri"/>
-                <w:color w:val="0070C0"/>
-                <w:sz w:val="18"/>
-                <w:szCs w:val="18"/>
-              </w:rPr>
-            </w:pPr>
-            <w:r>
-              <w:rPr>
-                <w:rStyle w:val="normaltextrun"/>
-                <w:rFonts w:ascii="Calibri" w:hAnsi="Calibri" w:cs="Calibri"/>
-                <w:i/>
-                <w:iCs/>
-                <w:color w:val="0070C0"/>
-                <w:sz w:val="18"/>
-                <w:szCs w:val="18"/>
-              </w:rPr>
-              <w:t>¿Por qué es relevante este tema para el campo laboral de tu carrera?</w:t>
-            </w:r>
-            <w:r>
-              <w:rPr>
-                <w:rStyle w:val="eop"/>
-                <w:rFonts w:ascii="Calibri" w:hAnsi="Calibri" w:cs="Calibri"/>
-                <w:color w:val="0070C0"/>
-                <w:sz w:val="18"/>
-                <w:szCs w:val="18"/>
-              </w:rPr>
-              <w:t> </w:t>
-            </w:r>
-          </w:p>
-          <w:p>
-            <w:pPr>
-              <w:pStyle w:val="paragraph"/>
-              <w:numPr>
-                <w:ilvl w:val="0"/>
-                <w:numId w:val="5"/>
-              </w:numPr>
-              <w:spacing w:before="0" w:beforeAutospacing="0" w:after="0" w:afterAutospacing="0"/>
-              <w:jc w:val="both"/>
-              <w:textAlignment w:val="baseline"/>
-              <w:rPr>
-                <w:rFonts w:ascii="Calibri" w:hAnsi="Calibri" w:cs="Calibri"/>
-                <w:color w:val="0070C0"/>
-                <w:sz w:val="18"/>
-                <w:szCs w:val="18"/>
-              </w:rPr>
-            </w:pPr>
-            <w:r>
-              <w:rPr>
-                <w:rStyle w:val="normaltextrun"/>
-                <w:rFonts w:ascii="Calibri" w:hAnsi="Calibri" w:cs="Calibri"/>
-                <w:i/>
-                <w:iCs/>
-                <w:color w:val="0070C0"/>
-                <w:sz w:val="18"/>
-                <w:szCs w:val="18"/>
-              </w:rPr>
-              <w:t>¿Dónde se ubica la situación que vas a abordar? (Ej.: País, región, comuna o institución) ¿Cuáles son las características principales de ese lugar? </w:t>
-            </w:r>
-            <w:r>
-              <w:rPr>
-                <w:rStyle w:val="eop"/>
-                <w:rFonts w:ascii="Calibri" w:hAnsi="Calibri" w:cs="Calibri"/>
-                <w:color w:val="0070C0"/>
-                <w:sz w:val="18"/>
-                <w:szCs w:val="18"/>
-              </w:rPr>
-              <w:t> </w:t>
-            </w:r>
-          </w:p>
-          <w:p>
-            <w:pPr>
-              <w:pStyle w:val="paragraph"/>
-              <w:numPr>
-                <w:ilvl w:val="0"/>
-                <w:numId w:val="5"/>
-              </w:numPr>
-              <w:spacing w:before="0" w:beforeAutospacing="0" w:after="0" w:afterAutospacing="0"/>
-              <w:jc w:val="both"/>
-              <w:textAlignment w:val="baseline"/>
-              <w:rPr>
-                <w:rFonts w:ascii="Calibri" w:hAnsi="Calibri" w:cs="Calibri"/>
-                <w:color w:val="0070C0"/>
-                <w:sz w:val="18"/>
-                <w:szCs w:val="18"/>
-              </w:rPr>
-            </w:pPr>
-            <w:r>
-              <w:rPr>
-                <w:rStyle w:val="normaltextrun"/>
-                <w:rFonts w:ascii="Calibri" w:hAnsi="Calibri" w:cs="Calibri"/>
-                <w:i/>
-                <w:iCs/>
-                <w:color w:val="0070C0"/>
-                <w:sz w:val="18"/>
-                <w:szCs w:val="18"/>
-              </w:rPr>
-              <w:t xml:space="preserve">¿A quiénes afecta o impacta la situación que </w:t>
-            </w:r>
-            <w:r>
-              <w:rPr>
-                <w:rStyle w:val="normaltextrun"/>
-                <w:rFonts w:ascii="Calibri" w:hAnsi="Calibri" w:cs="Calibri"/>
-                <w:i/>
-                <w:iCs/>
-                <w:color w:val="0070C0"/>
-                <w:sz w:val="18"/>
-                <w:szCs w:val="18"/>
-              </w:rPr>
-              <w:t>abordaste</w:t>
-            </w:r>
-            <w:r>
-              <w:rPr>
-                <w:rStyle w:val="normaltextrun"/>
-                <w:rFonts w:ascii="Calibri" w:hAnsi="Calibri" w:cs="Calibri"/>
-                <w:i/>
-                <w:iCs/>
-                <w:color w:val="0070C0"/>
-                <w:sz w:val="18"/>
-                <w:szCs w:val="18"/>
-              </w:rPr>
-              <w:t>? (Ej.: Grupo etario, usuarios de algún servicio, etc.).</w:t>
-            </w:r>
-            <w:r>
-              <w:rPr>
-                <w:rStyle w:val="eop"/>
-                <w:rFonts w:ascii="Calibri" w:hAnsi="Calibri" w:cs="Calibri"/>
-                <w:color w:val="0070C0"/>
-                <w:sz w:val="18"/>
-                <w:szCs w:val="18"/>
-              </w:rPr>
-              <w:t> </w:t>
-            </w:r>
-          </w:p>
-          <w:p>
-            <w:pPr>
-              <w:pStyle w:val="paragraph"/>
-              <w:numPr>
-                <w:ilvl w:val="0"/>
-                <w:numId w:val="5"/>
-              </w:numPr>
-              <w:spacing w:before="0" w:beforeAutospacing="0" w:after="0" w:afterAutospacing="0"/>
-              <w:jc w:val="both"/>
-              <w:textAlignment w:val="baseline"/>
-              <w:rPr>
-                <w:rFonts w:ascii="Calibri" w:hAnsi="Calibri" w:cs="Calibri"/>
-                <w:color w:val="0070C0"/>
-                <w:sz w:val="18"/>
-                <w:szCs w:val="18"/>
-              </w:rPr>
-            </w:pPr>
-            <w:r>
-              <w:rPr>
-                <w:rStyle w:val="normaltextrun"/>
-                <w:rFonts w:ascii="Calibri" w:hAnsi="Calibri" w:cs="Calibri"/>
-                <w:i/>
-                <w:iCs/>
-                <w:color w:val="0070C0"/>
-                <w:sz w:val="18"/>
-                <w:szCs w:val="18"/>
-              </w:rPr>
-              <w:t xml:space="preserve">¿Cuál </w:t>
-            </w:r>
-            <w:r>
-              <w:rPr>
-                <w:rStyle w:val="normaltextrun"/>
-                <w:rFonts w:ascii="Calibri" w:hAnsi="Calibri" w:cs="Calibri"/>
-                <w:i/>
-                <w:iCs/>
-                <w:color w:val="0070C0"/>
-                <w:sz w:val="18"/>
-                <w:szCs w:val="18"/>
-              </w:rPr>
-              <w:t>fue</w:t>
-            </w:r>
-            <w:r>
-              <w:rPr>
-                <w:rStyle w:val="normaltextrun"/>
-                <w:rFonts w:ascii="Calibri" w:hAnsi="Calibri" w:cs="Calibri"/>
-                <w:i/>
-                <w:iCs/>
-                <w:color w:val="0070C0"/>
-                <w:sz w:val="18"/>
-                <w:szCs w:val="18"/>
-              </w:rPr>
-              <w:t xml:space="preserve"> el aporte de valor (real o simulado) de tu Proyecto APT para el contexto laboral y/o social en que se situ</w:t>
-            </w:r>
-            <w:r>
-              <w:rPr>
-                <w:rStyle w:val="normaltextrun"/>
-                <w:rFonts w:ascii="Calibri" w:hAnsi="Calibri" w:cs="Calibri"/>
-                <w:i/>
-                <w:iCs/>
-                <w:color w:val="0070C0"/>
-                <w:sz w:val="18"/>
-                <w:szCs w:val="18"/>
-              </w:rPr>
-              <w:t>ó</w:t>
-            </w:r>
-            <w:r>
-              <w:rPr>
-                <w:rStyle w:val="normaltextrun"/>
-                <w:rFonts w:ascii="Calibri" w:hAnsi="Calibri" w:cs="Calibri"/>
-                <w:i/>
-                <w:iCs/>
-                <w:color w:val="0070C0"/>
-                <w:sz w:val="18"/>
-                <w:szCs w:val="18"/>
-              </w:rPr>
-              <w:t>?</w:t>
-            </w:r>
-            <w:r>
-              <w:rPr>
-                <w:rStyle w:val="eop"/>
-                <w:rFonts w:ascii="Calibri" w:hAnsi="Calibri" w:cs="Calibri"/>
-                <w:color w:val="0070C0"/>
-                <w:sz w:val="18"/>
-                <w:szCs w:val="18"/>
-              </w:rPr>
-              <w:t> </w:t>
-            </w:r>
-          </w:p>
-          <w:p>
-            <w:pPr>
-              <w:pStyle w:val="Prrafodelista"/>
-              <w:spacing w:after="0" w:line="240" w:lineRule="auto"/>
-              <w:jc w:val="both"/>
-              <w:rPr>
                 <w:rFonts w:ascii="Calibri" w:hAnsi="Calibri" w:cs="Arial"/>
                 <w:i/>
                 <w:color w:val="0070C0"/>
                 <w:sz w:val="18"/>
                 <w:szCs w:val="20"/>
-                <w:lang w:eastAsia="es-CL"/>
-              </w:rPr>
-            </w:pPr>
+              </w:rPr>
+            </w:pPr>
+            <w:r>
+              <w:rPr>
+                <w:rFonts w:ascii="Calibri" w:hAnsi="Calibri" w:cs="Arial"/>
+                <w:b/>
+                <w:sz w:val="18"/>
+                <w:szCs w:val="18"/>
+              </w:rPr>
+              <w:t xml:space="preserve">Aporte de valor (simulado). </w:t>
+            </w:r>
+            <w:proofErr w:type="spellStart"/>
+            <w:r>
+              <w:rPr>
+                <w:rFonts w:ascii="Calibri" w:hAnsi="Calibri" w:cs="Arial"/>
+                <w:sz w:val="18"/>
+                <w:szCs w:val="18"/>
+              </w:rPr>
+              <w:t>PortIA</w:t>
+            </w:r>
+            <w:proofErr w:type="spellEnd"/>
+            <w:r>
+              <w:rPr>
+                <w:rFonts w:ascii="Calibri" w:hAnsi="Calibri" w:cs="Arial"/>
+                <w:sz w:val="18"/>
+                <w:szCs w:val="18"/>
+              </w:rPr>
+              <w:t xml:space="preserve"> lee los BL con IA, los registra en una grilla centralizada, contrasta la información con el estado real del terminal y calcula las fechas límite de sobreestadía y detención. Un semáforo de riesgo y alertas en tiempo real (objetivo menor a 60 segundos) permiten actuar con unas 48 horas de anticipación, y los borradores de correo al agente de aduana se generan automáticamente pero nunca se envían sin aprobación humana. Para el proyecto el valor se valida con documentos BL sintéticos y una estrategia de contingencia simulada (Mock) de los terminales; además, el diseño considera la Ley 21.719 de protección de datos personales, ya que el PDF original nunca se guarda en la base de datos.</w:t>
+            </w:r>
+            <w:r>
+              <w:rPr>
+                <w:rFonts w:ascii="Calibri" w:hAnsi="Calibri" w:cs="Arial"/>
+                <w:sz w:val="18"/>
+                <w:szCs w:val="18"/>
+              </w:rPr>
+              <w:t xml:space="preserve"> </w:t>
+            </w:r>
           </w:p>
         </w:tc>
       </w:tr>
@@ -1445,13 +1278,491 @@
           </w:tcPr>
           <w:p>
             <w:pPr>
-              <w:pStyle w:val="Prrafodelista"/>
-              <w:numPr>
-                <w:ilvl w:val="0"/>
-                <w:numId w:val="1"/>
-              </w:numPr>
-              <w:spacing w:after="0" w:line="240" w:lineRule="auto"/>
-              <w:ind w:left="314" w:hanging="284"/>
+              <w:spacing w:after="60"/>
+              <w:jc w:val="both"/>
+            </w:pPr>
+            <w:r>
+              <w:rPr>
+                <w:rFonts w:ascii="Calibri" w:hAnsi="Calibri" w:cs="Arial"/>
+                <w:b/>
+                <w:sz w:val="18"/>
+                <w:szCs w:val="18"/>
+              </w:rPr>
+              <w:t xml:space="preserve">Objetivo general. </w:t>
+            </w:r>
+            <w:r>
+              <w:rPr>
+                <w:rFonts w:ascii="Calibri" w:hAnsi="Calibri" w:cs="Arial"/>
+                <w:sz w:val="18"/>
+                <w:szCs w:val="18"/>
+              </w:rPr>
+              <w:t xml:space="preserve">Desarrollar </w:t>
+            </w:r>
+            <w:proofErr w:type="spellStart"/>
+            <w:r>
+              <w:rPr>
+                <w:rFonts w:ascii="Calibri" w:hAnsi="Calibri" w:cs="Arial"/>
+                <w:sz w:val="18"/>
+                <w:szCs w:val="18"/>
+              </w:rPr>
+              <w:t>PortIA</w:t>
+            </w:r>
+            <w:proofErr w:type="spellEnd"/>
+            <w:r>
+              <w:rPr>
+                <w:rFonts w:ascii="Calibri" w:hAnsi="Calibri" w:cs="Arial"/>
+                <w:sz w:val="18"/>
+                <w:szCs w:val="18"/>
+              </w:rPr>
+              <w:t xml:space="preserve">, un sistema de gestión de contenedores que automatice la extracción de información desde documentos Bill </w:t>
+            </w:r>
+            <w:proofErr w:type="spellStart"/>
+            <w:r>
+              <w:rPr>
+                <w:rFonts w:ascii="Calibri" w:hAnsi="Calibri" w:cs="Arial"/>
+                <w:sz w:val="18"/>
+                <w:szCs w:val="18"/>
+              </w:rPr>
+              <w:t>of</w:t>
+            </w:r>
+            <w:proofErr w:type="spellEnd"/>
+            <w:r>
+              <w:rPr>
+                <w:rFonts w:ascii="Calibri" w:hAnsi="Calibri" w:cs="Arial"/>
+                <w:sz w:val="18"/>
+                <w:szCs w:val="18"/>
+              </w:rPr>
+              <w:t xml:space="preserve"> Lading mediante inteligencia artificial y la contraste con el estado real de los terminales portuarios, con el fin de anticipar y prevenir multas de sobreestadía y detención, implementado bajo una arquitectura N-Capas dentro del plazo de cuatro meses definido por la asignatura.</w:t>
+            </w:r>
+          </w:p>
+          <w:p>
+            <w:pPr>
+              <w:spacing w:after="60"/>
+              <w:jc w:val="both"/>
+            </w:pPr>
+            <w:r>
+              <w:rPr>
+                <w:rFonts w:ascii="Calibri" w:hAnsi="Calibri" w:cs="Arial"/>
+                <w:b/>
+                <w:sz w:val="18"/>
+                <w:szCs w:val="18"/>
+              </w:rPr>
+              <w:t>Objetivos específicos.</w:t>
+            </w:r>
+          </w:p>
+          <w:p>
+            <w:pPr>
+              <w:spacing w:after="60"/>
+              <w:ind w:left="220" w:hanging="200"/>
+              <w:jc w:val="both"/>
+            </w:pPr>
+            <w:r>
+              <w:rPr>
+                <w:rFonts w:ascii="Calibri" w:hAnsi="Calibri" w:cs="Arial"/>
+                <w:sz w:val="18"/>
+                <w:szCs w:val="18"/>
+              </w:rPr>
+              <w:t xml:space="preserve">• </w:t>
+            </w:r>
+            <w:r>
+              <w:rPr>
+                <w:rFonts w:ascii="Calibri" w:hAnsi="Calibri" w:cs="Arial"/>
+                <w:b/>
+                <w:sz w:val="18"/>
+                <w:szCs w:val="18"/>
+              </w:rPr>
+              <w:t xml:space="preserve">1. </w:t>
+            </w:r>
+            <w:r>
+              <w:rPr>
+                <w:rFonts w:ascii="Calibri" w:hAnsi="Calibri" w:cs="Arial"/>
+                <w:sz w:val="18"/>
+                <w:szCs w:val="18"/>
+              </w:rPr>
+              <w:t>Diseñar una arquitectura desacoplada bajo N-Capas (</w:t>
+            </w:r>
+            <w:proofErr w:type="spellStart"/>
+            <w:r>
+              <w:rPr>
+                <w:rFonts w:ascii="Calibri" w:hAnsi="Calibri" w:cs="Arial"/>
+                <w:sz w:val="18"/>
+                <w:szCs w:val="18"/>
+              </w:rPr>
+              <w:t>WebApi</w:t>
+            </w:r>
+            <w:proofErr w:type="spellEnd"/>
+            <w:r>
+              <w:rPr>
+                <w:rFonts w:ascii="Calibri" w:hAnsi="Calibri" w:cs="Arial"/>
+                <w:sz w:val="18"/>
+                <w:szCs w:val="18"/>
+              </w:rPr>
+              <w:t xml:space="preserve">, </w:t>
+            </w:r>
+            <w:proofErr w:type="spellStart"/>
+            <w:r>
+              <w:rPr>
+                <w:rFonts w:ascii="Calibri" w:hAnsi="Calibri" w:cs="Arial"/>
+                <w:sz w:val="18"/>
+                <w:szCs w:val="18"/>
+              </w:rPr>
+              <w:t>Services</w:t>
+            </w:r>
+            <w:proofErr w:type="spellEnd"/>
+            <w:r>
+              <w:rPr>
+                <w:rFonts w:ascii="Calibri" w:hAnsi="Calibri" w:cs="Arial"/>
+                <w:sz w:val="18"/>
+                <w:szCs w:val="18"/>
+              </w:rPr>
+              <w:t xml:space="preserve">, </w:t>
+            </w:r>
+            <w:proofErr w:type="spellStart"/>
+            <w:r>
+              <w:rPr>
+                <w:rFonts w:ascii="Calibri" w:hAnsi="Calibri" w:cs="Arial"/>
+                <w:sz w:val="18"/>
+                <w:szCs w:val="18"/>
+              </w:rPr>
+              <w:t>DependencyInjection</w:t>
+            </w:r>
+            <w:proofErr w:type="spellEnd"/>
+            <w:r>
+              <w:rPr>
+                <w:rFonts w:ascii="Calibri" w:hAnsi="Calibri" w:cs="Arial"/>
+                <w:sz w:val="18"/>
+                <w:szCs w:val="18"/>
+              </w:rPr>
+              <w:t xml:space="preserve"> y </w:t>
+            </w:r>
+            <w:proofErr w:type="spellStart"/>
+            <w:r>
+              <w:rPr>
+                <w:rFonts w:ascii="Calibri" w:hAnsi="Calibri" w:cs="Arial"/>
+                <w:sz w:val="18"/>
+                <w:szCs w:val="18"/>
+              </w:rPr>
+              <w:t>Configuration</w:t>
+            </w:r>
+            <w:proofErr w:type="spellEnd"/>
+            <w:r>
+              <w:rPr>
+                <w:rFonts w:ascii="Calibri" w:hAnsi="Calibri" w:cs="Arial"/>
+                <w:sz w:val="18"/>
+                <w:szCs w:val="18"/>
+              </w:rPr>
+              <w:t xml:space="preserve">), aplicando el Principio de Inversión de Dependencias (DIP) y el patrón </w:t>
+            </w:r>
+            <w:proofErr w:type="spellStart"/>
+            <w:r>
+              <w:rPr>
+                <w:rFonts w:ascii="Calibri" w:hAnsi="Calibri" w:cs="Arial"/>
+                <w:sz w:val="18"/>
+                <w:szCs w:val="18"/>
+              </w:rPr>
+              <w:t>Strategy</w:t>
+            </w:r>
+            <w:proofErr w:type="spellEnd"/>
+            <w:r>
+              <w:rPr>
+                <w:rFonts w:ascii="Calibri" w:hAnsi="Calibri" w:cs="Arial"/>
+                <w:sz w:val="18"/>
+                <w:szCs w:val="18"/>
+              </w:rPr>
+              <w:t>, que aísle el núcleo del negocio de las integraciones externas de mayor incertidumbre.</w:t>
+            </w:r>
+          </w:p>
+          <w:p>
+            <w:pPr>
+              <w:spacing w:after="60"/>
+              <w:ind w:left="220" w:hanging="200"/>
+              <w:jc w:val="both"/>
+            </w:pPr>
+            <w:r>
+              <w:rPr>
+                <w:rFonts w:ascii="Calibri" w:hAnsi="Calibri" w:cs="Arial"/>
+                <w:sz w:val="18"/>
+                <w:szCs w:val="18"/>
+              </w:rPr>
+              <w:t xml:space="preserve">• </w:t>
+            </w:r>
+            <w:r>
+              <w:rPr>
+                <w:rFonts w:ascii="Calibri" w:hAnsi="Calibri" w:cs="Arial"/>
+                <w:b/>
+                <w:sz w:val="18"/>
+                <w:szCs w:val="18"/>
+              </w:rPr>
+              <w:t xml:space="preserve">2. </w:t>
+            </w:r>
+            <w:r>
+              <w:rPr>
+                <w:rFonts w:ascii="Calibri" w:hAnsi="Calibri" w:cs="Arial"/>
+                <w:sz w:val="18"/>
+                <w:szCs w:val="18"/>
+              </w:rPr>
+              <w:t>Implementar el módulo de ingesta documental (PDF, PNG y JPG) con extracción automática de campos críticos mediante IA (</w:t>
+            </w:r>
+            <w:proofErr w:type="spellStart"/>
+            <w:r>
+              <w:rPr>
+                <w:rFonts w:ascii="Calibri" w:hAnsi="Calibri" w:cs="Arial"/>
+                <w:sz w:val="18"/>
+                <w:szCs w:val="18"/>
+              </w:rPr>
+              <w:t>DeepSeek</w:t>
+            </w:r>
+            <w:proofErr w:type="spellEnd"/>
+            <w:r>
+              <w:rPr>
+                <w:rFonts w:ascii="Calibri" w:hAnsi="Calibri" w:cs="Arial"/>
+                <w:sz w:val="18"/>
+                <w:szCs w:val="18"/>
+              </w:rPr>
+              <w:t>), con un nivel de confianza medible por campo.</w:t>
+            </w:r>
+          </w:p>
+          <w:p>
+            <w:pPr>
+              <w:spacing w:after="60"/>
+              <w:ind w:left="220" w:hanging="200"/>
+              <w:jc w:val="both"/>
+            </w:pPr>
+            <w:r>
+              <w:rPr>
+                <w:rFonts w:ascii="Calibri" w:hAnsi="Calibri" w:cs="Arial"/>
+                <w:sz w:val="18"/>
+                <w:szCs w:val="18"/>
+              </w:rPr>
+              <w:t xml:space="preserve">• </w:t>
+            </w:r>
+            <w:r>
+              <w:rPr>
+                <w:rFonts w:ascii="Calibri" w:hAnsi="Calibri" w:cs="Arial"/>
+                <w:b/>
+                <w:sz w:val="18"/>
+                <w:szCs w:val="18"/>
+              </w:rPr>
+              <w:t xml:space="preserve">3. </w:t>
+            </w:r>
+            <w:r>
+              <w:rPr>
+                <w:rFonts w:ascii="Calibri" w:hAnsi="Calibri" w:cs="Arial"/>
+                <w:sz w:val="18"/>
+                <w:szCs w:val="18"/>
+              </w:rPr>
+              <w:t xml:space="preserve">Implementar una estrategia dual de verificación del estado portuario, combinando web </w:t>
+            </w:r>
+            <w:proofErr w:type="spellStart"/>
+            <w:r>
+              <w:rPr>
+                <w:rFonts w:ascii="Calibri" w:hAnsi="Calibri" w:cs="Arial"/>
+                <w:sz w:val="18"/>
+                <w:szCs w:val="18"/>
+              </w:rPr>
+              <w:t>scraping</w:t>
+            </w:r>
+            <w:proofErr w:type="spellEnd"/>
+            <w:r>
+              <w:rPr>
+                <w:rFonts w:ascii="Calibri" w:hAnsi="Calibri" w:cs="Arial"/>
+                <w:sz w:val="18"/>
+                <w:szCs w:val="18"/>
+              </w:rPr>
+              <w:t xml:space="preserve"> real y una estrategia simulada (Mock), con conmutación automática mediante un </w:t>
+            </w:r>
+            <w:r>
+              <w:rPr>
+                <w:rFonts w:ascii="Calibri" w:hAnsi="Calibri" w:cs="Arial"/>
+                <w:sz w:val="18"/>
+                <w:szCs w:val="18"/>
+              </w:rPr>
+              <w:t>disyuntor</w:t>
+            </w:r>
+            <w:r>
+              <w:rPr>
+                <w:rFonts w:ascii="Calibri" w:hAnsi="Calibri" w:cs="Arial"/>
+                <w:sz w:val="18"/>
+                <w:szCs w:val="18"/>
+              </w:rPr>
+              <w:t>.</w:t>
+            </w:r>
+          </w:p>
+          <w:p>
+            <w:pPr>
+              <w:spacing w:after="60"/>
+              <w:ind w:left="220" w:hanging="200"/>
+              <w:jc w:val="both"/>
+            </w:pPr>
+            <w:r>
+              <w:rPr>
+                <w:rFonts w:ascii="Calibri" w:hAnsi="Calibri" w:cs="Arial"/>
+                <w:sz w:val="18"/>
+                <w:szCs w:val="18"/>
+              </w:rPr>
+              <w:t xml:space="preserve">• </w:t>
+            </w:r>
+            <w:r>
+              <w:rPr>
+                <w:rFonts w:ascii="Calibri" w:hAnsi="Calibri" w:cs="Arial"/>
+                <w:b/>
+                <w:sz w:val="18"/>
+                <w:szCs w:val="18"/>
+              </w:rPr>
+              <w:t xml:space="preserve">4. </w:t>
+            </w:r>
+            <w:r>
+              <w:rPr>
+                <w:rFonts w:ascii="Calibri" w:hAnsi="Calibri" w:cs="Arial"/>
+                <w:sz w:val="18"/>
+                <w:szCs w:val="18"/>
+              </w:rPr>
+              <w:t>Implementar el motor de reglas de negocio que calcule las fechas límite de sobreestadía y detención, determine el nivel de riesgo de cada contenedor y dispare notificaciones en tiempo real.</w:t>
+            </w:r>
+            <w:r>
+              <w:rPr>
+                <w:rFonts w:ascii="Calibri" w:hAnsi="Calibri" w:cs="Arial"/>
+                <w:sz w:val="18"/>
+                <w:szCs w:val="18"/>
+              </w:rPr>
+              <w:t xml:space="preserve"> </w:t>
+            </w:r>
+          </w:p>
+          <w:p>
+            <w:pPr>
+              <w:spacing w:after="60"/>
+              <w:ind w:left="220" w:hanging="200"/>
+              <w:jc w:val="both"/>
+            </w:pPr>
+            <w:r>
+              <w:rPr>
+                <w:rFonts w:ascii="Calibri" w:hAnsi="Calibri" w:cs="Arial"/>
+                <w:sz w:val="18"/>
+                <w:szCs w:val="18"/>
+              </w:rPr>
+              <w:t xml:space="preserve">• </w:t>
+            </w:r>
+            <w:r>
+              <w:rPr>
+                <w:rFonts w:ascii="Calibri" w:hAnsi="Calibri" w:cs="Arial"/>
+                <w:b/>
+                <w:sz w:val="18"/>
+                <w:szCs w:val="18"/>
+              </w:rPr>
+              <w:t xml:space="preserve">5. </w:t>
+            </w:r>
+            <w:r>
+              <w:rPr>
+                <w:rFonts w:ascii="Calibri" w:hAnsi="Calibri" w:cs="Arial"/>
+                <w:sz w:val="18"/>
+                <w:szCs w:val="18"/>
+              </w:rPr>
+              <w:t>Implementar el mecanismo de aprobación humana para toda comunicación externa generada automáticamente.</w:t>
+            </w:r>
+          </w:p>
+          <w:p>
+            <w:pPr>
+              <w:spacing w:after="60"/>
+              <w:ind w:left="220" w:hanging="200"/>
+              <w:jc w:val="both"/>
+            </w:pPr>
+            <w:r>
+              <w:rPr>
+                <w:rFonts w:ascii="Calibri" w:hAnsi="Calibri" w:cs="Arial"/>
+                <w:sz w:val="18"/>
+                <w:szCs w:val="18"/>
+              </w:rPr>
+              <w:lastRenderedPageBreak/>
+              <w:t xml:space="preserve">• </w:t>
+            </w:r>
+            <w:r>
+              <w:rPr>
+                <w:rFonts w:ascii="Calibri" w:hAnsi="Calibri" w:cs="Arial"/>
+                <w:b/>
+                <w:sz w:val="18"/>
+                <w:szCs w:val="18"/>
+              </w:rPr>
+              <w:t xml:space="preserve">6. </w:t>
+            </w:r>
+            <w:r>
+              <w:rPr>
+                <w:rFonts w:ascii="Calibri" w:hAnsi="Calibri" w:cs="Arial"/>
+                <w:sz w:val="18"/>
+                <w:szCs w:val="18"/>
+              </w:rPr>
+              <w:t xml:space="preserve">Incorporar mecanismos transversales de seguridad: autenticación JWT con ASP.NET Core </w:t>
+            </w:r>
+            <w:proofErr w:type="spellStart"/>
+            <w:r>
+              <w:rPr>
+                <w:rFonts w:ascii="Calibri" w:hAnsi="Calibri" w:cs="Arial"/>
+                <w:sz w:val="18"/>
+                <w:szCs w:val="18"/>
+              </w:rPr>
+              <w:t>Identity</w:t>
+            </w:r>
+            <w:proofErr w:type="spellEnd"/>
+            <w:r>
+              <w:rPr>
+                <w:rFonts w:ascii="Calibri" w:hAnsi="Calibri" w:cs="Arial"/>
+                <w:sz w:val="18"/>
+                <w:szCs w:val="18"/>
+              </w:rPr>
+              <w:t xml:space="preserve"> y </w:t>
+            </w:r>
+            <w:proofErr w:type="spellStart"/>
+            <w:r>
+              <w:rPr>
+                <w:rFonts w:ascii="Calibri" w:hAnsi="Calibri" w:cs="Arial"/>
+                <w:sz w:val="18"/>
+                <w:szCs w:val="18"/>
+              </w:rPr>
+              <w:t>BCrypt</w:t>
+            </w:r>
+            <w:proofErr w:type="spellEnd"/>
+            <w:r>
+              <w:rPr>
+                <w:rFonts w:ascii="Calibri" w:hAnsi="Calibri" w:cs="Arial"/>
+                <w:sz w:val="18"/>
+                <w:szCs w:val="18"/>
+              </w:rPr>
+              <w:t>, control de acceso por roles (RBAC) y auditoría de las acciones relevantes.</w:t>
+            </w:r>
+          </w:p>
+          <w:p>
+            <w:pPr>
+              <w:spacing w:after="60"/>
+              <w:ind w:left="220" w:hanging="200"/>
+              <w:jc w:val="both"/>
+            </w:pPr>
+            <w:r>
+              <w:rPr>
+                <w:rFonts w:ascii="Calibri" w:hAnsi="Calibri" w:cs="Arial"/>
+                <w:sz w:val="18"/>
+                <w:szCs w:val="18"/>
+              </w:rPr>
+              <w:t xml:space="preserve">• </w:t>
+            </w:r>
+            <w:r>
+              <w:rPr>
+                <w:rFonts w:ascii="Calibri" w:hAnsi="Calibri" w:cs="Arial"/>
+                <w:b/>
+                <w:sz w:val="18"/>
+                <w:szCs w:val="18"/>
+              </w:rPr>
+              <w:t xml:space="preserve">7. </w:t>
+            </w:r>
+            <w:r>
+              <w:rPr>
+                <w:rFonts w:ascii="Calibri" w:hAnsi="Calibri" w:cs="Arial"/>
+                <w:sz w:val="18"/>
+                <w:szCs w:val="18"/>
+              </w:rPr>
+              <w:t>Validar el sistema mediante pruebas funcionales e integrales que demuestren el flujo completo, desde la carga de un documento hasta la generación de una alerta accionable.</w:t>
+            </w:r>
+          </w:p>
+          <w:p>
+            <w:pPr>
               <w:jc w:val="both"/>
               <w:rPr>
                 <w:rFonts w:ascii="Calibri" w:hAnsi="Calibri" w:cs="Arial"/>
@@ -1465,38 +1776,43 @@
             <w:r>
               <w:rPr>
                 <w:rFonts w:ascii="Calibri" w:hAnsi="Calibri" w:cs="Arial"/>
-                <w:i/>
-                <w:color w:val="0070C0"/>
-                <w:sz w:val="18"/>
-                <w:szCs w:val="20"/>
-                <w:lang w:eastAsia="es-CL"/>
-              </w:rPr>
-              <w:t>Objetivo general y específicos.</w:t>
-            </w:r>
-          </w:p>
-          <w:p>
-            <w:pPr>
-              <w:pStyle w:val="Prrafodelista"/>
-              <w:jc w:val="both"/>
-              <w:rPr>
-                <w:rFonts w:ascii="Calibri" w:hAnsi="Calibri" w:cs="Arial"/>
-                <w:i/>
-                <w:color w:val="0070C0"/>
-                <w:sz w:val="18"/>
-                <w:szCs w:val="20"/>
-                <w:lang w:eastAsia="es-CL"/>
-              </w:rPr>
-            </w:pPr>
-            <w:r>
-              <w:rPr>
-                <w:rFonts w:ascii="Calibri" w:hAnsi="Calibri" w:cs="Arial"/>
-                <w:i/>
-                <w:color w:val="0070C0"/>
-                <w:sz w:val="18"/>
-                <w:szCs w:val="20"/>
-                <w:lang w:eastAsia="es-CL"/>
-              </w:rPr>
-              <w:t>¿Cuál es el objetivo general de tu Proyecto APT? ¿Cuáles son los objetivos específicos de tu Proyecto APT?</w:t>
+                <w:sz w:val="18"/>
+                <w:szCs w:val="18"/>
+              </w:rPr>
+              <w:t xml:space="preserve">• </w:t>
+            </w:r>
+            <w:r>
+              <w:rPr>
+                <w:rFonts w:ascii="Calibri" w:hAnsi="Calibri" w:cs="Arial"/>
+                <w:b/>
+                <w:sz w:val="18"/>
+                <w:szCs w:val="18"/>
+              </w:rPr>
+              <w:t xml:space="preserve">8. </w:t>
+            </w:r>
+            <w:r>
+              <w:rPr>
+                <w:rFonts w:ascii="Calibri" w:hAnsi="Calibri" w:cs="Arial"/>
+                <w:sz w:val="18"/>
+                <w:szCs w:val="18"/>
+              </w:rPr>
+              <w:t xml:space="preserve">Implementar el rol de jefe de analistas, con asignación de analistas a su cargo y un </w:t>
+            </w:r>
+            <w:r>
+              <w:rPr>
+                <w:rFonts w:ascii="Calibri" w:hAnsi="Calibri" w:cs="Arial"/>
+                <w:sz w:val="18"/>
+                <w:szCs w:val="18"/>
+              </w:rPr>
+              <w:t>panel</w:t>
+            </w:r>
+            <w:r>
+              <w:rPr>
+                <w:rFonts w:ascii="Calibri" w:hAnsi="Calibri" w:cs="Arial"/>
+                <w:sz w:val="18"/>
+                <w:szCs w:val="18"/>
+              </w:rPr>
+              <w:t xml:space="preserve"> de supervisión de solo lectura.</w:t>
             </w:r>
           </w:p>
         </w:tc>
@@ -1521,6 +1837,7 @@
                 <w:color w:val="1F3864" w:themeColor="accent1" w:themeShade="80"/>
                 <w:sz w:val="18"/>
               </w:rPr>
+              <w:lastRenderedPageBreak/>
               <w:t>3. Metodología</w:t>
             </w:r>
           </w:p>
@@ -1532,14 +1849,556 @@
           </w:tcPr>
           <w:p>
             <w:pPr>
-              <w:pStyle w:val="Prrafodelista"/>
-              <w:numPr>
-                <w:ilvl w:val="0"/>
-                <w:numId w:val="1"/>
-              </w:numPr>
-              <w:spacing w:after="0" w:line="240" w:lineRule="auto"/>
-              <w:ind w:left="318" w:hanging="284"/>
-              <w:jc w:val="both"/>
+              <w:spacing w:after="60"/>
+            </w:pPr>
+            <w:r>
+              <w:rPr>
+                <w:rFonts w:ascii="Calibri" w:hAnsi="Calibri" w:cs="Arial"/>
+                <w:b/>
+                <w:sz w:val="18"/>
+                <w:szCs w:val="18"/>
+              </w:rPr>
+              <w:t xml:space="preserve">Metodología utilizada. </w:t>
+            </w:r>
+            <w:r>
+              <w:rPr>
+                <w:rFonts w:ascii="Calibri" w:hAnsi="Calibri" w:cs="Arial"/>
+                <w:sz w:val="18"/>
+                <w:szCs w:val="18"/>
+              </w:rPr>
+              <w:t xml:space="preserve">Scrum, con 8 </w:t>
+            </w:r>
+            <w:r>
+              <w:rPr>
+                <w:rFonts w:ascii="Calibri" w:hAnsi="Calibri" w:cs="Arial"/>
+                <w:sz w:val="18"/>
+                <w:szCs w:val="18"/>
+              </w:rPr>
+              <w:t>iteraciones</w:t>
+            </w:r>
+            <w:r>
+              <w:rPr>
+                <w:rFonts w:ascii="Calibri" w:hAnsi="Calibri" w:cs="Arial"/>
+                <w:sz w:val="18"/>
+                <w:szCs w:val="18"/>
+              </w:rPr>
+              <w:t xml:space="preserve"> de dos semanas a lo largo de las 16 semanas del proyecto. El trabajo se gestiona con un </w:t>
+            </w:r>
+            <w:proofErr w:type="spellStart"/>
+            <w:r>
+              <w:rPr>
+                <w:rFonts w:ascii="Calibri" w:hAnsi="Calibri" w:cs="Arial"/>
+                <w:sz w:val="18"/>
+                <w:szCs w:val="18"/>
+              </w:rPr>
+              <w:t>Product</w:t>
+            </w:r>
+            <w:proofErr w:type="spellEnd"/>
+            <w:r>
+              <w:rPr>
+                <w:rFonts w:ascii="Calibri" w:hAnsi="Calibri" w:cs="Arial"/>
+                <w:sz w:val="18"/>
+                <w:szCs w:val="18"/>
+              </w:rPr>
+              <w:t xml:space="preserve"> Backlog de 16 historias de usuario</w:t>
+            </w:r>
+            <w:r>
+              <w:rPr>
+                <w:rFonts w:ascii="Calibri" w:hAnsi="Calibri" w:cs="Arial"/>
+                <w:sz w:val="18"/>
+                <w:szCs w:val="18"/>
+              </w:rPr>
+              <w:t xml:space="preserve"> </w:t>
+            </w:r>
+            <w:r>
+              <w:rPr>
+                <w:rFonts w:ascii="Calibri" w:hAnsi="Calibri" w:cs="Arial"/>
+                <w:sz w:val="18"/>
+                <w:szCs w:val="18"/>
+              </w:rPr>
+              <w:t xml:space="preserve">con criterios de aceptación en formato Dado/Cuando/Entonces y un </w:t>
+            </w:r>
+            <w:proofErr w:type="spellStart"/>
+            <w:r>
+              <w:rPr>
+                <w:rFonts w:ascii="Calibri" w:hAnsi="Calibri" w:cs="Arial"/>
+                <w:sz w:val="18"/>
+                <w:szCs w:val="18"/>
+              </w:rPr>
+              <w:t>Definition</w:t>
+            </w:r>
+            <w:proofErr w:type="spellEnd"/>
+            <w:r>
+              <w:rPr>
+                <w:rFonts w:ascii="Calibri" w:hAnsi="Calibri" w:cs="Arial"/>
+                <w:sz w:val="18"/>
+                <w:szCs w:val="18"/>
+              </w:rPr>
+              <w:t xml:space="preserve"> </w:t>
+            </w:r>
+            <w:proofErr w:type="spellStart"/>
+            <w:r>
+              <w:rPr>
+                <w:rFonts w:ascii="Calibri" w:hAnsi="Calibri" w:cs="Arial"/>
+                <w:sz w:val="18"/>
+                <w:szCs w:val="18"/>
+              </w:rPr>
+              <w:t>of</w:t>
+            </w:r>
+            <w:proofErr w:type="spellEnd"/>
+            <w:r>
+              <w:rPr>
+                <w:rFonts w:ascii="Calibri" w:hAnsi="Calibri" w:cs="Arial"/>
+                <w:sz w:val="18"/>
+                <w:szCs w:val="18"/>
+              </w:rPr>
+              <w:t xml:space="preserve"> Done por historia, sobre un tablero Kanban en GitHub </w:t>
+            </w:r>
+            <w:proofErr w:type="spellStart"/>
+            <w:r>
+              <w:rPr>
+                <w:rFonts w:ascii="Calibri" w:hAnsi="Calibri" w:cs="Arial"/>
+                <w:sz w:val="18"/>
+                <w:szCs w:val="18"/>
+              </w:rPr>
+              <w:t>Projects</w:t>
+            </w:r>
+            <w:proofErr w:type="spellEnd"/>
+            <w:r>
+              <w:rPr>
+                <w:rFonts w:ascii="Calibri" w:hAnsi="Calibri" w:cs="Arial"/>
+                <w:sz w:val="18"/>
+                <w:szCs w:val="18"/>
+              </w:rPr>
+              <w:t xml:space="preserve"> (Backlog, En progreso, En revisión, Hecho). Cada sprint entrega una funcionalidad completa de punta a punta (dominio, servicios e infraestructura) en lugar de avanzar capa por capa.</w:t>
+            </w:r>
+          </w:p>
+          <w:p>
+            <w:pPr>
+              <w:spacing w:after="60"/>
+            </w:pPr>
+            <w:r>
+              <w:rPr>
+                <w:rFonts w:ascii="Calibri" w:hAnsi="Calibri" w:cs="Arial"/>
+                <w:b/>
+                <w:sz w:val="18"/>
+                <w:szCs w:val="18"/>
+              </w:rPr>
+              <w:t>Fases y procedimientos:</w:t>
+            </w:r>
+          </w:p>
+          <w:p>
+            <w:pPr>
+              <w:spacing w:after="60"/>
+              <w:ind w:left="220" w:hanging="200"/>
+            </w:pPr>
+            <w:r>
+              <w:rPr>
+                <w:rFonts w:ascii="Calibri" w:hAnsi="Calibri" w:cs="Arial"/>
+                <w:sz w:val="18"/>
+                <w:szCs w:val="18"/>
+              </w:rPr>
+              <w:t xml:space="preserve">• </w:t>
+            </w:r>
+            <w:r>
+              <w:rPr>
+                <w:rFonts w:ascii="Calibri" w:hAnsi="Calibri" w:cs="Arial"/>
+                <w:b/>
+                <w:sz w:val="18"/>
+                <w:szCs w:val="18"/>
+              </w:rPr>
+              <w:t xml:space="preserve">Análisis y diseño: </w:t>
+            </w:r>
+            <w:r>
+              <w:rPr>
+                <w:rFonts w:ascii="Calibri" w:hAnsi="Calibri" w:cs="Arial"/>
+                <w:sz w:val="18"/>
+                <w:szCs w:val="18"/>
+              </w:rPr>
+              <w:t xml:space="preserve">levantamiento de la problemática, requerimientos, casos de uso, storyboards y arquitectura general, con especificaciones del Core, </w:t>
+            </w:r>
+            <w:proofErr w:type="spellStart"/>
+            <w:r>
+              <w:rPr>
+                <w:rFonts w:ascii="Calibri" w:hAnsi="Calibri" w:cs="Arial"/>
+                <w:sz w:val="18"/>
+                <w:szCs w:val="18"/>
+              </w:rPr>
+              <w:t>Frontend</w:t>
+            </w:r>
+            <w:proofErr w:type="spellEnd"/>
+            <w:r>
+              <w:rPr>
+                <w:rFonts w:ascii="Calibri" w:hAnsi="Calibri" w:cs="Arial"/>
+                <w:sz w:val="18"/>
+                <w:szCs w:val="18"/>
+              </w:rPr>
+              <w:t>, Agentes de IA, infraestructura y seguridad.</w:t>
+            </w:r>
+          </w:p>
+          <w:p>
+            <w:pPr>
+              <w:spacing w:after="60"/>
+              <w:ind w:left="220" w:hanging="200"/>
+            </w:pPr>
+            <w:r>
+              <w:rPr>
+                <w:rFonts w:ascii="Calibri" w:hAnsi="Calibri" w:cs="Arial"/>
+                <w:sz w:val="18"/>
+                <w:szCs w:val="18"/>
+              </w:rPr>
+              <w:t xml:space="preserve">• </w:t>
+            </w:r>
+            <w:r>
+              <w:rPr>
+                <w:rFonts w:ascii="Calibri" w:hAnsi="Calibri" w:cs="Arial"/>
+                <w:b/>
+                <w:sz w:val="18"/>
+                <w:szCs w:val="18"/>
+              </w:rPr>
+              <w:t xml:space="preserve">Diseño por contratos: </w:t>
+            </w:r>
+            <w:r>
+              <w:rPr>
+                <w:rFonts w:ascii="Calibri" w:hAnsi="Calibri" w:cs="Arial"/>
+                <w:sz w:val="18"/>
+                <w:szCs w:val="18"/>
+              </w:rPr>
+              <w:t>entidades, API, eventos de mensajería y seguridad se acuerdan entre los tres integrantes antes de programar; junto con el modelo relacional de 17 tablas en PostgreSQL y su diccionario de datos.</w:t>
+            </w:r>
+          </w:p>
+          <w:p>
+            <w:pPr>
+              <w:spacing w:after="60"/>
+              <w:ind w:left="220" w:hanging="200"/>
+            </w:pPr>
+            <w:r>
+              <w:rPr>
+                <w:rFonts w:ascii="Calibri" w:hAnsi="Calibri" w:cs="Arial"/>
+                <w:sz w:val="18"/>
+                <w:szCs w:val="18"/>
+              </w:rPr>
+              <w:t xml:space="preserve">• </w:t>
+            </w:r>
+            <w:r>
+              <w:rPr>
+                <w:rFonts w:ascii="Calibri" w:hAnsi="Calibri" w:cs="Arial"/>
+                <w:b/>
+                <w:sz w:val="18"/>
+                <w:szCs w:val="18"/>
+              </w:rPr>
+              <w:t xml:space="preserve">Planificación: </w:t>
+            </w:r>
+            <w:proofErr w:type="spellStart"/>
+            <w:r>
+              <w:rPr>
+                <w:rFonts w:ascii="Calibri" w:hAnsi="Calibri" w:cs="Arial"/>
+                <w:sz w:val="18"/>
+                <w:szCs w:val="18"/>
+              </w:rPr>
+              <w:t>Product</w:t>
+            </w:r>
+            <w:proofErr w:type="spellEnd"/>
+            <w:r>
+              <w:rPr>
+                <w:rFonts w:ascii="Calibri" w:hAnsi="Calibri" w:cs="Arial"/>
+                <w:sz w:val="18"/>
+                <w:szCs w:val="18"/>
+              </w:rPr>
+              <w:t xml:space="preserve"> Backlog, </w:t>
+            </w:r>
+            <w:proofErr w:type="spellStart"/>
+            <w:r>
+              <w:rPr>
+                <w:rFonts w:ascii="Calibri" w:hAnsi="Calibri" w:cs="Arial"/>
+                <w:sz w:val="18"/>
+                <w:szCs w:val="18"/>
+              </w:rPr>
+              <w:t>Definition</w:t>
+            </w:r>
+            <w:proofErr w:type="spellEnd"/>
+            <w:r>
+              <w:rPr>
+                <w:rFonts w:ascii="Calibri" w:hAnsi="Calibri" w:cs="Arial"/>
+                <w:sz w:val="18"/>
+                <w:szCs w:val="18"/>
+              </w:rPr>
+              <w:t xml:space="preserve"> </w:t>
+            </w:r>
+            <w:proofErr w:type="spellStart"/>
+            <w:r>
+              <w:rPr>
+                <w:rFonts w:ascii="Calibri" w:hAnsi="Calibri" w:cs="Arial"/>
+                <w:sz w:val="18"/>
+                <w:szCs w:val="18"/>
+              </w:rPr>
+              <w:t>of</w:t>
+            </w:r>
+            <w:proofErr w:type="spellEnd"/>
+            <w:r>
+              <w:rPr>
+                <w:rFonts w:ascii="Calibri" w:hAnsi="Calibri" w:cs="Arial"/>
+                <w:sz w:val="18"/>
+                <w:szCs w:val="18"/>
+              </w:rPr>
+              <w:t xml:space="preserve"> Done y plan semana a semana con tres líneas de trabajo en paralelo (Core y base de datos, </w:t>
+            </w:r>
+            <w:proofErr w:type="spellStart"/>
+            <w:r>
+              <w:rPr>
+                <w:rFonts w:ascii="Calibri" w:hAnsi="Calibri" w:cs="Arial"/>
+                <w:sz w:val="18"/>
+                <w:szCs w:val="18"/>
+              </w:rPr>
+              <w:t>Frontend</w:t>
+            </w:r>
+            <w:proofErr w:type="spellEnd"/>
+            <w:r>
+              <w:rPr>
+                <w:rFonts w:ascii="Calibri" w:hAnsi="Calibri" w:cs="Arial"/>
+                <w:sz w:val="18"/>
+                <w:szCs w:val="18"/>
+              </w:rPr>
+              <w:t>, Agentes y mensajería) con un punto de integración al cierre de cada sprint.</w:t>
+            </w:r>
+          </w:p>
+          <w:p>
+            <w:pPr>
+              <w:spacing w:after="60"/>
+              <w:ind w:left="220" w:hanging="200"/>
+            </w:pPr>
+            <w:r>
+              <w:rPr>
+                <w:rFonts w:ascii="Calibri" w:hAnsi="Calibri" w:cs="Arial"/>
+                <w:sz w:val="18"/>
+                <w:szCs w:val="18"/>
+              </w:rPr>
+              <w:t xml:space="preserve">• </w:t>
+            </w:r>
+            <w:r>
+              <w:rPr>
+                <w:rFonts w:ascii="Calibri" w:hAnsi="Calibri" w:cs="Arial"/>
+                <w:b/>
+                <w:sz w:val="18"/>
+                <w:szCs w:val="18"/>
+              </w:rPr>
+              <w:t xml:space="preserve">Implementación incremental: </w:t>
+            </w:r>
+            <w:r>
+              <w:rPr>
+                <w:rFonts w:ascii="Calibri" w:hAnsi="Calibri" w:cs="Arial"/>
+                <w:sz w:val="18"/>
+                <w:szCs w:val="18"/>
+              </w:rPr>
+              <w:t xml:space="preserve">desarrollo por </w:t>
+            </w:r>
+            <w:r>
+              <w:rPr>
+                <w:rFonts w:ascii="Calibri" w:hAnsi="Calibri" w:cs="Arial"/>
+                <w:sz w:val="18"/>
+                <w:szCs w:val="18"/>
+              </w:rPr>
+              <w:t>iteraciones</w:t>
+            </w:r>
+            <w:r>
+              <w:rPr>
+                <w:rFonts w:ascii="Calibri" w:hAnsi="Calibri" w:cs="Arial"/>
+                <w:sz w:val="18"/>
+                <w:szCs w:val="18"/>
+              </w:rPr>
+              <w:t xml:space="preserve"> en ramas </w:t>
+            </w:r>
+            <w:proofErr w:type="spellStart"/>
+            <w:r>
+              <w:rPr>
+                <w:rFonts w:ascii="Calibri" w:hAnsi="Calibri" w:cs="Arial"/>
+                <w:sz w:val="18"/>
+                <w:szCs w:val="18"/>
+              </w:rPr>
+              <w:t>feature</w:t>
+            </w:r>
+            <w:proofErr w:type="spellEnd"/>
+            <w:r>
+              <w:rPr>
+                <w:rFonts w:ascii="Calibri" w:hAnsi="Calibri" w:cs="Arial"/>
+                <w:sz w:val="18"/>
+                <w:szCs w:val="18"/>
+              </w:rPr>
+              <w:t xml:space="preserve">/[nombre]; </w:t>
+            </w:r>
+            <w:proofErr w:type="spellStart"/>
+            <w:r>
+              <w:rPr>
+                <w:rFonts w:ascii="Calibri" w:hAnsi="Calibri" w:cs="Arial"/>
+                <w:sz w:val="18"/>
+                <w:szCs w:val="18"/>
+              </w:rPr>
+              <w:t>main</w:t>
+            </w:r>
+            <w:proofErr w:type="spellEnd"/>
+            <w:r>
+              <w:rPr>
+                <w:rFonts w:ascii="Calibri" w:hAnsi="Calibri" w:cs="Arial"/>
+                <w:sz w:val="18"/>
+                <w:szCs w:val="18"/>
+              </w:rPr>
+              <w:t xml:space="preserve"> y </w:t>
+            </w:r>
+            <w:proofErr w:type="spellStart"/>
+            <w:r>
+              <w:rPr>
+                <w:rFonts w:ascii="Calibri" w:hAnsi="Calibri" w:cs="Arial"/>
+                <w:sz w:val="18"/>
+                <w:szCs w:val="18"/>
+              </w:rPr>
+              <w:t>develop</w:t>
+            </w:r>
+            <w:proofErr w:type="spellEnd"/>
+            <w:r>
+              <w:rPr>
+                <w:rFonts w:ascii="Calibri" w:hAnsi="Calibri" w:cs="Arial"/>
+                <w:sz w:val="18"/>
+                <w:szCs w:val="18"/>
+              </w:rPr>
+              <w:t xml:space="preserve"> se actualizan solo mediante Pull </w:t>
+            </w:r>
+            <w:proofErr w:type="spellStart"/>
+            <w:r>
+              <w:rPr>
+                <w:rFonts w:ascii="Calibri" w:hAnsi="Calibri" w:cs="Arial"/>
+                <w:sz w:val="18"/>
+                <w:szCs w:val="18"/>
+              </w:rPr>
+              <w:t>Request</w:t>
+            </w:r>
+            <w:proofErr w:type="spellEnd"/>
+            <w:r>
+              <w:rPr>
+                <w:rFonts w:ascii="Calibri" w:hAnsi="Calibri" w:cs="Arial"/>
+                <w:sz w:val="18"/>
+                <w:szCs w:val="18"/>
+              </w:rPr>
+              <w:t xml:space="preserve"> revisado por otro integrante, y se crea un tag al cierre de cada sprint.</w:t>
+            </w:r>
+          </w:p>
+          <w:p>
+            <w:pPr>
+              <w:spacing w:after="60"/>
+              <w:ind w:left="220" w:hanging="200"/>
+            </w:pPr>
+            <w:r>
+              <w:rPr>
+                <w:rFonts w:ascii="Calibri" w:hAnsi="Calibri" w:cs="Arial"/>
+                <w:sz w:val="18"/>
+                <w:szCs w:val="18"/>
+              </w:rPr>
+              <w:t xml:space="preserve">• </w:t>
+            </w:r>
+            <w:r>
+              <w:rPr>
+                <w:rFonts w:ascii="Calibri" w:hAnsi="Calibri" w:cs="Arial"/>
+                <w:b/>
+                <w:sz w:val="18"/>
+                <w:szCs w:val="18"/>
+              </w:rPr>
+              <w:t xml:space="preserve">Entorno reproducible: </w:t>
+            </w:r>
+            <w:r>
+              <w:rPr>
+                <w:rFonts w:ascii="Calibri" w:hAnsi="Calibri" w:cs="Arial"/>
+                <w:sz w:val="18"/>
+                <w:szCs w:val="18"/>
+              </w:rPr>
+              <w:t xml:space="preserve">todo el </w:t>
+            </w:r>
+            <w:proofErr w:type="spellStart"/>
+            <w:r>
+              <w:rPr>
+                <w:rFonts w:ascii="Calibri" w:hAnsi="Calibri" w:cs="Arial"/>
+                <w:sz w:val="18"/>
+                <w:szCs w:val="18"/>
+              </w:rPr>
+              <w:t>stack</w:t>
+            </w:r>
+            <w:proofErr w:type="spellEnd"/>
+            <w:r>
+              <w:rPr>
+                <w:rFonts w:ascii="Calibri" w:hAnsi="Calibri" w:cs="Arial"/>
+                <w:sz w:val="18"/>
+                <w:szCs w:val="18"/>
+              </w:rPr>
+              <w:t xml:space="preserve"> (PostgreSQL, </w:t>
+            </w:r>
+            <w:proofErr w:type="spellStart"/>
+            <w:r>
+              <w:rPr>
+                <w:rFonts w:ascii="Calibri" w:hAnsi="Calibri" w:cs="Arial"/>
+                <w:sz w:val="18"/>
+                <w:szCs w:val="18"/>
+              </w:rPr>
+              <w:t>MinIO</w:t>
+            </w:r>
+            <w:proofErr w:type="spellEnd"/>
+            <w:r>
+              <w:rPr>
+                <w:rFonts w:ascii="Calibri" w:hAnsi="Calibri" w:cs="Arial"/>
+                <w:sz w:val="18"/>
+                <w:szCs w:val="18"/>
+              </w:rPr>
+              <w:t xml:space="preserve">, Redis, Core, Agentes y Web) se levanta con Docker </w:t>
+            </w:r>
+            <w:proofErr w:type="spellStart"/>
+            <w:r>
+              <w:rPr>
+                <w:rFonts w:ascii="Calibri" w:hAnsi="Calibri" w:cs="Arial"/>
+                <w:sz w:val="18"/>
+                <w:szCs w:val="18"/>
+              </w:rPr>
+              <w:t>Compose</w:t>
+            </w:r>
+            <w:proofErr w:type="spellEnd"/>
+            <w:r>
+              <w:rPr>
+                <w:rFonts w:ascii="Calibri" w:hAnsi="Calibri" w:cs="Arial"/>
+                <w:sz w:val="18"/>
+                <w:szCs w:val="18"/>
+              </w:rPr>
+              <w:t>.</w:t>
+            </w:r>
+          </w:p>
+          <w:p>
+            <w:pPr>
+              <w:spacing w:after="60"/>
+              <w:ind w:left="220" w:hanging="200"/>
+            </w:pPr>
+            <w:r>
+              <w:rPr>
+                <w:rFonts w:ascii="Calibri" w:hAnsi="Calibri" w:cs="Arial"/>
+                <w:sz w:val="18"/>
+                <w:szCs w:val="18"/>
+              </w:rPr>
+              <w:t xml:space="preserve">• </w:t>
+            </w:r>
+            <w:r>
+              <w:rPr>
+                <w:rFonts w:ascii="Calibri" w:hAnsi="Calibri" w:cs="Arial"/>
+                <w:b/>
+                <w:sz w:val="18"/>
+                <w:szCs w:val="18"/>
+              </w:rPr>
+              <w:t xml:space="preserve">Integración y pruebas: </w:t>
+            </w:r>
+            <w:r>
+              <w:rPr>
+                <w:rFonts w:ascii="Calibri" w:hAnsi="Calibri" w:cs="Arial"/>
+                <w:sz w:val="18"/>
+                <w:szCs w:val="18"/>
+              </w:rPr>
+              <w:t>pruebas funcionales e integrales del flujo completo y cierre con documentación.</w:t>
+            </w:r>
+          </w:p>
+          <w:p>
+            <w:pPr>
               <w:rPr>
                 <w:rFonts w:ascii="Calibri" w:hAnsi="Calibri" w:cs="Arial"/>
                 <w:i/>
@@ -1552,83 +2411,107 @@
             <w:r>
               <w:rPr>
                 <w:rFonts w:ascii="Calibri" w:hAnsi="Calibri" w:cs="Arial"/>
-                <w:i/>
-                <w:color w:val="0070C0"/>
-                <w:sz w:val="18"/>
-                <w:szCs w:val="20"/>
-                <w:lang w:eastAsia="es-CL"/>
-              </w:rPr>
-              <w:t>Metodología utilizada y su pertinencia para cumplir objetivos.</w:t>
-            </w:r>
-          </w:p>
-          <w:p>
-            <w:pPr>
-              <w:ind w:left="720"/>
-              <w:rPr>
-                <w:rFonts w:ascii="Calibri" w:hAnsi="Calibri" w:cs="Arial"/>
-                <w:i/>
-                <w:color w:val="0070C0"/>
-                <w:sz w:val="18"/>
-                <w:szCs w:val="20"/>
-                <w:lang w:eastAsia="es-CL"/>
-              </w:rPr>
-            </w:pPr>
-            <w:r>
-              <w:rPr>
-                <w:rFonts w:ascii="Calibri" w:hAnsi="Calibri" w:cs="Arial"/>
-                <w:i/>
-                <w:color w:val="0070C0"/>
-                <w:sz w:val="18"/>
-                <w:szCs w:val="20"/>
-                <w:lang w:eastAsia="es-CL"/>
-              </w:rPr>
-              <w:t>¿Qué metodología utilizaste para desarrollar tu Proyecto APT?</w:t>
-            </w:r>
-            <w:r>
-              <w:rPr>
-                <w:rFonts w:ascii="Calibri" w:hAnsi="Calibri" w:cs="Arial"/>
-                <w:i/>
-                <w:color w:val="0070C0"/>
-                <w:sz w:val="18"/>
-                <w:szCs w:val="20"/>
-                <w:lang w:eastAsia="es-CL"/>
-              </w:rPr>
-              <w:t xml:space="preserve"> Describe las fases y procedimientos que llevaste a cabo para ejecutar tu proyecto.</w:t>
-            </w:r>
-          </w:p>
-          <w:p>
-            <w:pPr>
-              <w:ind w:left="720"/>
-              <w:rPr>
-                <w:rFonts w:ascii="Calibri" w:hAnsi="Calibri" w:cs="Arial"/>
-                <w:i/>
-                <w:color w:val="0070C0"/>
-                <w:sz w:val="18"/>
-                <w:szCs w:val="20"/>
-                <w:lang w:eastAsia="es-CL"/>
-              </w:rPr>
-            </w:pPr>
-            <w:r>
-              <w:rPr>
-                <w:rFonts w:ascii="Calibri" w:hAnsi="Calibri" w:cs="Arial"/>
-                <w:i/>
-                <w:color w:val="0070C0"/>
-                <w:sz w:val="18"/>
-                <w:szCs w:val="20"/>
-                <w:lang w:eastAsia="es-CL"/>
-              </w:rPr>
-              <w:t>Fundamenta, ¿p</w:t>
-            </w:r>
-            <w:r>
-              <w:rPr>
-                <w:rFonts w:ascii="Calibri" w:hAnsi="Calibri" w:cs="Arial"/>
-                <w:i/>
-                <w:color w:val="0070C0"/>
-                <w:sz w:val="18"/>
-                <w:szCs w:val="20"/>
-                <w:lang w:eastAsia="es-CL"/>
-              </w:rPr>
-              <w:t>or qué esta metodología era pertinente para cumplir los objetivos planteados?</w:t>
+                <w:b/>
+                <w:sz w:val="18"/>
+                <w:szCs w:val="18"/>
+              </w:rPr>
+              <w:t xml:space="preserve">Pertinencia. </w:t>
+            </w:r>
+            <w:r>
+              <w:rPr>
+                <w:rFonts w:ascii="Calibri" w:hAnsi="Calibri" w:cs="Arial"/>
+                <w:sz w:val="18"/>
+                <w:szCs w:val="18"/>
+              </w:rPr>
+              <w:t xml:space="preserve">El plazo es acotado (cuatro meses) y la solución tiene tres componentes independientes (Core, </w:t>
+            </w:r>
+            <w:proofErr w:type="spellStart"/>
+            <w:r>
+              <w:rPr>
+                <w:rFonts w:ascii="Calibri" w:hAnsi="Calibri" w:cs="Arial"/>
+                <w:sz w:val="18"/>
+                <w:szCs w:val="18"/>
+              </w:rPr>
+              <w:t>Frontend</w:t>
+            </w:r>
+            <w:proofErr w:type="spellEnd"/>
+            <w:r>
+              <w:rPr>
+                <w:rFonts w:ascii="Calibri" w:hAnsi="Calibri" w:cs="Arial"/>
+                <w:sz w:val="18"/>
+                <w:szCs w:val="18"/>
+              </w:rPr>
+              <w:t xml:space="preserve"> y Agentes de IA) y dos puntos de alta incertidumbre técnica (lectura de documentos y conexión con portales portuarios). Scrum permite entregar incrementos verificables, mostrar avances periódicos al profesor guía y corregir el rumbo temprano; el diseño por contratos y la mensajería asíncrona (</w:t>
+            </w:r>
+            <w:proofErr w:type="spellStart"/>
+            <w:r>
+              <w:rPr>
+                <w:rFonts w:ascii="Calibri" w:hAnsi="Calibri" w:cs="Arial"/>
+                <w:sz w:val="18"/>
+                <w:szCs w:val="18"/>
+              </w:rPr>
+              <w:t>RabbitMQ</w:t>
+            </w:r>
+            <w:proofErr w:type="spellEnd"/>
+            <w:r>
+              <w:rPr>
+                <w:rFonts w:ascii="Calibri" w:hAnsi="Calibri" w:cs="Arial"/>
+                <w:sz w:val="18"/>
+                <w:szCs w:val="18"/>
+              </w:rPr>
+              <w:t xml:space="preserve">) permiten que los tres integrantes trabajen en paralelo sin bloquearse; y el patrón </w:t>
+            </w:r>
+            <w:proofErr w:type="spellStart"/>
+            <w:r>
+              <w:rPr>
+                <w:rFonts w:ascii="Calibri" w:hAnsi="Calibri" w:cs="Arial"/>
+                <w:sz w:val="18"/>
+                <w:szCs w:val="18"/>
+              </w:rPr>
+              <w:t>Strategy</w:t>
+            </w:r>
+            <w:proofErr w:type="spellEnd"/>
+            <w:r>
+              <w:rPr>
+                <w:rFonts w:ascii="Calibri" w:hAnsi="Calibri" w:cs="Arial"/>
+                <w:sz w:val="18"/>
+                <w:szCs w:val="18"/>
+              </w:rPr>
+              <w:t xml:space="preserve"> con </w:t>
+            </w:r>
+            <w:r>
+              <w:rPr>
+                <w:rFonts w:ascii="Calibri" w:hAnsi="Calibri" w:cs="Arial"/>
+                <w:sz w:val="18"/>
+                <w:szCs w:val="18"/>
+              </w:rPr>
+              <w:t>disyuntor</w:t>
+            </w:r>
+            <w:r>
+              <w:rPr>
+                <w:rFonts w:ascii="Calibri" w:hAnsi="Calibri" w:cs="Arial"/>
+                <w:sz w:val="18"/>
+                <w:szCs w:val="18"/>
+              </w:rPr>
+              <w:t xml:space="preserve"> permite avanzar aun si el </w:t>
+            </w:r>
+            <w:proofErr w:type="spellStart"/>
+            <w:r>
+              <w:rPr>
+                <w:rFonts w:ascii="Calibri" w:hAnsi="Calibri" w:cs="Arial"/>
+                <w:sz w:val="18"/>
+                <w:szCs w:val="18"/>
+              </w:rPr>
+              <w:t>scraping</w:t>
+            </w:r>
+            <w:proofErr w:type="spellEnd"/>
+            <w:r>
+              <w:rPr>
+                <w:rFonts w:ascii="Calibri" w:hAnsi="Calibri" w:cs="Arial"/>
+                <w:sz w:val="18"/>
+                <w:szCs w:val="18"/>
+              </w:rPr>
+              <w:t xml:space="preserve"> presenta dificultades. La arquitectura y la estrategia de contingencia fueron validadas con el profesor guía.</w:t>
             </w:r>
           </w:p>
         </w:tc>
@@ -1656,7 +2539,6 @@
                 <w:color w:val="1F3864" w:themeColor="accent1" w:themeShade="80"/>
                 <w:sz w:val="18"/>
               </w:rPr>
-              <w:lastRenderedPageBreak/>
               <w:t>4. Desarrollo</w:t>
             </w:r>
           </w:p>
@@ -1668,14 +2550,1123 @@
           </w:tcPr>
           <w:p>
             <w:pPr>
-              <w:pStyle w:val="Prrafodelista"/>
-              <w:numPr>
-                <w:ilvl w:val="0"/>
-                <w:numId w:val="1"/>
-              </w:numPr>
-              <w:spacing w:after="0" w:line="240" w:lineRule="auto"/>
-              <w:ind w:left="318" w:hanging="284"/>
-              <w:jc w:val="both"/>
+              <w:spacing w:after="60"/>
+            </w:pPr>
+            <w:r>
+              <w:rPr>
+                <w:rFonts w:ascii="Calibri" w:hAnsi="Calibri" w:cs="Arial"/>
+                <w:b/>
+                <w:sz w:val="18"/>
+                <w:szCs w:val="18"/>
+              </w:rPr>
+              <w:t>Etapas y actividades desarrolladas:</w:t>
+            </w:r>
+          </w:p>
+          <w:p>
+            <w:pPr>
+              <w:spacing w:after="60"/>
+              <w:ind w:left="220" w:hanging="200"/>
+            </w:pPr>
+            <w:r>
+              <w:rPr>
+                <w:rFonts w:ascii="Calibri" w:hAnsi="Calibri" w:cs="Arial"/>
+                <w:sz w:val="18"/>
+                <w:szCs w:val="18"/>
+              </w:rPr>
+              <w:t xml:space="preserve">• </w:t>
+            </w:r>
+            <w:r>
+              <w:rPr>
+                <w:rFonts w:ascii="Calibri" w:hAnsi="Calibri" w:cs="Arial"/>
+                <w:b/>
+                <w:sz w:val="18"/>
+                <w:szCs w:val="18"/>
+              </w:rPr>
+              <w:t xml:space="preserve">Semanas 1-2, análisis y </w:t>
+            </w:r>
+            <w:r>
+              <w:rPr>
+                <w:rFonts w:ascii="Calibri" w:hAnsi="Calibri" w:cs="Arial"/>
+                <w:b/>
+                <w:sz w:val="18"/>
+                <w:szCs w:val="18"/>
+              </w:rPr>
+              <w:t>configuración</w:t>
+            </w:r>
+            <w:r>
+              <w:rPr>
+                <w:rFonts w:ascii="Calibri" w:hAnsi="Calibri" w:cs="Arial"/>
+                <w:b/>
+                <w:sz w:val="18"/>
+                <w:szCs w:val="18"/>
+              </w:rPr>
+              <w:t xml:space="preserve">: </w:t>
+            </w:r>
+            <w:r>
+              <w:rPr>
+                <w:rFonts w:ascii="Calibri" w:hAnsi="Calibri" w:cs="Arial"/>
+                <w:sz w:val="18"/>
+                <w:szCs w:val="18"/>
+              </w:rPr>
+              <w:t xml:space="preserve">cierre del análisis y puesta en marcha del entorno local con Docker </w:t>
+            </w:r>
+            <w:proofErr w:type="spellStart"/>
+            <w:r>
+              <w:rPr>
+                <w:rFonts w:ascii="Calibri" w:hAnsi="Calibri" w:cs="Arial"/>
+                <w:sz w:val="18"/>
+                <w:szCs w:val="18"/>
+              </w:rPr>
+              <w:t>Compose</w:t>
+            </w:r>
+            <w:proofErr w:type="spellEnd"/>
+            <w:r>
+              <w:rPr>
+                <w:rFonts w:ascii="Calibri" w:hAnsi="Calibri" w:cs="Arial"/>
+                <w:sz w:val="18"/>
+                <w:szCs w:val="18"/>
+              </w:rPr>
+              <w:t xml:space="preserve"> (PostgreSQL, </w:t>
+            </w:r>
+            <w:proofErr w:type="spellStart"/>
+            <w:r>
+              <w:rPr>
+                <w:rFonts w:ascii="Calibri" w:hAnsi="Calibri" w:cs="Arial"/>
+                <w:sz w:val="18"/>
+                <w:szCs w:val="18"/>
+              </w:rPr>
+              <w:t>MinIO</w:t>
+            </w:r>
+            <w:proofErr w:type="spellEnd"/>
+            <w:r>
+              <w:rPr>
+                <w:rFonts w:ascii="Calibri" w:hAnsi="Calibri" w:cs="Arial"/>
+                <w:sz w:val="18"/>
+                <w:szCs w:val="18"/>
+              </w:rPr>
+              <w:t xml:space="preserve"> que simula </w:t>
+            </w:r>
+            <w:proofErr w:type="spellStart"/>
+            <w:r>
+              <w:rPr>
+                <w:rFonts w:ascii="Calibri" w:hAnsi="Calibri" w:cs="Arial"/>
+                <w:sz w:val="18"/>
+                <w:szCs w:val="18"/>
+              </w:rPr>
+              <w:t>Cloudflare</w:t>
+            </w:r>
+            <w:proofErr w:type="spellEnd"/>
+            <w:r>
+              <w:rPr>
+                <w:rFonts w:ascii="Calibri" w:hAnsi="Calibri" w:cs="Arial"/>
+                <w:sz w:val="18"/>
+                <w:szCs w:val="18"/>
+              </w:rPr>
+              <w:t xml:space="preserve"> R2, Redis, Core y agente de Python) y creación de los repositorios </w:t>
+            </w:r>
+            <w:proofErr w:type="spellStart"/>
+            <w:r>
+              <w:rPr>
+                <w:rFonts w:ascii="Calibri" w:hAnsi="Calibri" w:cs="Arial"/>
+                <w:sz w:val="18"/>
+                <w:szCs w:val="18"/>
+              </w:rPr>
+              <w:t>PortIA_Web</w:t>
+            </w:r>
+            <w:proofErr w:type="spellEnd"/>
+            <w:r>
+              <w:rPr>
+                <w:rFonts w:ascii="Calibri" w:hAnsi="Calibri" w:cs="Arial"/>
+                <w:sz w:val="18"/>
+                <w:szCs w:val="18"/>
+              </w:rPr>
+              <w:t xml:space="preserve">, </w:t>
+            </w:r>
+            <w:proofErr w:type="spellStart"/>
+            <w:r>
+              <w:rPr>
+                <w:rFonts w:ascii="Calibri" w:hAnsi="Calibri" w:cs="Arial"/>
+                <w:sz w:val="18"/>
+                <w:szCs w:val="18"/>
+              </w:rPr>
+              <w:t>PortIA_Core</w:t>
+            </w:r>
+            <w:proofErr w:type="spellEnd"/>
+            <w:r>
+              <w:rPr>
+                <w:rFonts w:ascii="Calibri" w:hAnsi="Calibri" w:cs="Arial"/>
+                <w:sz w:val="18"/>
+                <w:szCs w:val="18"/>
+              </w:rPr>
+              <w:t xml:space="preserve"> y </w:t>
+            </w:r>
+            <w:proofErr w:type="spellStart"/>
+            <w:r>
+              <w:rPr>
+                <w:rFonts w:ascii="Calibri" w:hAnsi="Calibri" w:cs="Arial"/>
+                <w:sz w:val="18"/>
+                <w:szCs w:val="18"/>
+              </w:rPr>
+              <w:t>PortIA_Agentes</w:t>
+            </w:r>
+            <w:proofErr w:type="spellEnd"/>
+            <w:r>
+              <w:rPr>
+                <w:rFonts w:ascii="Calibri" w:hAnsi="Calibri" w:cs="Arial"/>
+                <w:sz w:val="18"/>
+                <w:szCs w:val="18"/>
+              </w:rPr>
+              <w:t xml:space="preserve"> en GitHub.</w:t>
+            </w:r>
+          </w:p>
+          <w:p>
+            <w:pPr>
+              <w:spacing w:after="60"/>
+              <w:ind w:left="220" w:hanging="200"/>
+            </w:pPr>
+            <w:r>
+              <w:rPr>
+                <w:rFonts w:ascii="Calibri" w:hAnsi="Calibri" w:cs="Arial"/>
+                <w:sz w:val="18"/>
+                <w:szCs w:val="18"/>
+              </w:rPr>
+              <w:t xml:space="preserve">• </w:t>
+            </w:r>
+            <w:r>
+              <w:rPr>
+                <w:rFonts w:ascii="Calibri" w:hAnsi="Calibri" w:cs="Arial"/>
+                <w:b/>
+                <w:sz w:val="18"/>
+                <w:szCs w:val="18"/>
+              </w:rPr>
+              <w:t xml:space="preserve">Semanas 3-4, contratos, modelo de datos y esqueleto: </w:t>
+            </w:r>
+            <w:r>
+              <w:rPr>
+                <w:rFonts w:ascii="Calibri" w:hAnsi="Calibri" w:cs="Arial"/>
+                <w:sz w:val="18"/>
+                <w:szCs w:val="18"/>
+              </w:rPr>
+              <w:t xml:space="preserve">contratos de entidades, repositorios, </w:t>
+            </w:r>
+            <w:proofErr w:type="spellStart"/>
+            <w:r>
+              <w:rPr>
+                <w:rFonts w:ascii="Calibri" w:hAnsi="Calibri" w:cs="Arial"/>
+                <w:sz w:val="18"/>
+                <w:szCs w:val="18"/>
+              </w:rPr>
+              <w:t>DTOs</w:t>
+            </w:r>
+            <w:proofErr w:type="spellEnd"/>
+            <w:r>
+              <w:rPr>
+                <w:rFonts w:ascii="Calibri" w:hAnsi="Calibri" w:cs="Arial"/>
+                <w:sz w:val="18"/>
+                <w:szCs w:val="18"/>
+              </w:rPr>
+              <w:t xml:space="preserve">, API y eventos; modelo relacional de 17 tablas con diccionario de datos; esqueleto N-Capas del Core con Swagger; proyecto base de Angular; y agente en </w:t>
+            </w:r>
+            <w:proofErr w:type="spellStart"/>
+            <w:r>
+              <w:rPr>
+                <w:rFonts w:ascii="Calibri" w:hAnsi="Calibri" w:cs="Arial"/>
+                <w:sz w:val="18"/>
+                <w:szCs w:val="18"/>
+              </w:rPr>
+              <w:t>FastAPI</w:t>
+            </w:r>
+            <w:proofErr w:type="spellEnd"/>
+            <w:r>
+              <w:rPr>
+                <w:rFonts w:ascii="Calibri" w:hAnsi="Calibri" w:cs="Arial"/>
+                <w:sz w:val="18"/>
+                <w:szCs w:val="18"/>
+              </w:rPr>
+              <w:t xml:space="preserve"> conectado a Redis, cada uno publicado mediante Pull </w:t>
+            </w:r>
+            <w:proofErr w:type="spellStart"/>
+            <w:r>
+              <w:rPr>
+                <w:rFonts w:ascii="Calibri" w:hAnsi="Calibri" w:cs="Arial"/>
+                <w:sz w:val="18"/>
+                <w:szCs w:val="18"/>
+              </w:rPr>
+              <w:t>Request</w:t>
+            </w:r>
+            <w:proofErr w:type="spellEnd"/>
+            <w:r>
+              <w:rPr>
+                <w:rFonts w:ascii="Calibri" w:hAnsi="Calibri" w:cs="Arial"/>
+                <w:sz w:val="18"/>
+                <w:szCs w:val="18"/>
+              </w:rPr>
+              <w:t>.</w:t>
+            </w:r>
+          </w:p>
+          <w:p>
+            <w:pPr>
+              <w:spacing w:after="60"/>
+              <w:ind w:left="220" w:hanging="200"/>
+            </w:pPr>
+            <w:r>
+              <w:rPr>
+                <w:rFonts w:ascii="Calibri" w:hAnsi="Calibri" w:cs="Arial"/>
+                <w:sz w:val="18"/>
+                <w:szCs w:val="18"/>
+              </w:rPr>
+              <w:t xml:space="preserve">• </w:t>
+            </w:r>
+            <w:r>
+              <w:rPr>
+                <w:rFonts w:ascii="Calibri" w:hAnsi="Calibri" w:cs="Arial"/>
+                <w:b/>
+                <w:sz w:val="18"/>
+                <w:szCs w:val="18"/>
+              </w:rPr>
+              <w:t xml:space="preserve">Gestión del backlog: </w:t>
+            </w:r>
+            <w:proofErr w:type="spellStart"/>
+            <w:r>
+              <w:rPr>
+                <w:rFonts w:ascii="Calibri" w:hAnsi="Calibri" w:cs="Arial"/>
+                <w:sz w:val="18"/>
+                <w:szCs w:val="18"/>
+              </w:rPr>
+              <w:t>Product</w:t>
+            </w:r>
+            <w:proofErr w:type="spellEnd"/>
+            <w:r>
+              <w:rPr>
+                <w:rFonts w:ascii="Calibri" w:hAnsi="Calibri" w:cs="Arial"/>
+                <w:sz w:val="18"/>
+                <w:szCs w:val="18"/>
+              </w:rPr>
+              <w:t xml:space="preserve"> Backlog de 16 historias, </w:t>
+            </w:r>
+            <w:proofErr w:type="spellStart"/>
+            <w:r>
+              <w:rPr>
+                <w:rFonts w:ascii="Calibri" w:hAnsi="Calibri" w:cs="Arial"/>
+                <w:sz w:val="18"/>
+                <w:szCs w:val="18"/>
+              </w:rPr>
+              <w:t>Definition</w:t>
+            </w:r>
+            <w:proofErr w:type="spellEnd"/>
+            <w:r>
+              <w:rPr>
+                <w:rFonts w:ascii="Calibri" w:hAnsi="Calibri" w:cs="Arial"/>
+                <w:sz w:val="18"/>
+                <w:szCs w:val="18"/>
+              </w:rPr>
+              <w:t xml:space="preserve"> </w:t>
+            </w:r>
+            <w:proofErr w:type="spellStart"/>
+            <w:r>
+              <w:rPr>
+                <w:rFonts w:ascii="Calibri" w:hAnsi="Calibri" w:cs="Arial"/>
+                <w:sz w:val="18"/>
+                <w:szCs w:val="18"/>
+              </w:rPr>
+              <w:t>of</w:t>
+            </w:r>
+            <w:proofErr w:type="spellEnd"/>
+            <w:r>
+              <w:rPr>
+                <w:rFonts w:ascii="Calibri" w:hAnsi="Calibri" w:cs="Arial"/>
+                <w:sz w:val="18"/>
+                <w:szCs w:val="18"/>
+              </w:rPr>
+              <w:t xml:space="preserve"> Done por historia y plan semanal por integrante.</w:t>
+            </w:r>
+          </w:p>
+          <w:p>
+            <w:pPr>
+              <w:spacing w:after="60"/>
+              <w:ind w:left="220" w:hanging="200"/>
+            </w:pPr>
+            <w:r>
+              <w:rPr>
+                <w:rFonts w:ascii="Calibri" w:hAnsi="Calibri" w:cs="Arial"/>
+                <w:sz w:val="18"/>
+                <w:szCs w:val="18"/>
+              </w:rPr>
+              <w:lastRenderedPageBreak/>
+              <w:t xml:space="preserve">• </w:t>
+            </w:r>
+            <w:r>
+              <w:rPr>
+                <w:rFonts w:ascii="Calibri" w:hAnsi="Calibri" w:cs="Arial"/>
+                <w:b/>
+                <w:sz w:val="18"/>
+                <w:szCs w:val="18"/>
+              </w:rPr>
+              <w:t xml:space="preserve">Documentación de diseño: </w:t>
+            </w:r>
+            <w:r>
+              <w:rPr>
+                <w:rFonts w:ascii="Calibri" w:hAnsi="Calibri" w:cs="Arial"/>
+                <w:sz w:val="18"/>
+                <w:szCs w:val="18"/>
+              </w:rPr>
+              <w:t>catálogo de casos de uso, storyboards, diagrama de arquitectura, diagrama de secuencia usuario-</w:t>
+            </w:r>
+            <w:r>
+              <w:rPr>
+                <w:rFonts w:ascii="Calibri" w:hAnsi="Calibri" w:cs="Arial"/>
+                <w:sz w:val="18"/>
+                <w:szCs w:val="18"/>
+              </w:rPr>
+              <w:t>sistema y</w:t>
+            </w:r>
+            <w:r>
+              <w:rPr>
+                <w:rFonts w:ascii="Calibri" w:hAnsi="Calibri" w:cs="Arial"/>
+                <w:sz w:val="18"/>
+                <w:szCs w:val="18"/>
+              </w:rPr>
+              <w:t xml:space="preserve"> análisis de almacenamiento y cumplimiento de la Ley 21.719.</w:t>
+            </w:r>
+          </w:p>
+          <w:p>
+            <w:pPr>
+              <w:spacing w:after="60"/>
+              <w:ind w:left="220" w:hanging="200"/>
+            </w:pPr>
+            <w:r>
+              <w:rPr>
+                <w:rFonts w:ascii="Calibri" w:hAnsi="Calibri" w:cs="Arial"/>
+                <w:sz w:val="18"/>
+                <w:szCs w:val="18"/>
+              </w:rPr>
+              <w:t xml:space="preserve">• </w:t>
+            </w:r>
+            <w:r>
+              <w:rPr>
+                <w:rFonts w:ascii="Calibri" w:hAnsi="Calibri" w:cs="Arial"/>
+                <w:b/>
+                <w:sz w:val="18"/>
+                <w:szCs w:val="18"/>
+              </w:rPr>
+              <w:t>Iteraciones</w:t>
+            </w:r>
+            <w:r>
+              <w:rPr>
+                <w:rFonts w:ascii="Calibri" w:hAnsi="Calibri" w:cs="Arial"/>
+                <w:b/>
+                <w:sz w:val="18"/>
+                <w:szCs w:val="18"/>
+              </w:rPr>
+              <w:t xml:space="preserve"> siguientes (en ejecución y planificados): </w:t>
+            </w:r>
+            <w:r>
+              <w:rPr>
+                <w:rFonts w:ascii="Calibri" w:hAnsi="Calibri" w:cs="Arial"/>
+                <w:sz w:val="18"/>
+                <w:szCs w:val="18"/>
+              </w:rPr>
+              <w:t xml:space="preserve">entidades y migración con EF Core, inicio de sesión con JWT, carga de documentos y extracción con IA, motor de riesgo y alertas en tiempo real, estrategia </w:t>
+            </w:r>
+            <w:proofErr w:type="spellStart"/>
+            <w:r>
+              <w:rPr>
+                <w:rFonts w:ascii="Calibri" w:hAnsi="Calibri" w:cs="Arial"/>
+                <w:sz w:val="18"/>
+                <w:szCs w:val="18"/>
+              </w:rPr>
+              <w:t>Scraping</w:t>
+            </w:r>
+            <w:proofErr w:type="spellEnd"/>
+            <w:r>
+              <w:rPr>
+                <w:rFonts w:ascii="Calibri" w:hAnsi="Calibri" w:cs="Arial"/>
+                <w:sz w:val="18"/>
+                <w:szCs w:val="18"/>
+              </w:rPr>
+              <w:t xml:space="preserve"> + Mock + </w:t>
+            </w:r>
+            <w:r>
+              <w:rPr>
+                <w:rFonts w:ascii="Calibri" w:hAnsi="Calibri" w:cs="Arial"/>
+                <w:sz w:val="18"/>
+                <w:szCs w:val="18"/>
+              </w:rPr>
+              <w:t>disyuntor</w:t>
+            </w:r>
+            <w:r>
+              <w:rPr>
+                <w:rFonts w:ascii="Calibri" w:hAnsi="Calibri" w:cs="Arial"/>
+                <w:sz w:val="18"/>
+                <w:szCs w:val="18"/>
+              </w:rPr>
+              <w:t>, aprobación humana de correos, rol de jefe de analistas, pruebas integrales y cierre.</w:t>
+            </w:r>
+          </w:p>
+          <w:p>
+            <w:pPr>
+              <w:spacing w:after="60"/>
+            </w:pPr>
+            <w:r>
+              <w:rPr>
+                <w:rFonts w:ascii="Calibri" w:hAnsi="Calibri" w:cs="Arial"/>
+                <w:b/>
+                <w:sz w:val="18"/>
+                <w:szCs w:val="18"/>
+              </w:rPr>
+              <w:t>Facilitadores:</w:t>
+            </w:r>
+          </w:p>
+          <w:p>
+            <w:pPr>
+              <w:spacing w:after="60"/>
+              <w:ind w:left="220" w:hanging="200"/>
+            </w:pPr>
+            <w:r>
+              <w:rPr>
+                <w:rFonts w:ascii="Calibri" w:hAnsi="Calibri" w:cs="Arial"/>
+                <w:sz w:val="18"/>
+                <w:szCs w:val="18"/>
+              </w:rPr>
+              <w:t xml:space="preserve">• Análisis, arquitectura y contratos definidos antes de programar; el profesor guía validó la estrategia </w:t>
+            </w:r>
+            <w:proofErr w:type="spellStart"/>
+            <w:r>
+              <w:rPr>
+                <w:rFonts w:ascii="Calibri" w:hAnsi="Calibri" w:cs="Arial"/>
+                <w:sz w:val="18"/>
+                <w:szCs w:val="18"/>
+              </w:rPr>
+              <w:t>Strategy</w:t>
+            </w:r>
+            <w:proofErr w:type="spellEnd"/>
+            <w:r>
+              <w:rPr>
+                <w:rFonts w:ascii="Calibri" w:hAnsi="Calibri" w:cs="Arial"/>
+                <w:sz w:val="18"/>
+                <w:szCs w:val="18"/>
+              </w:rPr>
+              <w:t xml:space="preserve"> + disyuntor.</w:t>
+            </w:r>
+          </w:p>
+          <w:p>
+            <w:pPr>
+              <w:spacing w:after="60"/>
+              <w:ind w:left="220" w:hanging="200"/>
+            </w:pPr>
+            <w:r>
+              <w:rPr>
+                <w:rFonts w:ascii="Calibri" w:hAnsi="Calibri" w:cs="Arial"/>
+                <w:sz w:val="18"/>
+                <w:szCs w:val="18"/>
+              </w:rPr>
+              <w:t xml:space="preserve">• Docker </w:t>
+            </w:r>
+            <w:proofErr w:type="spellStart"/>
+            <w:r>
+              <w:rPr>
+                <w:rFonts w:ascii="Calibri" w:hAnsi="Calibri" w:cs="Arial"/>
+                <w:sz w:val="18"/>
+                <w:szCs w:val="18"/>
+              </w:rPr>
+              <w:t>Compose</w:t>
+            </w:r>
+            <w:proofErr w:type="spellEnd"/>
+            <w:r>
+              <w:rPr>
+                <w:rFonts w:ascii="Calibri" w:hAnsi="Calibri" w:cs="Arial"/>
+                <w:sz w:val="18"/>
+                <w:szCs w:val="18"/>
+              </w:rPr>
+              <w:t xml:space="preserve"> permite levantar el mismo entorno en los equipos de los tres integrantes.</w:t>
+            </w:r>
+            <w:r>
+              <w:rPr>
+                <w:rFonts w:ascii="Calibri" w:hAnsi="Calibri" w:cs="Arial"/>
+                <w:sz w:val="18"/>
+                <w:szCs w:val="18"/>
+              </w:rPr>
+              <w:t xml:space="preserve"> </w:t>
+            </w:r>
+          </w:p>
+          <w:p>
+            <w:pPr>
+              <w:spacing w:after="60"/>
+              <w:ind w:left="220" w:hanging="200"/>
+            </w:pPr>
+            <w:r>
+              <w:rPr>
+                <w:rFonts w:ascii="Calibri" w:hAnsi="Calibri" w:cs="Arial"/>
+                <w:sz w:val="18"/>
+                <w:szCs w:val="18"/>
+              </w:rPr>
+              <w:t>• Tecnologías abiertas y bien documentadas (.NET, Angular, Python, PostgreSQL).</w:t>
+            </w:r>
+          </w:p>
+          <w:p>
+            <w:pPr>
+              <w:spacing w:after="60"/>
+              <w:ind w:left="220" w:hanging="200"/>
+            </w:pPr>
+            <w:r>
+              <w:rPr>
+                <w:rFonts w:ascii="Calibri" w:hAnsi="Calibri" w:cs="Arial"/>
+                <w:sz w:val="18"/>
+                <w:szCs w:val="18"/>
+              </w:rPr>
+              <w:t xml:space="preserve">• Backlog, </w:t>
+            </w:r>
+            <w:proofErr w:type="spellStart"/>
+            <w:r>
+              <w:rPr>
+                <w:rFonts w:ascii="Calibri" w:hAnsi="Calibri" w:cs="Arial"/>
+                <w:sz w:val="18"/>
+                <w:szCs w:val="18"/>
+              </w:rPr>
+              <w:t>Definition</w:t>
+            </w:r>
+            <w:proofErr w:type="spellEnd"/>
+            <w:r>
+              <w:rPr>
+                <w:rFonts w:ascii="Calibri" w:hAnsi="Calibri" w:cs="Arial"/>
+                <w:sz w:val="18"/>
+                <w:szCs w:val="18"/>
+              </w:rPr>
+              <w:t xml:space="preserve"> </w:t>
+            </w:r>
+            <w:proofErr w:type="spellStart"/>
+            <w:r>
+              <w:rPr>
+                <w:rFonts w:ascii="Calibri" w:hAnsi="Calibri" w:cs="Arial"/>
+                <w:sz w:val="18"/>
+                <w:szCs w:val="18"/>
+              </w:rPr>
+              <w:t>of</w:t>
+            </w:r>
+            <w:proofErr w:type="spellEnd"/>
+            <w:r>
+              <w:rPr>
+                <w:rFonts w:ascii="Calibri" w:hAnsi="Calibri" w:cs="Arial"/>
+                <w:sz w:val="18"/>
+                <w:szCs w:val="18"/>
+              </w:rPr>
+              <w:t xml:space="preserve"> Done y plan semanal que permiten trabajar en paralelo.</w:t>
+            </w:r>
+          </w:p>
+          <w:p>
+            <w:pPr>
+              <w:spacing w:after="60"/>
+            </w:pPr>
+            <w:r>
+              <w:rPr>
+                <w:rFonts w:ascii="Calibri" w:hAnsi="Calibri" w:cs="Arial"/>
+                <w:b/>
+                <w:sz w:val="18"/>
+                <w:szCs w:val="18"/>
+              </w:rPr>
+              <w:t>Dificultades:</w:t>
+            </w:r>
+          </w:p>
+          <w:p>
+            <w:pPr>
+              <w:spacing w:after="60"/>
+              <w:ind w:left="220" w:hanging="200"/>
+            </w:pPr>
+            <w:r>
+              <w:rPr>
+                <w:rFonts w:ascii="Calibri" w:hAnsi="Calibri" w:cs="Arial"/>
+                <w:sz w:val="18"/>
+                <w:szCs w:val="18"/>
+              </w:rPr>
+              <w:t xml:space="preserve">• El puerto 5432 estaba ocupado por un PostgreSQL local; la imagen de </w:t>
+            </w:r>
+            <w:proofErr w:type="spellStart"/>
+            <w:r>
+              <w:rPr>
+                <w:rFonts w:ascii="Calibri" w:hAnsi="Calibri" w:cs="Arial"/>
+                <w:sz w:val="18"/>
+                <w:szCs w:val="18"/>
+              </w:rPr>
+              <w:t>MinIO</w:t>
+            </w:r>
+            <w:proofErr w:type="spellEnd"/>
+            <w:r>
+              <w:rPr>
+                <w:rFonts w:ascii="Calibri" w:hAnsi="Calibri" w:cs="Arial"/>
+                <w:sz w:val="18"/>
+                <w:szCs w:val="18"/>
+              </w:rPr>
+              <w:t xml:space="preserve"> de Docker </w:t>
+            </w:r>
+            <w:proofErr w:type="gramStart"/>
+            <w:r>
+              <w:rPr>
+                <w:rFonts w:ascii="Calibri" w:hAnsi="Calibri" w:cs="Arial"/>
+                <w:sz w:val="18"/>
+                <w:szCs w:val="18"/>
+              </w:rPr>
+              <w:t>Hub</w:t>
+            </w:r>
+            <w:proofErr w:type="gramEnd"/>
+            <w:r>
+              <w:rPr>
+                <w:rFonts w:ascii="Calibri" w:hAnsi="Calibri" w:cs="Arial"/>
+                <w:sz w:val="18"/>
+                <w:szCs w:val="18"/>
+              </w:rPr>
+              <w:t xml:space="preserve"> no era accesible; Swagger no cargaba en el contenedor del Core por correr en modo </w:t>
+            </w:r>
+            <w:r>
+              <w:rPr>
+                <w:rFonts w:ascii="Calibri" w:hAnsi="Calibri" w:cs="Arial"/>
+                <w:sz w:val="18"/>
+                <w:szCs w:val="18"/>
+              </w:rPr>
+              <w:t>equivocado</w:t>
+            </w:r>
+            <w:r>
+              <w:rPr>
+                <w:rFonts w:ascii="Calibri" w:hAnsi="Calibri" w:cs="Arial"/>
+                <w:sz w:val="18"/>
+                <w:szCs w:val="18"/>
+              </w:rPr>
+              <w:t xml:space="preserve">; el CLI de Angular rechazó la creación del proyecto en una carpeta ya existente; y hubo conflictos de ramas y de Pull </w:t>
+            </w:r>
+            <w:proofErr w:type="spellStart"/>
+            <w:r>
+              <w:rPr>
+                <w:rFonts w:ascii="Calibri" w:hAnsi="Calibri" w:cs="Arial"/>
+                <w:sz w:val="18"/>
+                <w:szCs w:val="18"/>
+              </w:rPr>
+              <w:t>Request</w:t>
+            </w:r>
+            <w:proofErr w:type="spellEnd"/>
+            <w:r>
+              <w:rPr>
+                <w:rFonts w:ascii="Calibri" w:hAnsi="Calibri" w:cs="Arial"/>
+                <w:sz w:val="18"/>
+                <w:szCs w:val="18"/>
+              </w:rPr>
+              <w:t xml:space="preserve"> en Git.</w:t>
+            </w:r>
+          </w:p>
+          <w:p>
+            <w:pPr>
+              <w:spacing w:after="60"/>
+              <w:ind w:left="220" w:hanging="200"/>
+            </w:pPr>
+            <w:r>
+              <w:rPr>
+                <w:rFonts w:ascii="Calibri" w:hAnsi="Calibri" w:cs="Arial"/>
+                <w:sz w:val="18"/>
+                <w:szCs w:val="18"/>
+              </w:rPr>
+              <w:t>• Se decidió priorizar la planificación y la documentación antes de la implementación, lo que puede presionar el tiempo disponible para la implementación del modelo con EF Core y la carga de documentos.</w:t>
+            </w:r>
+          </w:p>
+          <w:p>
+            <w:pPr>
+              <w:spacing w:after="60"/>
+            </w:pPr>
+            <w:r>
+              <w:rPr>
+                <w:rFonts w:ascii="Calibri" w:hAnsi="Calibri" w:cs="Arial"/>
+                <w:b/>
+                <w:sz w:val="18"/>
+                <w:szCs w:val="18"/>
+              </w:rPr>
+              <w:t>Ajustes realizados y cómo se abordaron las dificultades:</w:t>
+            </w:r>
+          </w:p>
+          <w:p>
+            <w:pPr>
+              <w:spacing w:after="60"/>
+              <w:ind w:left="220" w:hanging="200"/>
+            </w:pPr>
+            <w:r>
+              <w:rPr>
+                <w:rFonts w:ascii="Calibri" w:hAnsi="Calibri" w:cs="Arial"/>
+                <w:sz w:val="18"/>
+                <w:szCs w:val="18"/>
+              </w:rPr>
+              <w:t xml:space="preserve">• </w:t>
+            </w:r>
+            <w:r>
+              <w:rPr>
+                <w:rFonts w:ascii="Calibri" w:hAnsi="Calibri" w:cs="Arial"/>
+                <w:b/>
+                <w:sz w:val="18"/>
+                <w:szCs w:val="18"/>
+              </w:rPr>
+              <w:t xml:space="preserve">Puerto: </w:t>
+            </w:r>
+            <w:r>
+              <w:rPr>
+                <w:rFonts w:ascii="Calibri" w:hAnsi="Calibri" w:cs="Arial"/>
+                <w:sz w:val="18"/>
+                <w:szCs w:val="18"/>
+              </w:rPr>
+              <w:t xml:space="preserve">el contenedor de PostgreSQL se publicó en el puerto 5433 y se documentó en el README; </w:t>
+            </w:r>
+            <w:proofErr w:type="spellStart"/>
+            <w:r>
+              <w:rPr>
+                <w:rFonts w:ascii="Calibri" w:hAnsi="Calibri" w:cs="Arial"/>
+                <w:sz w:val="18"/>
+                <w:szCs w:val="18"/>
+              </w:rPr>
+              <w:t>MinIO</w:t>
+            </w:r>
+            <w:proofErr w:type="spellEnd"/>
+            <w:r>
+              <w:rPr>
+                <w:rFonts w:ascii="Calibri" w:hAnsi="Calibri" w:cs="Arial"/>
+                <w:sz w:val="18"/>
+                <w:szCs w:val="18"/>
+              </w:rPr>
+              <w:t xml:space="preserve"> se descargó desde quay.io; Swagger se habilitó con ASPNETCORE_ENVIRONMENT=</w:t>
+            </w:r>
+            <w:proofErr w:type="spellStart"/>
+            <w:r>
+              <w:rPr>
+                <w:rFonts w:ascii="Calibri" w:hAnsi="Calibri" w:cs="Arial"/>
+                <w:sz w:val="18"/>
+                <w:szCs w:val="18"/>
+              </w:rPr>
+              <w:t>Development</w:t>
+            </w:r>
+            <w:proofErr w:type="spellEnd"/>
+            <w:r>
+              <w:rPr>
+                <w:rFonts w:ascii="Calibri" w:hAnsi="Calibri" w:cs="Arial"/>
+                <w:sz w:val="18"/>
+                <w:szCs w:val="18"/>
+              </w:rPr>
+              <w:t xml:space="preserve">; el proyecto Angular se creó con una carpeta de destino explícita; y los conflictos de Git se resolvieron con Pull </w:t>
+            </w:r>
+            <w:proofErr w:type="spellStart"/>
+            <w:r>
+              <w:rPr>
+                <w:rFonts w:ascii="Calibri" w:hAnsi="Calibri" w:cs="Arial"/>
+                <w:sz w:val="18"/>
+                <w:szCs w:val="18"/>
+              </w:rPr>
+              <w:t>Request</w:t>
+            </w:r>
+            <w:proofErr w:type="spellEnd"/>
+            <w:r>
+              <w:rPr>
+                <w:rFonts w:ascii="Calibri" w:hAnsi="Calibri" w:cs="Arial"/>
+                <w:sz w:val="18"/>
+                <w:szCs w:val="18"/>
+              </w:rPr>
+              <w:t xml:space="preserve"> revisados.</w:t>
+            </w:r>
+          </w:p>
+          <w:p>
+            <w:pPr>
+              <w:spacing w:after="60"/>
+              <w:ind w:left="220" w:hanging="200"/>
+            </w:pPr>
+            <w:r>
+              <w:rPr>
+                <w:rFonts w:ascii="Calibri" w:hAnsi="Calibri" w:cs="Arial"/>
+                <w:sz w:val="18"/>
+                <w:szCs w:val="18"/>
+              </w:rPr>
+              <w:t xml:space="preserve">• </w:t>
+            </w:r>
+            <w:r>
+              <w:rPr>
+                <w:rFonts w:ascii="Calibri" w:hAnsi="Calibri" w:cs="Arial"/>
+                <w:b/>
+                <w:sz w:val="18"/>
+                <w:szCs w:val="18"/>
+              </w:rPr>
+              <w:t xml:space="preserve">Arquitectura: </w:t>
+            </w:r>
+            <w:proofErr w:type="spellStart"/>
+            <w:r>
+              <w:rPr>
+                <w:rFonts w:ascii="Calibri" w:hAnsi="Calibri" w:cs="Arial"/>
+                <w:sz w:val="18"/>
+                <w:szCs w:val="18"/>
+              </w:rPr>
+              <w:t>Clean</w:t>
+            </w:r>
+            <w:proofErr w:type="spellEnd"/>
+            <w:r>
+              <w:rPr>
+                <w:rFonts w:ascii="Calibri" w:hAnsi="Calibri" w:cs="Arial"/>
+                <w:sz w:val="18"/>
+                <w:szCs w:val="18"/>
+              </w:rPr>
+              <w:t xml:space="preserve"> </w:t>
+            </w:r>
+            <w:proofErr w:type="spellStart"/>
+            <w:r>
+              <w:rPr>
+                <w:rFonts w:ascii="Calibri" w:hAnsi="Calibri" w:cs="Arial"/>
+                <w:sz w:val="18"/>
+                <w:szCs w:val="18"/>
+              </w:rPr>
+              <w:t>Architecture</w:t>
+            </w:r>
+            <w:proofErr w:type="spellEnd"/>
+            <w:r>
+              <w:rPr>
+                <w:rFonts w:ascii="Calibri" w:hAnsi="Calibri" w:cs="Arial"/>
+                <w:sz w:val="18"/>
+                <w:szCs w:val="18"/>
+              </w:rPr>
+              <w:t xml:space="preserve"> pasó a N-Capas por el dominio del equipo sobre ese patrón, conservando DIP y </w:t>
+            </w:r>
+            <w:proofErr w:type="spellStart"/>
+            <w:r>
+              <w:rPr>
+                <w:rFonts w:ascii="Calibri" w:hAnsi="Calibri" w:cs="Arial"/>
+                <w:sz w:val="18"/>
+                <w:szCs w:val="18"/>
+              </w:rPr>
+              <w:t>Strategy</w:t>
+            </w:r>
+            <w:proofErr w:type="spellEnd"/>
+            <w:r>
+              <w:rPr>
+                <w:rFonts w:ascii="Calibri" w:hAnsi="Calibri" w:cs="Arial"/>
+                <w:sz w:val="18"/>
+                <w:szCs w:val="18"/>
+              </w:rPr>
+              <w:t>.</w:t>
+            </w:r>
+          </w:p>
+          <w:p>
+            <w:pPr>
+              <w:spacing w:after="60"/>
+              <w:ind w:left="220" w:hanging="200"/>
+            </w:pPr>
+            <w:r>
+              <w:rPr>
+                <w:rFonts w:ascii="Calibri" w:hAnsi="Calibri" w:cs="Arial"/>
+                <w:sz w:val="18"/>
+                <w:szCs w:val="18"/>
+              </w:rPr>
+              <w:t xml:space="preserve">• </w:t>
+            </w:r>
+            <w:r>
+              <w:rPr>
+                <w:rFonts w:ascii="Calibri" w:hAnsi="Calibri" w:cs="Arial"/>
+                <w:b/>
+                <w:sz w:val="18"/>
+                <w:szCs w:val="18"/>
+              </w:rPr>
+              <w:t xml:space="preserve">IA: </w:t>
+            </w:r>
+            <w:r>
+              <w:rPr>
+                <w:rFonts w:ascii="Calibri" w:hAnsi="Calibri" w:cs="Arial"/>
+                <w:sz w:val="18"/>
+                <w:szCs w:val="18"/>
+              </w:rPr>
+              <w:t xml:space="preserve">GPT-4o pasó a </w:t>
+            </w:r>
+            <w:proofErr w:type="spellStart"/>
+            <w:r>
+              <w:rPr>
+                <w:rFonts w:ascii="Calibri" w:hAnsi="Calibri" w:cs="Arial"/>
+                <w:sz w:val="18"/>
+                <w:szCs w:val="18"/>
+              </w:rPr>
+              <w:t>DeepSeek</w:t>
+            </w:r>
+            <w:proofErr w:type="spellEnd"/>
+            <w:r>
+              <w:rPr>
+                <w:rFonts w:ascii="Calibri" w:hAnsi="Calibri" w:cs="Arial"/>
+                <w:sz w:val="18"/>
+                <w:szCs w:val="18"/>
+              </w:rPr>
+              <w:t xml:space="preserve"> por decisión del equipo; el agente usa una interfaz de proveedor, por lo que el Core no se ve afectado.</w:t>
+            </w:r>
+          </w:p>
+          <w:p>
+            <w:pPr>
+              <w:spacing w:after="60"/>
+              <w:ind w:left="220" w:hanging="200"/>
+            </w:pPr>
+            <w:r>
+              <w:rPr>
+                <w:rFonts w:ascii="Calibri" w:hAnsi="Calibri" w:cs="Arial"/>
+                <w:sz w:val="18"/>
+                <w:szCs w:val="18"/>
+              </w:rPr>
+              <w:t xml:space="preserve">• </w:t>
+            </w:r>
+            <w:r>
+              <w:rPr>
+                <w:rFonts w:ascii="Calibri" w:hAnsi="Calibri" w:cs="Arial"/>
+                <w:b/>
+                <w:sz w:val="18"/>
+                <w:szCs w:val="18"/>
+              </w:rPr>
+              <w:t xml:space="preserve">Cliente: </w:t>
+            </w:r>
+            <w:r>
+              <w:rPr>
+                <w:rFonts w:ascii="Calibri" w:hAnsi="Calibri" w:cs="Arial"/>
+                <w:sz w:val="18"/>
+                <w:szCs w:val="18"/>
+              </w:rPr>
+              <w:t xml:space="preserve">la aplicación de escritorio pasó a una aplicación web Angular con </w:t>
+            </w:r>
+            <w:proofErr w:type="spellStart"/>
+            <w:r>
+              <w:rPr>
+                <w:rFonts w:ascii="Calibri" w:hAnsi="Calibri" w:cs="Arial"/>
+                <w:sz w:val="18"/>
+                <w:szCs w:val="18"/>
+              </w:rPr>
+              <w:t>SignalR</w:t>
+            </w:r>
+            <w:proofErr w:type="spellEnd"/>
+            <w:r>
+              <w:rPr>
+                <w:rFonts w:ascii="Calibri" w:hAnsi="Calibri" w:cs="Arial"/>
+                <w:sz w:val="18"/>
+                <w:szCs w:val="18"/>
+              </w:rPr>
+              <w:t>.</w:t>
+            </w:r>
+          </w:p>
+          <w:p>
+            <w:pPr>
+              <w:spacing w:after="60"/>
+              <w:ind w:left="220" w:hanging="200"/>
+            </w:pPr>
+            <w:r>
+              <w:rPr>
+                <w:rFonts w:ascii="Calibri" w:hAnsi="Calibri" w:cs="Arial"/>
+                <w:sz w:val="18"/>
+                <w:szCs w:val="18"/>
+              </w:rPr>
+              <w:t xml:space="preserve">• </w:t>
+            </w:r>
+            <w:r>
+              <w:rPr>
+                <w:rFonts w:ascii="Calibri" w:hAnsi="Calibri" w:cs="Arial"/>
+                <w:b/>
+                <w:sz w:val="18"/>
+                <w:szCs w:val="18"/>
+              </w:rPr>
+              <w:t xml:space="preserve">Almacenamiento: </w:t>
+            </w:r>
+            <w:proofErr w:type="spellStart"/>
+            <w:r>
+              <w:rPr>
+                <w:rFonts w:ascii="Calibri" w:hAnsi="Calibri" w:cs="Arial"/>
+                <w:sz w:val="18"/>
+                <w:szCs w:val="18"/>
+              </w:rPr>
+              <w:t>MinIO</w:t>
+            </w:r>
+            <w:proofErr w:type="spellEnd"/>
+            <w:r>
+              <w:rPr>
+                <w:rFonts w:ascii="Calibri" w:hAnsi="Calibri" w:cs="Arial"/>
+                <w:sz w:val="18"/>
+                <w:szCs w:val="18"/>
+              </w:rPr>
+              <w:t xml:space="preserve"> en local (compatible con S3) y </w:t>
+            </w:r>
+            <w:proofErr w:type="spellStart"/>
+            <w:r>
+              <w:rPr>
+                <w:rFonts w:ascii="Calibri" w:hAnsi="Calibri" w:cs="Arial"/>
+                <w:sz w:val="18"/>
+                <w:szCs w:val="18"/>
+              </w:rPr>
+              <w:t>Cloudflare</w:t>
+            </w:r>
+            <w:proofErr w:type="spellEnd"/>
+            <w:r>
+              <w:rPr>
+                <w:rFonts w:ascii="Calibri" w:hAnsi="Calibri" w:cs="Arial"/>
+                <w:sz w:val="18"/>
+                <w:szCs w:val="18"/>
+              </w:rPr>
+              <w:t xml:space="preserve"> R2 en producción; el PDF nunca se almacena en la base de datos.</w:t>
+            </w:r>
+          </w:p>
+          <w:p>
+            <w:pPr>
+              <w:spacing w:after="60"/>
+              <w:ind w:left="220" w:hanging="200"/>
+            </w:pPr>
+            <w:r>
+              <w:rPr>
+                <w:rFonts w:ascii="Calibri" w:hAnsi="Calibri" w:cs="Arial"/>
+                <w:sz w:val="18"/>
+                <w:szCs w:val="18"/>
+              </w:rPr>
+              <w:t xml:space="preserve">• </w:t>
+            </w:r>
+            <w:r>
+              <w:rPr>
+                <w:rFonts w:ascii="Calibri" w:hAnsi="Calibri" w:cs="Arial"/>
+                <w:b/>
+                <w:sz w:val="18"/>
+                <w:szCs w:val="18"/>
+              </w:rPr>
+              <w:t xml:space="preserve">Alcance: </w:t>
+            </w:r>
+            <w:r>
+              <w:rPr>
+                <w:rFonts w:ascii="Calibri" w:hAnsi="Calibri" w:cs="Arial"/>
+                <w:sz w:val="18"/>
+                <w:szCs w:val="18"/>
+              </w:rPr>
+              <w:t xml:space="preserve">se agregó el rol de jefe de analistas (historias H012 a H014) y se aceptan imágenes (PNG y JPG) además de PDF; el inicio de sesión con JWT se adelantó al Sprint 2 y se definió ASP.NET Core </w:t>
+            </w:r>
+            <w:proofErr w:type="spellStart"/>
+            <w:r>
+              <w:rPr>
+                <w:rFonts w:ascii="Calibri" w:hAnsi="Calibri" w:cs="Arial"/>
+                <w:sz w:val="18"/>
+                <w:szCs w:val="18"/>
+              </w:rPr>
+              <w:t>Identity</w:t>
+            </w:r>
+            <w:proofErr w:type="spellEnd"/>
+            <w:r>
+              <w:rPr>
+                <w:rFonts w:ascii="Calibri" w:hAnsi="Calibri" w:cs="Arial"/>
+                <w:sz w:val="18"/>
+                <w:szCs w:val="18"/>
+              </w:rPr>
+              <w:t xml:space="preserve"> con </w:t>
+            </w:r>
+            <w:proofErr w:type="spellStart"/>
+            <w:r>
+              <w:rPr>
+                <w:rFonts w:ascii="Calibri" w:hAnsi="Calibri" w:cs="Arial"/>
+                <w:sz w:val="18"/>
+                <w:szCs w:val="18"/>
+              </w:rPr>
+              <w:t>BCrypt</w:t>
+            </w:r>
+            <w:proofErr w:type="spellEnd"/>
+            <w:r>
+              <w:rPr>
+                <w:rFonts w:ascii="Calibri" w:hAnsi="Calibri" w:cs="Arial"/>
+                <w:sz w:val="18"/>
+                <w:szCs w:val="18"/>
+              </w:rPr>
+              <w:t>.</w:t>
+            </w:r>
+          </w:p>
+          <w:p>
+            <w:pPr>
               <w:rPr>
                 <w:rFonts w:ascii="Calibri" w:hAnsi="Calibri" w:cs="Arial"/>
                 <w:i/>
@@ -1688,251 +3679,54 @@
             <w:r>
               <w:rPr>
                 <w:rFonts w:ascii="Calibri" w:hAnsi="Calibri" w:cs="Arial"/>
+                <w:sz w:val="18"/>
+                <w:szCs w:val="18"/>
+              </w:rPr>
+              <w:t xml:space="preserve">• </w:t>
+            </w:r>
+            <w:r>
+              <w:rPr>
+                <w:rFonts w:ascii="Calibri" w:hAnsi="Calibri" w:cs="Arial"/>
+                <w:b/>
+                <w:sz w:val="18"/>
+                <w:szCs w:val="18"/>
+              </w:rPr>
+              <w:t xml:space="preserve">Planificación: </w:t>
+            </w:r>
+            <w:r>
+              <w:rPr>
+                <w:rFonts w:ascii="Calibri" w:hAnsi="Calibri" w:cs="Arial"/>
+                <w:sz w:val="18"/>
+                <w:szCs w:val="18"/>
+              </w:rPr>
+              <w:t xml:space="preserve">se evaluaron </w:t>
+            </w:r>
+            <w:r>
+              <w:rPr>
+                <w:rFonts w:ascii="Calibri" w:hAnsi="Calibri" w:cs="Arial"/>
+                <w:sz w:val="18"/>
+                <w:szCs w:val="18"/>
+              </w:rPr>
+              <w:t>iteraciones</w:t>
+            </w:r>
+            <w:r>
+              <w:rPr>
+                <w:rFonts w:ascii="Calibri" w:hAnsi="Calibri" w:cs="Arial"/>
+                <w:sz w:val="18"/>
+                <w:szCs w:val="18"/>
+              </w:rPr>
+              <w:t xml:space="preserve"> de una semana y se descartaron por la carga horaria (10 a 15 horas semanales por integrante); se mantuvieron de dos semanas.</w:t>
+            </w:r>
+            <w:r>
+              <w:rPr>
+                <w:rFonts w:ascii="Calibri" w:hAnsi="Calibri" w:cs="Arial"/>
                 <w:i/>
                 <w:color w:val="0070C0"/>
                 <w:sz w:val="18"/>
                 <w:szCs w:val="20"/>
                 <w:lang w:eastAsia="es-CL"/>
               </w:rPr>
-              <w:t>Descripción de las etapas o actividades del Proyecto APT.</w:t>
-            </w:r>
-          </w:p>
-          <w:p>
-            <w:pPr>
-              <w:pStyle w:val="Prrafodelista"/>
-              <w:jc w:val="both"/>
-              <w:rPr>
-                <w:rFonts w:ascii="Calibri" w:hAnsi="Calibri" w:cs="Arial"/>
-                <w:i/>
-                <w:color w:val="0070C0"/>
-                <w:sz w:val="18"/>
-                <w:szCs w:val="20"/>
-                <w:lang w:eastAsia="es-CL"/>
-              </w:rPr>
-            </w:pPr>
-            <w:r>
-              <w:rPr>
-                <w:rFonts w:ascii="Calibri" w:hAnsi="Calibri" w:cs="Arial"/>
-                <w:i/>
-                <w:color w:val="0070C0"/>
-                <w:sz w:val="18"/>
-                <w:szCs w:val="20"/>
-                <w:lang w:eastAsia="es-CL"/>
-              </w:rPr>
-              <w:t xml:space="preserve">¿Cuáles fueron las etapas o actividades </w:t>
-            </w:r>
-            <w:r>
-              <w:rPr>
-                <w:rFonts w:ascii="Calibri" w:hAnsi="Calibri" w:cs="Arial"/>
-                <w:i/>
-                <w:color w:val="0070C0"/>
-                <w:sz w:val="18"/>
-                <w:szCs w:val="20"/>
-                <w:lang w:eastAsia="es-CL"/>
-              </w:rPr>
-              <w:t>que desarrollaste en</w:t>
-            </w:r>
-            <w:r>
-              <w:rPr>
-                <w:rFonts w:ascii="Calibri" w:hAnsi="Calibri" w:cs="Arial"/>
-                <w:i/>
-                <w:color w:val="0070C0"/>
-                <w:sz w:val="18"/>
-                <w:szCs w:val="20"/>
-                <w:lang w:eastAsia="es-CL"/>
-              </w:rPr>
-              <w:t xml:space="preserve"> tu Proyecto APT?</w:t>
-            </w:r>
-          </w:p>
-          <w:p>
-            <w:pPr>
-              <w:pStyle w:val="Prrafodelista"/>
-              <w:numPr>
-                <w:ilvl w:val="0"/>
-                <w:numId w:val="1"/>
-              </w:numPr>
-              <w:spacing w:after="0" w:line="240" w:lineRule="auto"/>
-              <w:ind w:left="318" w:hanging="284"/>
-              <w:jc w:val="both"/>
-              <w:rPr>
-                <w:rFonts w:ascii="Calibri" w:hAnsi="Calibri" w:cs="Arial"/>
-                <w:i/>
-                <w:color w:val="0070C0"/>
-                <w:sz w:val="18"/>
-                <w:szCs w:val="20"/>
-                <w:lang w:eastAsia="es-CL"/>
-              </w:rPr>
-            </w:pPr>
-            <w:r>
-              <w:rPr>
-                <w:rFonts w:ascii="Calibri" w:hAnsi="Calibri" w:cs="Arial"/>
-                <w:i/>
-                <w:color w:val="0070C0"/>
-                <w:sz w:val="18"/>
-                <w:szCs w:val="20"/>
-                <w:lang w:eastAsia="es-CL"/>
-              </w:rPr>
-              <w:t>Dificultades y facilitadores en el desarrollo del Proyecto APT</w:t>
-            </w:r>
-            <w:r>
-              <w:rPr>
-                <w:rFonts w:ascii="Calibri" w:hAnsi="Calibri" w:cs="Arial"/>
-                <w:i/>
-                <w:color w:val="0070C0"/>
-                <w:sz w:val="18"/>
-                <w:szCs w:val="20"/>
-                <w:lang w:eastAsia="es-CL"/>
-              </w:rPr>
-              <w:t>.</w:t>
-            </w:r>
-          </w:p>
-          <w:p>
-            <w:pPr>
-              <w:pStyle w:val="Prrafodelista"/>
-              <w:jc w:val="both"/>
-              <w:rPr>
-                <w:rFonts w:ascii="Calibri" w:hAnsi="Calibri" w:cs="Arial"/>
-                <w:i/>
-                <w:color w:val="0070C0"/>
-                <w:sz w:val="18"/>
-                <w:szCs w:val="20"/>
-                <w:lang w:eastAsia="es-CL"/>
-              </w:rPr>
-            </w:pPr>
-            <w:r>
-              <w:rPr>
-                <w:rFonts w:ascii="Calibri" w:hAnsi="Calibri" w:cs="Arial"/>
-                <w:i/>
-                <w:color w:val="0070C0"/>
-                <w:sz w:val="18"/>
-                <w:szCs w:val="20"/>
-                <w:lang w:eastAsia="es-CL"/>
-              </w:rPr>
-              <w:t>¿Qué elementos/aspectos te facilitaron o ayudaron en el desarrollo de tu proyecto APT?</w:t>
-            </w:r>
-          </w:p>
-          <w:p>
-            <w:pPr>
-              <w:pStyle w:val="Prrafodelista"/>
-              <w:jc w:val="both"/>
-              <w:rPr>
-                <w:rFonts w:ascii="Calibri" w:hAnsi="Calibri" w:cs="Arial"/>
-                <w:i/>
-                <w:color w:val="0070C0"/>
-                <w:sz w:val="18"/>
-                <w:szCs w:val="20"/>
-                <w:lang w:eastAsia="es-CL"/>
-              </w:rPr>
-            </w:pPr>
-            <w:r>
-              <w:rPr>
-                <w:rFonts w:ascii="Calibri" w:hAnsi="Calibri" w:cs="Arial"/>
-                <w:i/>
-                <w:color w:val="0070C0"/>
-                <w:sz w:val="18"/>
-                <w:szCs w:val="20"/>
-                <w:lang w:eastAsia="es-CL"/>
-              </w:rPr>
-              <w:t>¿A qué dificultades</w:t>
-            </w:r>
-            <w:r>
-              <w:rPr>
-                <w:rFonts w:ascii="Calibri" w:hAnsi="Calibri" w:cs="Arial"/>
-                <w:i/>
-                <w:color w:val="0070C0"/>
-                <w:sz w:val="18"/>
-                <w:szCs w:val="20"/>
-                <w:lang w:eastAsia="es-CL"/>
-              </w:rPr>
-              <w:t xml:space="preserve"> enfrentaste en el desarrollo de tu Proyecto APT?</w:t>
-            </w:r>
-          </w:p>
-          <w:p>
-            <w:pPr>
-              <w:pStyle w:val="Prrafodelista"/>
-              <w:numPr>
-                <w:ilvl w:val="0"/>
-                <w:numId w:val="1"/>
-              </w:numPr>
-              <w:spacing w:after="0" w:line="240" w:lineRule="auto"/>
-              <w:ind w:left="318" w:hanging="284"/>
-              <w:jc w:val="both"/>
-              <w:rPr>
-                <w:rFonts w:ascii="Calibri" w:hAnsi="Calibri" w:cs="Arial"/>
-                <w:i/>
-                <w:color w:val="0070C0"/>
-                <w:sz w:val="18"/>
-                <w:szCs w:val="20"/>
-                <w:lang w:eastAsia="es-CL"/>
-              </w:rPr>
-            </w:pPr>
-            <w:r>
-              <w:rPr>
-                <w:rFonts w:ascii="Calibri" w:hAnsi="Calibri" w:cs="Arial"/>
-                <w:i/>
-                <w:color w:val="0070C0"/>
-                <w:sz w:val="18"/>
-                <w:szCs w:val="20"/>
-                <w:lang w:eastAsia="es-CL"/>
-              </w:rPr>
-              <w:t>A</w:t>
-            </w:r>
-            <w:r>
-              <w:rPr>
-                <w:rFonts w:ascii="Calibri" w:hAnsi="Calibri" w:cs="Arial"/>
-                <w:i/>
-                <w:color w:val="0070C0"/>
-                <w:sz w:val="18"/>
-                <w:szCs w:val="20"/>
-                <w:lang w:eastAsia="es-CL"/>
-              </w:rPr>
-              <w:t>justes</w:t>
-            </w:r>
-            <w:r>
-              <w:rPr>
-                <w:rFonts w:ascii="Calibri" w:hAnsi="Calibri" w:cs="Arial"/>
-                <w:i/>
-                <w:color w:val="0070C0"/>
-                <w:sz w:val="18"/>
-                <w:szCs w:val="20"/>
-                <w:lang w:eastAsia="es-CL"/>
-              </w:rPr>
-              <w:t xml:space="preserve"> realizados</w:t>
-            </w:r>
-            <w:r>
-              <w:rPr>
-                <w:rFonts w:ascii="Calibri" w:hAnsi="Calibri" w:cs="Arial"/>
-                <w:i/>
-                <w:color w:val="0070C0"/>
-                <w:sz w:val="18"/>
-                <w:szCs w:val="20"/>
-                <w:lang w:eastAsia="es-CL"/>
-              </w:rPr>
-              <w:t>.</w:t>
-            </w:r>
-          </w:p>
-          <w:p>
-            <w:pPr>
-              <w:ind w:left="720"/>
-              <w:rPr>
-                <w:rFonts w:ascii="Calibri" w:hAnsi="Calibri" w:cs="Arial"/>
-                <w:i/>
-                <w:color w:val="0070C0"/>
-                <w:sz w:val="18"/>
-                <w:szCs w:val="20"/>
-                <w:lang w:eastAsia="es-CL"/>
-              </w:rPr>
-            </w:pPr>
-            <w:r>
-              <w:rPr>
-                <w:rFonts w:ascii="Calibri" w:hAnsi="Calibri" w:cs="Arial"/>
-                <w:i/>
-                <w:color w:val="0070C0"/>
-                <w:sz w:val="18"/>
-                <w:szCs w:val="20"/>
-                <w:lang w:eastAsia="es-CL"/>
-              </w:rPr>
-              <w:t xml:space="preserve">¿Cómo abordaste las dificultades para cumplir con los objetivos? ¿Tuviste que hacer algún ajuste? ¿Qué ajuste? </w:t>
+              <w:t xml:space="preserve"> </w:t>
             </w:r>
           </w:p>
         </w:tc>
@@ -1960,6 +3754,7 @@
                 <w:color w:val="1F3864" w:themeColor="accent1" w:themeShade="80"/>
                 <w:sz w:val="18"/>
               </w:rPr>
+              <w:lastRenderedPageBreak/>
               <w:t>5. Evidencias</w:t>
             </w:r>
           </w:p>
@@ -1971,93 +3766,626 @@
           </w:tcPr>
           <w:p>
             <w:pPr>
-              <w:pStyle w:val="Prrafodelista"/>
-              <w:numPr>
-                <w:ilvl w:val="0"/>
-                <w:numId w:val="1"/>
-              </w:numPr>
-              <w:spacing w:after="0" w:line="240" w:lineRule="auto"/>
-              <w:ind w:left="314" w:hanging="284"/>
-              <w:jc w:val="both"/>
+              <w:rPr>
+                <w:rFonts w:ascii="Calibri" w:hAnsi="Calibri" w:cs="Arial"/>
+                <w:sz w:val="18"/>
+                <w:szCs w:val="18"/>
+              </w:rPr>
+            </w:pPr>
+            <w:r>
               <w:rPr>
                 <w:rFonts w:ascii="Calibri" w:hAnsi="Calibri" w:cs="Arial"/>
                 <w:i/>
+                <w:color w:val="0070C0"/>
+                <w:sz w:val="18"/>
+                <w:szCs w:val="20"/>
+                <w:lang w:eastAsia="es-CL"/>
+              </w:rPr>
+              <w:t xml:space="preserve"> </w:t>
+            </w:r>
+            <w:r>
+              <w:rPr>
+                <w:rFonts w:ascii="Calibri" w:hAnsi="Calibri" w:cs="Arial"/>
+                <w:sz w:val="18"/>
+                <w:szCs w:val="18"/>
+              </w:rPr>
+              <w:t>Las evidencias permiten ver las etapas del proyecto y su resultado a la fecha: los repositorios de GitHub (</w:t>
+            </w:r>
+            <w:proofErr w:type="spellStart"/>
+            <w:r>
+              <w:rPr>
+                <w:rFonts w:ascii="Calibri" w:hAnsi="Calibri" w:cs="Arial"/>
+                <w:sz w:val="18"/>
+                <w:szCs w:val="18"/>
+              </w:rPr>
+              <w:t>commits</w:t>
+            </w:r>
+            <w:proofErr w:type="spellEnd"/>
+            <w:r>
+              <w:rPr>
+                <w:rFonts w:ascii="Calibri" w:hAnsi="Calibri" w:cs="Arial"/>
+                <w:sz w:val="18"/>
+                <w:szCs w:val="18"/>
+              </w:rPr>
+              <w:t xml:space="preserve"> y Pull </w:t>
+            </w:r>
+            <w:proofErr w:type="spellStart"/>
+            <w:r>
+              <w:rPr>
+                <w:rFonts w:ascii="Calibri" w:hAnsi="Calibri" w:cs="Arial"/>
+                <w:sz w:val="18"/>
+                <w:szCs w:val="18"/>
+              </w:rPr>
+              <w:t>Request</w:t>
+            </w:r>
+            <w:proofErr w:type="spellEnd"/>
+            <w:r>
+              <w:rPr>
+                <w:rFonts w:ascii="Calibri" w:hAnsi="Calibri" w:cs="Arial"/>
+                <w:sz w:val="18"/>
+                <w:szCs w:val="18"/>
+              </w:rPr>
+              <w:t xml:space="preserve"> de cada integrante), el entorno completo en Docker, la API del Core en Swagger, el agente de IA en </w:t>
+            </w:r>
+            <w:proofErr w:type="spellStart"/>
+            <w:r>
+              <w:rPr>
+                <w:rFonts w:ascii="Calibri" w:hAnsi="Calibri" w:cs="Arial"/>
+                <w:sz w:val="18"/>
+                <w:szCs w:val="18"/>
+              </w:rPr>
+              <w:t>FastAPI</w:t>
+            </w:r>
+            <w:proofErr w:type="spellEnd"/>
+            <w:r>
+              <w:rPr>
+                <w:rFonts w:ascii="Calibri" w:hAnsi="Calibri" w:cs="Arial"/>
+                <w:sz w:val="18"/>
+                <w:szCs w:val="18"/>
+              </w:rPr>
+              <w:t xml:space="preserve"> y los documentos de diseño y planificación (arquitectura, diagrama de secuencia, modelo relacional con script SQL y diccionario de datos, contratos, </w:t>
+            </w:r>
+            <w:proofErr w:type="spellStart"/>
+            <w:r>
+              <w:rPr>
+                <w:rFonts w:ascii="Calibri" w:hAnsi="Calibri" w:cs="Arial"/>
+                <w:sz w:val="18"/>
+                <w:szCs w:val="18"/>
+              </w:rPr>
+              <w:t>Product</w:t>
+            </w:r>
+            <w:proofErr w:type="spellEnd"/>
+            <w:r>
+              <w:rPr>
+                <w:rFonts w:ascii="Calibri" w:hAnsi="Calibri" w:cs="Arial"/>
+                <w:sz w:val="18"/>
+                <w:szCs w:val="18"/>
+              </w:rPr>
+              <w:t xml:space="preserve"> Backlog y </w:t>
+            </w:r>
+            <w:proofErr w:type="spellStart"/>
+            <w:r>
+              <w:rPr>
+                <w:rFonts w:ascii="Calibri" w:hAnsi="Calibri" w:cs="Arial"/>
+                <w:sz w:val="18"/>
+                <w:szCs w:val="18"/>
+              </w:rPr>
+              <w:t>Definition</w:t>
+            </w:r>
+            <w:proofErr w:type="spellEnd"/>
+            <w:r>
+              <w:rPr>
+                <w:rFonts w:ascii="Calibri" w:hAnsi="Calibri" w:cs="Arial"/>
+                <w:sz w:val="18"/>
+                <w:szCs w:val="18"/>
+              </w:rPr>
+              <w:t xml:space="preserve"> </w:t>
+            </w:r>
+            <w:proofErr w:type="spellStart"/>
+            <w:r>
+              <w:rPr>
+                <w:rFonts w:ascii="Calibri" w:hAnsi="Calibri" w:cs="Arial"/>
+                <w:sz w:val="18"/>
+                <w:szCs w:val="18"/>
+              </w:rPr>
+              <w:t>of</w:t>
+            </w:r>
+            <w:proofErr w:type="spellEnd"/>
+            <w:r>
+              <w:rPr>
+                <w:rFonts w:ascii="Calibri" w:hAnsi="Calibri" w:cs="Arial"/>
+                <w:sz w:val="18"/>
+                <w:szCs w:val="18"/>
+              </w:rPr>
+              <w:t xml:space="preserve"> Done). La calidad se resguardó con flujo de ramas con Pull </w:t>
+            </w:r>
+            <w:proofErr w:type="spellStart"/>
+            <w:r>
+              <w:rPr>
+                <w:rFonts w:ascii="Calibri" w:hAnsi="Calibri" w:cs="Arial"/>
+                <w:sz w:val="18"/>
+                <w:szCs w:val="18"/>
+              </w:rPr>
+              <w:t>Request</w:t>
+            </w:r>
+            <w:proofErr w:type="spellEnd"/>
+            <w:r>
+              <w:rPr>
+                <w:rFonts w:ascii="Calibri" w:hAnsi="Calibri" w:cs="Arial"/>
+                <w:sz w:val="18"/>
+                <w:szCs w:val="18"/>
+              </w:rPr>
+              <w:t xml:space="preserve"> y revisión de pares, entorno reproducible con Docker </w:t>
+            </w:r>
+            <w:proofErr w:type="spellStart"/>
+            <w:r>
+              <w:rPr>
+                <w:rFonts w:ascii="Calibri" w:hAnsi="Calibri" w:cs="Arial"/>
+                <w:sz w:val="18"/>
+                <w:szCs w:val="18"/>
+              </w:rPr>
+              <w:t>Compose</w:t>
+            </w:r>
+            <w:proofErr w:type="spellEnd"/>
+            <w:r>
+              <w:rPr>
+                <w:rFonts w:ascii="Calibri" w:hAnsi="Calibri" w:cs="Arial"/>
+                <w:sz w:val="18"/>
+                <w:szCs w:val="18"/>
+              </w:rPr>
+              <w:t>, contratos acordados antes de programar y separación por capas.</w:t>
+            </w:r>
+          </w:p>
+          <w:p>
+            <w:pPr>
+              <w:rPr>
+                <w:b/>
                 <w:iCs/>
                 <w:color w:val="0070C0"/>
                 <w:sz w:val="18"/>
-                <w:szCs w:val="20"/>
-                <w:lang w:eastAsia="es-CL"/>
-              </w:rPr>
-            </w:pPr>
-            <w:r>
-              <w:rPr>
-                <w:rFonts w:ascii="Calibri" w:hAnsi="Calibri" w:cs="Arial"/>
-                <w:i/>
+              </w:rPr>
+            </w:pPr>
+            <w:r>
+              <w:rPr>
+                <w:noProof/>
+              </w:rPr>
+              <w:lastRenderedPageBreak/>
+              <w:drawing>
+                <wp:inline distT="0" distB="0" distL="0" distR="0" wp14:anchorId="769407F2" wp14:editId="2801D2B7">
+                  <wp:extent cx="3959860" cy="2314575"/>
+                  <wp:effectExtent l="0" t="0" r="2540" b="9525"/>
+                  <wp:docPr id="57" name="Picture 57"/>
+                  <wp:cNvGraphicFramePr>
+                    <a:graphicFrameLocks xmlns:a="http://schemas.openxmlformats.org/drawingml/2006/main" noChangeAspect="1"/>
+                  </wp:cNvGraphicFramePr>
+                  <a:graphic xmlns:a="http://schemas.openxmlformats.org/drawingml/2006/main">
+                    <a:graphicData uri="http://schemas.openxmlformats.org/drawingml/2006/picture">
+                      <pic:pic xmlns:pic="http://schemas.openxmlformats.org/drawingml/2006/picture">
+                        <pic:nvPicPr>
+                          <pic:cNvPr id="57" name="Picture 57"/>
+                          <pic:cNvPicPr>
+                            <a:picLocks noChangeAspect="1"/>
+                          </pic:cNvPicPr>
+                        </pic:nvPicPr>
+                        <pic:blipFill>
+                          <a:blip r:embed="rId11"/>
+                          <a:stretch>
+                            <a:fillRect/>
+                          </a:stretch>
+                        </pic:blipFill>
+                        <pic:spPr>
+                          <a:xfrm>
+                            <a:off x="0" y="0"/>
+                            <a:ext cx="3959860" cy="2314575"/>
+                          </a:xfrm>
+                          <a:prstGeom prst="rect">
+                            <a:avLst/>
+                          </a:prstGeom>
+                        </pic:spPr>
+                      </pic:pic>
+                    </a:graphicData>
+                  </a:graphic>
+                </wp:inline>
+              </w:drawing>
+            </w:r>
+          </w:p>
+          <w:p>
+            <w:pPr>
+              <w:rPr>
+                <w:rFonts w:ascii="Calibri" w:hAnsi="Calibri" w:cs="Arial"/>
+                <w:sz w:val="18"/>
+                <w:szCs w:val="18"/>
+              </w:rPr>
+            </w:pPr>
+            <w:r>
+              <w:rPr>
+                <w:rFonts w:ascii="Calibri" w:hAnsi="Calibri" w:cs="Arial"/>
+                <w:sz w:val="18"/>
+                <w:szCs w:val="18"/>
+              </w:rPr>
+              <w:t xml:space="preserve">Figura 1. Entorno local en Docker Desktop: PostgreSQL, </w:t>
+            </w:r>
+            <w:proofErr w:type="spellStart"/>
+            <w:r>
+              <w:rPr>
+                <w:rFonts w:ascii="Calibri" w:hAnsi="Calibri" w:cs="Arial"/>
+                <w:sz w:val="18"/>
+                <w:szCs w:val="18"/>
+              </w:rPr>
+              <w:t>MinIO</w:t>
+            </w:r>
+            <w:proofErr w:type="spellEnd"/>
+            <w:r>
+              <w:rPr>
+                <w:rFonts w:ascii="Calibri" w:hAnsi="Calibri" w:cs="Arial"/>
+                <w:sz w:val="18"/>
+                <w:szCs w:val="18"/>
+              </w:rPr>
+              <w:t>, Redis, Core (.NET 10) y Agentes (Python) en ejecución.</w:t>
+            </w:r>
+            <w:r>
+              <w:rPr>
+                <w:rFonts w:ascii="Calibri" w:hAnsi="Calibri" w:cs="Arial"/>
+                <w:sz w:val="18"/>
+                <w:szCs w:val="18"/>
+              </w:rPr>
+              <w:t xml:space="preserve"> </w:t>
+            </w:r>
+          </w:p>
+          <w:p>
+            <w:pPr>
+              <w:rPr>
+                <w:rFonts w:ascii="Calibri" w:hAnsi="Calibri" w:cs="Arial"/>
+                <w:sz w:val="18"/>
+                <w:szCs w:val="18"/>
+              </w:rPr>
+            </w:pPr>
+            <w:r>
+              <w:rPr>
+                <w:noProof/>
+              </w:rPr>
+              <w:drawing>
+                <wp:inline distT="0" distB="0" distL="0" distR="0" wp14:anchorId="471980DA" wp14:editId="38711179">
+                  <wp:extent cx="3959860" cy="1767205"/>
+                  <wp:effectExtent l="0" t="0" r="2540" b="4445"/>
+                  <wp:docPr id="58" name="Picture 58"/>
+                  <wp:cNvGraphicFramePr>
+                    <a:graphicFrameLocks xmlns:a="http://schemas.openxmlformats.org/drawingml/2006/main" noChangeAspect="1"/>
+                  </wp:cNvGraphicFramePr>
+                  <a:graphic xmlns:a="http://schemas.openxmlformats.org/drawingml/2006/main">
+                    <a:graphicData uri="http://schemas.openxmlformats.org/drawingml/2006/picture">
+                      <pic:pic xmlns:pic="http://schemas.openxmlformats.org/drawingml/2006/picture">
+                        <pic:nvPicPr>
+                          <pic:cNvPr id="58" name="Picture 58"/>
+                          <pic:cNvPicPr>
+                            <a:picLocks noChangeAspect="1"/>
+                          </pic:cNvPicPr>
+                        </pic:nvPicPr>
+                        <pic:blipFill>
+                          <a:blip r:embed="rId12"/>
+                          <a:stretch>
+                            <a:fillRect/>
+                          </a:stretch>
+                        </pic:blipFill>
+                        <pic:spPr>
+                          <a:xfrm>
+                            <a:off x="0" y="0"/>
+                            <a:ext cx="3959860" cy="1767205"/>
+                          </a:xfrm>
+                          <a:prstGeom prst="rect">
+                            <a:avLst/>
+                          </a:prstGeom>
+                        </pic:spPr>
+                      </pic:pic>
+                    </a:graphicData>
+                  </a:graphic>
+                </wp:inline>
+              </w:drawing>
+            </w:r>
+          </w:p>
+          <w:p>
+            <w:pPr>
+              <w:rPr>
+                <w:rFonts w:ascii="Calibri" w:hAnsi="Calibri" w:cs="Arial"/>
+                <w:sz w:val="18"/>
+                <w:szCs w:val="18"/>
+              </w:rPr>
+            </w:pPr>
+            <w:r>
+              <w:rPr>
+                <w:rFonts w:ascii="Calibri" w:hAnsi="Calibri" w:cs="Arial"/>
+                <w:sz w:val="18"/>
+                <w:szCs w:val="18"/>
+              </w:rPr>
+              <w:t>Figura 2. API del Core (</w:t>
+            </w:r>
+            <w:proofErr w:type="spellStart"/>
+            <w:proofErr w:type="gramStart"/>
+            <w:r>
+              <w:rPr>
+                <w:rFonts w:ascii="Calibri" w:hAnsi="Calibri" w:cs="Arial"/>
+                <w:sz w:val="18"/>
+                <w:szCs w:val="18"/>
+              </w:rPr>
+              <w:t>PortIA.Core.WebApi</w:t>
+            </w:r>
+            <w:proofErr w:type="spellEnd"/>
+            <w:proofErr w:type="gramEnd"/>
+            <w:r>
+              <w:rPr>
+                <w:rFonts w:ascii="Calibri" w:hAnsi="Calibri" w:cs="Arial"/>
+                <w:sz w:val="18"/>
+                <w:szCs w:val="18"/>
+              </w:rPr>
+              <w:t>) documentada con Swagger.</w:t>
+            </w:r>
+            <w:r>
+              <w:rPr>
+                <w:rFonts w:ascii="Calibri" w:hAnsi="Calibri" w:cs="Arial"/>
+                <w:sz w:val="18"/>
+                <w:szCs w:val="18"/>
+              </w:rPr>
+              <w:t xml:space="preserve"> </w:t>
+            </w:r>
+          </w:p>
+          <w:p>
+            <w:pPr>
+              <w:rPr>
+                <w:rFonts w:ascii="Calibri" w:hAnsi="Calibri" w:cs="Arial"/>
+                <w:sz w:val="18"/>
+                <w:szCs w:val="18"/>
+              </w:rPr>
+            </w:pPr>
+            <w:r>
+              <w:rPr>
+                <w:noProof/>
+              </w:rPr>
+              <w:drawing>
+                <wp:inline distT="0" distB="0" distL="0" distR="0" wp14:anchorId="47EC0D42" wp14:editId="45C56FD9">
+                  <wp:extent cx="3959860" cy="1958340"/>
+                  <wp:effectExtent l="0" t="0" r="2540" b="3810"/>
+                  <wp:docPr id="59" name="Picture 59"/>
+                  <wp:cNvGraphicFramePr>
+                    <a:graphicFrameLocks xmlns:a="http://schemas.openxmlformats.org/drawingml/2006/main" noChangeAspect="1"/>
+                  </wp:cNvGraphicFramePr>
+                  <a:graphic xmlns:a="http://schemas.openxmlformats.org/drawingml/2006/main">
+                    <a:graphicData uri="http://schemas.openxmlformats.org/drawingml/2006/picture">
+                      <pic:pic xmlns:pic="http://schemas.openxmlformats.org/drawingml/2006/picture">
+                        <pic:nvPicPr>
+                          <pic:cNvPr id="59" name="Picture 59"/>
+                          <pic:cNvPicPr>
+                            <a:picLocks noChangeAspect="1"/>
+                          </pic:cNvPicPr>
+                        </pic:nvPicPr>
+                        <pic:blipFill>
+                          <a:blip r:embed="rId13"/>
+                          <a:stretch>
+                            <a:fillRect/>
+                          </a:stretch>
+                        </pic:blipFill>
+                        <pic:spPr>
+                          <a:xfrm>
+                            <a:off x="0" y="0"/>
+                            <a:ext cx="3959860" cy="1958340"/>
+                          </a:xfrm>
+                          <a:prstGeom prst="rect">
+                            <a:avLst/>
+                          </a:prstGeom>
+                        </pic:spPr>
+                      </pic:pic>
+                    </a:graphicData>
+                  </a:graphic>
+                </wp:inline>
+              </w:drawing>
+            </w:r>
+          </w:p>
+          <w:p>
+            <w:pPr>
+              <w:rPr>
+                <w:rFonts w:ascii="Calibri" w:hAnsi="Calibri" w:cs="Arial"/>
+                <w:sz w:val="18"/>
+                <w:szCs w:val="18"/>
+              </w:rPr>
+            </w:pPr>
+            <w:r>
+              <w:rPr>
+                <w:rFonts w:ascii="Calibri" w:hAnsi="Calibri" w:cs="Arial"/>
+                <w:sz w:val="18"/>
+                <w:szCs w:val="18"/>
+              </w:rPr>
+              <w:t>Figura 3. Agente de Python (</w:t>
+            </w:r>
+            <w:proofErr w:type="spellStart"/>
+            <w:r>
+              <w:rPr>
+                <w:rFonts w:ascii="Calibri" w:hAnsi="Calibri" w:cs="Arial"/>
+                <w:sz w:val="18"/>
+                <w:szCs w:val="18"/>
+              </w:rPr>
+              <w:t>FastAPI</w:t>
+            </w:r>
+            <w:proofErr w:type="spellEnd"/>
+            <w:r>
+              <w:rPr>
+                <w:rFonts w:ascii="Calibri" w:hAnsi="Calibri" w:cs="Arial"/>
+                <w:sz w:val="18"/>
+                <w:szCs w:val="18"/>
+              </w:rPr>
+              <w:t>) con su documentación interactiva.</w:t>
+            </w:r>
+            <w:r>
+              <w:rPr>
+                <w:rFonts w:ascii="Calibri" w:hAnsi="Calibri" w:cs="Arial"/>
+                <w:sz w:val="18"/>
+                <w:szCs w:val="18"/>
+              </w:rPr>
+              <w:t xml:space="preserve"> </w:t>
+            </w:r>
+          </w:p>
+          <w:p>
+            <w:pPr>
+              <w:rPr>
+                <w:rFonts w:ascii="Calibri" w:hAnsi="Calibri" w:cs="Arial"/>
+                <w:sz w:val="18"/>
+                <w:szCs w:val="18"/>
+              </w:rPr>
+            </w:pPr>
+            <w:r>
+              <w:rPr>
+                <w:noProof/>
+              </w:rPr>
+              <w:lastRenderedPageBreak/>
+              <w:drawing>
+                <wp:inline distT="0" distB="0" distL="0" distR="0" wp14:anchorId="57F0B04B" wp14:editId="47A7FEFE">
+                  <wp:extent cx="3959860" cy="2827655"/>
+                  <wp:effectExtent l="0" t="0" r="0" b="0"/>
+                  <wp:docPr id="60" name="Picture 60"/>
+                  <wp:cNvGraphicFramePr>
+                    <a:graphicFrameLocks xmlns:a="http://schemas.openxmlformats.org/drawingml/2006/main" noChangeAspect="1"/>
+                  </wp:cNvGraphicFramePr>
+                  <a:graphic xmlns:a="http://schemas.openxmlformats.org/drawingml/2006/main">
+                    <a:graphicData uri="http://schemas.openxmlformats.org/drawingml/2006/picture">
+                      <pic:pic xmlns:pic="http://schemas.openxmlformats.org/drawingml/2006/picture">
+                        <pic:nvPicPr>
+                          <pic:cNvPr id="60" name="Picture 60"/>
+                          <pic:cNvPicPr>
+                            <a:picLocks noChangeAspect="1"/>
+                          </pic:cNvPicPr>
+                        </pic:nvPicPr>
+                        <pic:blipFill>
+                          <a:blip r:embed="rId14"/>
+                          <a:stretch>
+                            <a:fillRect/>
+                          </a:stretch>
+                        </pic:blipFill>
+                        <pic:spPr>
+                          <a:xfrm>
+                            <a:off x="0" y="0"/>
+                            <a:ext cx="3959860" cy="2827655"/>
+                          </a:xfrm>
+                          <a:prstGeom prst="rect">
+                            <a:avLst/>
+                          </a:prstGeom>
+                        </pic:spPr>
+                      </pic:pic>
+                    </a:graphicData>
+                  </a:graphic>
+                </wp:inline>
+              </w:drawing>
+            </w:r>
+          </w:p>
+          <w:p>
+            <w:pPr>
+              <w:rPr>
+                <w:rFonts w:ascii="Calibri" w:hAnsi="Calibri" w:cs="Arial"/>
+                <w:sz w:val="18"/>
+                <w:szCs w:val="18"/>
+              </w:rPr>
+            </w:pPr>
+            <w:r>
+              <w:rPr>
+                <w:rFonts w:ascii="Calibri" w:hAnsi="Calibri" w:cs="Arial"/>
+                <w:sz w:val="18"/>
+                <w:szCs w:val="18"/>
+              </w:rPr>
+              <w:t>Figura 4. Arquitectura de la solución.</w:t>
+            </w:r>
+          </w:p>
+          <w:p>
+            <w:pPr>
+              <w:rPr>
+                <w:rFonts w:ascii="Calibri" w:hAnsi="Calibri" w:cs="Arial"/>
+                <w:sz w:val="18"/>
+                <w:szCs w:val="18"/>
+              </w:rPr>
+            </w:pPr>
+            <w:r>
+              <w:rPr>
+                <w:noProof/>
+              </w:rPr>
+              <w:drawing>
+                <wp:inline distT="0" distB="0" distL="0" distR="0" wp14:anchorId="4C2DB0FB" wp14:editId="0FEB5E2F">
+                  <wp:extent cx="3959860" cy="3670300"/>
+                  <wp:effectExtent l="0" t="0" r="2540" b="6350"/>
+                  <wp:docPr id="61" name="Picture 61"/>
+                  <wp:cNvGraphicFramePr>
+                    <a:graphicFrameLocks xmlns:a="http://schemas.openxmlformats.org/drawingml/2006/main" noChangeAspect="1"/>
+                  </wp:cNvGraphicFramePr>
+                  <a:graphic xmlns:a="http://schemas.openxmlformats.org/drawingml/2006/main">
+                    <a:graphicData uri="http://schemas.openxmlformats.org/drawingml/2006/picture">
+                      <pic:pic xmlns:pic="http://schemas.openxmlformats.org/drawingml/2006/picture">
+                        <pic:nvPicPr>
+                          <pic:cNvPr id="61" name="Picture 61"/>
+                          <pic:cNvPicPr>
+                            <a:picLocks noChangeAspect="1"/>
+                          </pic:cNvPicPr>
+                        </pic:nvPicPr>
+                        <pic:blipFill>
+                          <a:blip r:embed="rId15"/>
+                          <a:stretch>
+                            <a:fillRect/>
+                          </a:stretch>
+                        </pic:blipFill>
+                        <pic:spPr>
+                          <a:xfrm>
+                            <a:off x="0" y="0"/>
+                            <a:ext cx="3959860" cy="3670300"/>
+                          </a:xfrm>
+                          <a:prstGeom prst="rect">
+                            <a:avLst/>
+                          </a:prstGeom>
+                        </pic:spPr>
+                      </pic:pic>
+                    </a:graphicData>
+                  </a:graphic>
+                </wp:inline>
+              </w:drawing>
+            </w:r>
+          </w:p>
+          <w:p>
+            <w:pPr>
+              <w:rPr>
+                <w:rFonts w:ascii="Calibri" w:hAnsi="Calibri" w:cs="Arial"/>
+                <w:sz w:val="18"/>
+                <w:szCs w:val="18"/>
+              </w:rPr>
+            </w:pPr>
+            <w:r>
+              <w:rPr>
+                <w:rFonts w:ascii="Calibri" w:hAnsi="Calibri" w:cs="Arial"/>
+                <w:sz w:val="18"/>
+                <w:szCs w:val="18"/>
+              </w:rPr>
+              <w:t>Figura 5. Diagrama de secuencia usuario-sistema: carga del BL, extracción con IA, inspección del terminal, alerta y aprobación del correo.</w:t>
+            </w:r>
+          </w:p>
+          <w:p>
+            <w:pPr>
+              <w:rPr>
+                <w:rFonts w:ascii="Calibri" w:hAnsi="Calibri" w:cs="Arial"/>
+                <w:sz w:val="18"/>
+                <w:szCs w:val="18"/>
+              </w:rPr>
+            </w:pPr>
+          </w:p>
+          <w:p>
+            <w:pPr>
+              <w:rPr>
+                <w:rFonts w:ascii="Calibri" w:hAnsi="Calibri" w:cs="Arial"/>
+                <w:sz w:val="18"/>
+                <w:szCs w:val="18"/>
+              </w:rPr>
+            </w:pPr>
+          </w:p>
+          <w:p>
+            <w:pPr>
+              <w:rPr>
+                <w:b/>
                 <w:iCs/>
                 <w:color w:val="0070C0"/>
                 <w:sz w:val="18"/>
-                <w:szCs w:val="20"/>
-                <w:lang w:eastAsia="es-CL"/>
-              </w:rPr>
-              <w:t>Adjunta</w:t>
-            </w:r>
-            <w:r>
-              <w:rPr>
-                <w:rFonts w:ascii="Calibri" w:hAnsi="Calibri" w:cs="Arial"/>
-                <w:i/>
-                <w:iCs/>
-                <w:color w:val="0070C0"/>
-                <w:sz w:val="18"/>
-                <w:szCs w:val="20"/>
-                <w:lang w:eastAsia="es-CL"/>
-              </w:rPr>
-              <w:t xml:space="preserve"> </w:t>
-            </w:r>
-            <w:r>
-              <w:rPr>
-                <w:rFonts w:ascii="Calibri" w:hAnsi="Calibri" w:cs="Arial"/>
-                <w:i/>
-                <w:iCs/>
-                <w:color w:val="0070C0"/>
-                <w:sz w:val="18"/>
-                <w:szCs w:val="20"/>
-                <w:lang w:eastAsia="es-CL"/>
-              </w:rPr>
-              <w:t>evidencias que permitan dar cuenta del desarrollo del Proyecto APT y sus resultados finales.</w:t>
-            </w:r>
-          </w:p>
-          <w:p>
-            <w:pPr>
-              <w:ind w:left="743"/>
-              <w:rPr>
-                <w:b/>
-                <w:i/>
-                <w:color w:val="0070C0"/>
-                <w:sz w:val="18"/>
-              </w:rPr>
-            </w:pPr>
-            <w:r>
-              <w:rPr>
-                <w:rFonts w:ascii="Calibri" w:hAnsi="Calibri" w:cs="Arial"/>
-                <w:i/>
-                <w:color w:val="0070C0"/>
-                <w:sz w:val="18"/>
-                <w:szCs w:val="20"/>
-                <w:lang w:eastAsia="es-CL"/>
-              </w:rPr>
-              <w:t>¿Qué evidencias pueden servir para que los demás puedan visualizar y entender las distintas etapas de tu Proyecto APT y el resultado final?</w:t>
-            </w:r>
-            <w:r>
-              <w:rPr>
-                <w:rFonts w:ascii="Calibri" w:hAnsi="Calibri" w:cs="Arial"/>
-                <w:i/>
-                <w:color w:val="0070C0"/>
-                <w:sz w:val="18"/>
-                <w:szCs w:val="20"/>
-                <w:lang w:eastAsia="es-CL"/>
-              </w:rPr>
-              <w:t xml:space="preserve"> </w:t>
-            </w:r>
+              </w:rPr>
+            </w:pPr>
           </w:p>
         </w:tc>
       </w:tr>
@@ -2086,6 +4414,7 @@
                 <w:sz w:val="18"/>
                 <w:szCs w:val="18"/>
               </w:rPr>
+              <w:lastRenderedPageBreak/>
               <w:t>6</w:t>
             </w:r>
             <w:r>
@@ -2133,64 +4462,6 @@
           </w:tcPr>
           <w:p>
             <w:pPr>
-              <w:pStyle w:val="Prrafodelista"/>
-              <w:numPr>
-                <w:ilvl w:val="0"/>
-                <w:numId w:val="1"/>
-              </w:numPr>
-              <w:spacing w:after="0" w:line="240" w:lineRule="auto"/>
-              <w:ind w:left="314" w:hanging="284"/>
-              <w:jc w:val="both"/>
-              <w:rPr>
-                <w:rFonts w:ascii="Calibri" w:hAnsi="Calibri" w:cs="Arial"/>
-                <w:i/>
-                <w:iCs/>
-                <w:color w:val="0070C0"/>
-                <w:sz w:val="18"/>
-                <w:szCs w:val="18"/>
-                <w:lang w:eastAsia="es-CL"/>
-              </w:rPr>
-            </w:pPr>
-            <w:r>
-              <w:rPr>
-                <w:rFonts w:ascii="Calibri" w:hAnsi="Calibri" w:cs="Arial"/>
-                <w:i/>
-                <w:iCs/>
-                <w:color w:val="0070C0"/>
-                <w:sz w:val="18"/>
-                <w:szCs w:val="18"/>
-                <w:lang w:eastAsia="es-CL"/>
-              </w:rPr>
-              <w:t xml:space="preserve">Reflexión sobre el aporte del Proyecto APT en el </w:t>
-            </w:r>
-            <w:r>
-              <w:rPr>
-                <w:rFonts w:ascii="Calibri" w:hAnsi="Calibri" w:cs="Arial"/>
-                <w:i/>
-                <w:iCs/>
-                <w:color w:val="0070C0"/>
-                <w:sz w:val="18"/>
-                <w:szCs w:val="18"/>
-                <w:lang w:eastAsia="es-CL"/>
-              </w:rPr>
-              <w:t xml:space="preserve">desarrollo </w:t>
-            </w:r>
-            <w:r>
-              <w:rPr>
-                <w:rFonts w:ascii="Calibri" w:hAnsi="Calibri" w:cs="Arial"/>
-                <w:i/>
-                <w:iCs/>
-                <w:color w:val="0070C0"/>
-                <w:sz w:val="18"/>
-                <w:szCs w:val="18"/>
-                <w:lang w:eastAsia="es-CL"/>
-              </w:rPr>
-              <w:t>de los intereses profesionales.</w:t>
-            </w:r>
-          </w:p>
-          <w:p>
-            <w:pPr>
-              <w:pStyle w:val="Prrafodelista"/>
               <w:jc w:val="both"/>
               <w:rPr>
                 <w:rFonts w:ascii="Calibri" w:hAnsi="Calibri" w:cs="Arial"/>
@@ -2210,90 +4481,189 @@
                 <w:szCs w:val="20"/>
                 <w:lang w:eastAsia="es-CL"/>
               </w:rPr>
-              <w:t>¿De qué manera tu Proyecto APT te sirvió para tener mayor conocimiento de tus intereses profesionales? Luego de terminar tu Proyecto APT, ¿tus intereses profesionales siguen siendo los mismos que planteaste al comienzo de la asignatura?</w:t>
-            </w:r>
-          </w:p>
-          <w:p>
-            <w:pPr>
-              <w:pStyle w:val="Prrafodelista"/>
-              <w:numPr>
-                <w:ilvl w:val="0"/>
-                <w:numId w:val="1"/>
-              </w:numPr>
-              <w:spacing w:after="0" w:line="240" w:lineRule="auto"/>
-              <w:ind w:left="314" w:hanging="284"/>
-              <w:jc w:val="both"/>
+              <w:t>Ignacio Andrade:</w:t>
+            </w:r>
+            <w:r>
               <w:rPr>
                 <w:rFonts w:ascii="Calibri" w:hAnsi="Calibri" w:cs="Arial"/>
                 <w:i/>
-                <w:iCs/>
                 <w:color w:val="0070C0"/>
                 <w:sz w:val="18"/>
                 <w:szCs w:val="20"/>
                 <w:lang w:eastAsia="es-CL"/>
               </w:rPr>
-            </w:pPr>
-            <w:r>
+              <w:t xml:space="preserve"> </w:t>
+            </w:r>
+          </w:p>
+          <w:p>
+            <w:pPr>
+              <w:jc w:val="both"/>
+              <w:rPr>
+                <w:rFonts w:ascii="Calibri" w:hAnsi="Calibri" w:cs="Arial"/>
+                <w:sz w:val="18"/>
+                <w:szCs w:val="18"/>
+              </w:rPr>
+            </w:pPr>
+            <w:r>
+              <w:rPr>
+                <w:rFonts w:ascii="Calibri" w:hAnsi="Calibri" w:cs="Arial"/>
+                <w:b/>
+                <w:sz w:val="18"/>
+                <w:szCs w:val="18"/>
+              </w:rPr>
+              <w:t xml:space="preserve">Aporte al desarrollo de mis intereses. </w:t>
+            </w:r>
+            <w:r>
+              <w:rPr>
+                <w:rFonts w:ascii="Calibri" w:hAnsi="Calibri" w:cs="Arial"/>
+                <w:sz w:val="18"/>
+                <w:szCs w:val="18"/>
+              </w:rPr>
+              <w:t xml:space="preserve">Mis intereses profesionales están en la ingeniería de software, la programación y la arquitectura: entender por qué un sistema se construye de una forma y qué decisiones lo mantienen estable en el tiempo. </w:t>
+            </w:r>
+            <w:proofErr w:type="spellStart"/>
+            <w:r>
+              <w:rPr>
+                <w:rFonts w:ascii="Calibri" w:hAnsi="Calibri" w:cs="Arial"/>
+                <w:sz w:val="18"/>
+                <w:szCs w:val="18"/>
+              </w:rPr>
+              <w:t>PortIA</w:t>
+            </w:r>
+            <w:proofErr w:type="spellEnd"/>
+            <w:r>
+              <w:rPr>
+                <w:rFonts w:ascii="Calibri" w:hAnsi="Calibri" w:cs="Arial"/>
+                <w:sz w:val="18"/>
+                <w:szCs w:val="18"/>
+              </w:rPr>
+              <w:t xml:space="preserve"> me permitió aplicarlos en un problema real: definir las capas del Core, aplicar el patrón </w:t>
+            </w:r>
+            <w:proofErr w:type="spellStart"/>
+            <w:r>
+              <w:rPr>
+                <w:rFonts w:ascii="Calibri" w:hAnsi="Calibri" w:cs="Arial"/>
+                <w:sz w:val="18"/>
+                <w:szCs w:val="18"/>
+              </w:rPr>
+              <w:t>Strategy</w:t>
+            </w:r>
+            <w:proofErr w:type="spellEnd"/>
+            <w:r>
+              <w:rPr>
+                <w:rFonts w:ascii="Calibri" w:hAnsi="Calibri" w:cs="Arial"/>
+                <w:sz w:val="18"/>
+                <w:szCs w:val="18"/>
+              </w:rPr>
+              <w:t xml:space="preserve"> y el </w:t>
+            </w:r>
+            <w:r>
+              <w:rPr>
+                <w:rFonts w:ascii="Calibri" w:hAnsi="Calibri" w:cs="Arial"/>
+                <w:sz w:val="18"/>
+                <w:szCs w:val="18"/>
+              </w:rPr>
+              <w:t>disyuntor</w:t>
+            </w:r>
+            <w:r>
+              <w:rPr>
+                <w:rFonts w:ascii="Calibri" w:hAnsi="Calibri" w:cs="Arial"/>
+                <w:sz w:val="18"/>
+                <w:szCs w:val="18"/>
+              </w:rPr>
+              <w:t xml:space="preserve"> para aislar la incertidumbre del </w:t>
+            </w:r>
+            <w:proofErr w:type="spellStart"/>
+            <w:r>
+              <w:rPr>
+                <w:rFonts w:ascii="Calibri" w:hAnsi="Calibri" w:cs="Arial"/>
+                <w:sz w:val="18"/>
+                <w:szCs w:val="18"/>
+              </w:rPr>
+              <w:t>scraping</w:t>
+            </w:r>
+            <w:proofErr w:type="spellEnd"/>
+            <w:r>
+              <w:rPr>
+                <w:rFonts w:ascii="Calibri" w:hAnsi="Calibri" w:cs="Arial"/>
+                <w:sz w:val="18"/>
+                <w:szCs w:val="18"/>
+              </w:rPr>
+              <w:t xml:space="preserve">, diseñar contratos y un modelo de datos, y coordinar un sistema distribuido (Core, </w:t>
+            </w:r>
+            <w:proofErr w:type="spellStart"/>
+            <w:r>
+              <w:rPr>
+                <w:rFonts w:ascii="Calibri" w:hAnsi="Calibri" w:cs="Arial"/>
+                <w:sz w:val="18"/>
+                <w:szCs w:val="18"/>
+              </w:rPr>
+              <w:t>Frontend</w:t>
+            </w:r>
+            <w:proofErr w:type="spellEnd"/>
+            <w:r>
+              <w:rPr>
+                <w:rFonts w:ascii="Calibri" w:hAnsi="Calibri" w:cs="Arial"/>
+                <w:sz w:val="18"/>
+                <w:szCs w:val="18"/>
+              </w:rPr>
+              <w:t>, Agentes, mensajería y base de datos). Mis intereses siguen siendo los mismos que planteé al comienzo de la asignatura, pero se reafirmaron y se ampliaron</w:t>
+            </w:r>
+          </w:p>
+          <w:p>
+            <w:pPr>
+              <w:jc w:val="both"/>
               <w:rPr>
                 <w:rFonts w:ascii="Calibri" w:hAnsi="Calibri" w:cs="Arial"/>
                 <w:i/>
-                <w:iCs/>
                 <w:color w:val="0070C0"/>
                 <w:sz w:val="18"/>
                 <w:szCs w:val="20"/>
                 <w:lang w:eastAsia="es-CL"/>
               </w:rPr>
-              <w:t>Proyecciones laborales a partir de Proyecto APT.</w:t>
-            </w:r>
-          </w:p>
-          <w:p>
-            <w:pPr>
-              <w:pStyle w:val="Prrafodelista"/>
-              <w:jc w:val="both"/>
-              <w:rPr>
-                <w:rFonts w:ascii="Calibri" w:hAnsi="Calibri" w:cs="Arial"/>
-                <w:i/>
-                <w:color w:val="0070C0"/>
-                <w:sz w:val="18"/>
-                <w:szCs w:val="20"/>
-                <w:lang w:eastAsia="es-CL"/>
-              </w:rPr>
-            </w:pPr>
-            <w:r>
-              <w:rPr>
-                <w:rFonts w:ascii="Calibri" w:hAnsi="Calibri" w:cs="Arial"/>
-                <w:i/>
-                <w:color w:val="0070C0"/>
-                <w:sz w:val="18"/>
-                <w:szCs w:val="20"/>
-                <w:lang w:eastAsia="es-CL"/>
-              </w:rPr>
-              <w:t>¿Qué intereses profesionales te gustaría explorar o seguir profundizando?</w:t>
-            </w:r>
-          </w:p>
-          <w:p>
-            <w:pPr>
-              <w:pStyle w:val="Prrafodelista"/>
-              <w:jc w:val="both"/>
-              <w:rPr>
-                <w:rFonts w:ascii="Calibri" w:hAnsi="Calibri" w:cs="Arial"/>
-                <w:i/>
-                <w:color w:val="0070C0"/>
-                <w:sz w:val="18"/>
-                <w:szCs w:val="20"/>
-                <w:lang w:eastAsia="es-CL"/>
-              </w:rPr>
-            </w:pPr>
-            <w:r>
-              <w:rPr>
-                <w:rFonts w:ascii="Calibri" w:hAnsi="Calibri" w:cs="Arial"/>
-                <w:i/>
-                <w:color w:val="0070C0"/>
-                <w:sz w:val="18"/>
-                <w:szCs w:val="20"/>
-                <w:lang w:eastAsia="es-CL"/>
-              </w:rPr>
-              <w:t xml:space="preserve">¿Cómo te proyectas laboralmente después de haber terminado tu Proyecto APT? </w:t>
+            </w:pPr>
+            <w:r>
+              <w:rPr>
+                <w:rFonts w:ascii="Calibri" w:hAnsi="Calibri" w:cs="Arial"/>
+                <w:b/>
+                <w:sz w:val="18"/>
+                <w:szCs w:val="18"/>
+              </w:rPr>
+              <w:t xml:space="preserve">Proyecciones laborales. </w:t>
+            </w:r>
+            <w:r>
+              <w:rPr>
+                <w:rFonts w:ascii="Calibri" w:hAnsi="Calibri" w:cs="Arial"/>
+                <w:sz w:val="18"/>
+                <w:szCs w:val="18"/>
+              </w:rPr>
+              <w:t xml:space="preserve">Me gustaría seguir profundizando en arquitectura de software de sistemas distribuidos, mensajería y eventos, seguridad aplicada (JWT, control de acceso, auditoría y protección de datos personales), integración de servicios de IA y prácticas de DevOps con contenedores y despliegue en la nube. Me proyecto trabajando como desarrollador </w:t>
+            </w:r>
+            <w:proofErr w:type="spellStart"/>
+            <w:r>
+              <w:rPr>
+                <w:rFonts w:ascii="Calibri" w:hAnsi="Calibri" w:cs="Arial"/>
+                <w:sz w:val="18"/>
+                <w:szCs w:val="18"/>
+              </w:rPr>
+              <w:t>backend</w:t>
+            </w:r>
+            <w:proofErr w:type="spellEnd"/>
+            <w:r>
+              <w:rPr>
+                <w:rFonts w:ascii="Calibri" w:hAnsi="Calibri" w:cs="Arial"/>
+                <w:sz w:val="18"/>
+                <w:szCs w:val="18"/>
+              </w:rPr>
+              <w:t xml:space="preserve"> y, con la experiencia, como arquitecto de software, participando en el diseño de soluciones que resuelvan problemas reales</w:t>
+            </w:r>
+            <w:r>
+              <w:rPr>
+                <w:rFonts w:ascii="Calibri" w:hAnsi="Calibri" w:cs="Arial"/>
+                <w:sz w:val="18"/>
+                <w:szCs w:val="18"/>
+              </w:rPr>
+              <w:t>.</w:t>
             </w:r>
           </w:p>
         </w:tc>
@@ -2334,7 +4704,7 @@
     </w:p>
     <w:p/>
     <w:sectPr>
-      <w:headerReference w:type="default" r:id="rId11"/>
+      <w:headerReference w:type="default" r:id="rId16"/>
       <w:pgSz w:w="11906" w:h="16838"/>
       <w:pgMar w:top="1417" w:right="1701" w:bottom="1417" w:left="1701" w:header="708" w:footer="708" w:gutter="0"/>
       <w:cols w:space="708"/>
@@ -2345,7 +4715,7 @@
 </file>
 
 <file path=word/endnotes.xml><?xml version="1.0" encoding="utf-8"?>
-<w:endnotes xmlns:wpc="http://schemas.microsoft.com/office/word/2010/wordprocessingCanvas" xmlns:cx="http://schemas.microsoft.com/office/drawing/2014/chartex" xmlns:mc="http://schemas.openxmlformats.org/markup-compatibility/2006" xmlns:o="urn:schemas-microsoft-com:office:office" xmlns:r="http://schemas.openxmlformats.org/officeDocument/2006/relationships" xmlns:m="http://schemas.openxmlformats.org/officeDocument/2006/math" xmlns:v="urn:schemas-microsoft-com:vml" xmlns:wp14="http://schemas.microsoft.com/office/word/2010/wordprocessingDrawing" xmlns:wp="http://schemas.openxmlformats.org/drawingml/2006/wordprocessingDrawing" xmlns:w10="urn:schemas-microsoft-com:office:word" xmlns:w="http://schemas.openxmlformats.org/wordprocessingml/2006/main" xmlns:w14="http://schemas.microsoft.com/office/word/2010/wordml" xmlns:w15="http://schemas.microsoft.com/office/word/2012/wordml" xmlns:w16se="http://schemas.microsoft.com/office/word/2015/wordml/symex" xmlns:wpg="http://schemas.microsoft.com/office/word/2010/wordprocessingGroup" xmlns:wpi="http://schemas.microsoft.com/office/word/2010/wordprocessingInk" xmlns:wne="http://schemas.microsoft.com/office/word/2006/wordml" xmlns:wps="http://schemas.microsoft.com/office/word/2010/wordprocessingShape" mc:Ignorable="w14 w15 w16se wp14">
+<w:endnotes xmlns:wpc="http://schemas.microsoft.com/office/word/2010/wordprocessingCanvas" xmlns:cx="http://schemas.microsoft.com/office/drawing/2014/chartex" xmlns:cx1="http://schemas.microsoft.com/office/drawing/2015/9/8/chartex" xmlns:cx2="http://schemas.microsoft.com/office/drawing/2015/10/21/chartex" xmlns:cx3="http://schemas.microsoft.com/office/drawing/2016/5/9/chartex" xmlns:cx4="http://schemas.microsoft.com/office/drawing/2016/5/10/chartex" xmlns:cx5="http://schemas.microsoft.com/office/drawing/2016/5/11/chartex" xmlns:cx6="http://schemas.microsoft.com/office/drawing/2016/5/12/chartex" xmlns:cx7="http://schemas.microsoft.com/office/drawing/2016/5/13/chartex" xmlns:cx8="http://schemas.microsoft.com/office/drawing/2016/5/14/chartex" xmlns:mc="http://schemas.openxmlformats.org/markup-compatibility/2006" xmlns:aink="http://schemas.microsoft.com/office/drawing/2016/ink" xmlns:am3d="http://schemas.microsoft.com/office/drawing/2017/model3d" xmlns:o="urn:schemas-microsoft-com:office:office" xmlns:oel="http://schemas.microsoft.com/office/2019/extlst" xmlns:r="http://schemas.openxmlformats.org/officeDocument/2006/relationships" xmlns:m="http://schemas.openxmlformats.org/officeDocument/2006/math" xmlns:v="urn:schemas-microsoft-com:vml" xmlns:wp14="http://schemas.microsoft.com/office/word/2010/wordprocessingDrawing" xmlns:wp="http://schemas.openxmlformats.org/drawingml/2006/wordprocessingDrawing" xmlns:w10="urn:schemas-microsoft-com:office:word" xmlns:w="http://schemas.openxmlformats.org/wordprocessingml/2006/main" xmlns:w14="http://schemas.microsoft.com/office/word/2010/wordml" xmlns:w15="http://schemas.microsoft.com/office/word/2012/wordml" xmlns:w16cex="http://schemas.microsoft.com/office/word/2018/wordml/cex" xmlns:w16cid="http://schemas.microsoft.com/office/word/2016/wordml/cid" xmlns:w16="http://schemas.microsoft.com/office/word/2018/wordml" xmlns:w16du="http://schemas.microsoft.com/office/word/2023/wordml/word16du" xmlns:w16sdtdh="http://schemas.microsoft.com/office/word/2020/wordml/sdtdatahash" xmlns:w16sdtfl="http://schemas.microsoft.com/office/word/2024/wordml/sdtformatlock" xmlns:w16se="http://schemas.microsoft.com/office/word/2015/wordml/symex" xmlns:wpg="http://schemas.microsoft.com/office/word/2010/wordprocessingGroup" xmlns:wpi="http://schemas.microsoft.com/office/word/2010/wordprocessingInk" xmlns:wne="http://schemas.microsoft.com/office/word/2006/wordml" xmlns:wps="http://schemas.microsoft.com/office/word/2010/wordprocessingShape" mc:Ignorable="w14 w15 w16se w16cid w16 w16cex w16sdtdh w16sdtfl w16du wp14">
   <w:endnote w:type="separator" w:id="-1">
     <w:p>
       <w:pPr>
@@ -2370,7 +4740,7 @@
 </file>
 
 <file path=word/footnotes.xml><?xml version="1.0" encoding="utf-8"?>
-<w:footnotes xmlns:wpc="http://schemas.microsoft.com/office/word/2010/wordprocessingCanvas" xmlns:cx="http://schemas.microsoft.com/office/drawing/2014/chartex" xmlns:mc="http://schemas.openxmlformats.org/markup-compatibility/2006" xmlns:o="urn:schemas-microsoft-com:office:office" xmlns:r="http://schemas.openxmlformats.org/officeDocument/2006/relationships" xmlns:m="http://schemas.openxmlformats.org/officeDocument/2006/math" xmlns:v="urn:schemas-microsoft-com:vml" xmlns:wp14="http://schemas.microsoft.com/office/word/2010/wordprocessingDrawing" xmlns:wp="http://schemas.openxmlformats.org/drawingml/2006/wordprocessingDrawing" xmlns:w10="urn:schemas-microsoft-com:office:word" xmlns:w="http://schemas.openxmlformats.org/wordprocessingml/2006/main" xmlns:w14="http://schemas.microsoft.com/office/word/2010/wordml" xmlns:w15="http://schemas.microsoft.com/office/word/2012/wordml" xmlns:w16se="http://schemas.microsoft.com/office/word/2015/wordml/symex" xmlns:wpg="http://schemas.microsoft.com/office/word/2010/wordprocessingGroup" xmlns:wpi="http://schemas.microsoft.com/office/word/2010/wordprocessingInk" xmlns:wne="http://schemas.microsoft.com/office/word/2006/wordml" xmlns:wps="http://schemas.microsoft.com/office/word/2010/wordprocessingShape" mc:Ignorable="w14 w15 w16se wp14">
+<w:footnotes xmlns:wpc="http://schemas.microsoft.com/office/word/2010/wordprocessingCanvas" xmlns:cx="http://schemas.microsoft.com/office/drawing/2014/chartex" xmlns:cx1="http://schemas.microsoft.com/office/drawing/2015/9/8/chartex" xmlns:cx2="http://schemas.microsoft.com/office/drawing/2015/10/21/chartex" xmlns:cx3="http://schemas.microsoft.com/office/drawing/2016/5/9/chartex" xmlns:cx4="http://schemas.microsoft.com/office/drawing/2016/5/10/chartex" xmlns:cx5="http://schemas.microsoft.com/office/drawing/2016/5/11/chartex" xmlns:cx6="http://schemas.microsoft.com/office/drawing/2016/5/12/chartex" xmlns:cx7="http://schemas.microsoft.com/office/drawing/2016/5/13/chartex" xmlns:cx8="http://schemas.microsoft.com/office/drawing/2016/5/14/chartex" xmlns:mc="http://schemas.openxmlformats.org/markup-compatibility/2006" xmlns:aink="http://schemas.microsoft.com/office/drawing/2016/ink" xmlns:am3d="http://schemas.microsoft.com/office/drawing/2017/model3d" xmlns:o="urn:schemas-microsoft-com:office:office" xmlns:oel="http://schemas.microsoft.com/office/2019/extlst" xmlns:r="http://schemas.openxmlformats.org/officeDocument/2006/relationships" xmlns:m="http://schemas.openxmlformats.org/officeDocument/2006/math" xmlns:v="urn:schemas-microsoft-com:vml" xmlns:wp14="http://schemas.microsoft.com/office/word/2010/wordprocessingDrawing" xmlns:wp="http://schemas.openxmlformats.org/drawingml/2006/wordprocessingDrawing" xmlns:w10="urn:schemas-microsoft-com:office:word" xmlns:w="http://schemas.openxmlformats.org/wordprocessingml/2006/main" xmlns:w14="http://schemas.microsoft.com/office/word/2010/wordml" xmlns:w15="http://schemas.microsoft.com/office/word/2012/wordml" xmlns:w16cex="http://schemas.microsoft.com/office/word/2018/wordml/cex" xmlns:w16cid="http://schemas.microsoft.com/office/word/2016/wordml/cid" xmlns:w16="http://schemas.microsoft.com/office/word/2018/wordml" xmlns:w16du="http://schemas.microsoft.com/office/word/2023/wordml/word16du" xmlns:w16sdtdh="http://schemas.microsoft.com/office/word/2020/wordml/sdtdatahash" xmlns:w16sdtfl="http://schemas.microsoft.com/office/word/2024/wordml/sdtformatlock" xmlns:w16se="http://schemas.microsoft.com/office/word/2015/wordml/symex" xmlns:wpg="http://schemas.microsoft.com/office/word/2010/wordprocessingGroup" xmlns:wpi="http://schemas.microsoft.com/office/word/2010/wordprocessingInk" xmlns:wne="http://schemas.microsoft.com/office/word/2006/wordml" xmlns:wps="http://schemas.microsoft.com/office/word/2010/wordprocessingShape" mc:Ignorable="w14 w15 w16se w16cid w16 w16cex w16sdtdh w16sdtfl w16du wp14">
   <w:footnote w:type="separator" w:id="-1">
     <w:p>
       <w:pPr>
@@ -2395,7 +4765,7 @@
 </file>
 
 <file path=word/header1.xml><?xml version="1.0" encoding="utf-8"?>
-<w:hdr xmlns:wpc="http://schemas.microsoft.com/office/word/2010/wordprocessingCanvas" xmlns:cx="http://schemas.microsoft.com/office/drawing/2014/chartex" xmlns:mc="http://schemas.openxmlformats.org/markup-compatibility/2006" xmlns:o="urn:schemas-microsoft-com:office:office" xmlns:r="http://schemas.openxmlformats.org/officeDocument/2006/relationships" xmlns:m="http://schemas.openxmlformats.org/officeDocument/2006/math" xmlns:v="urn:schemas-microsoft-com:vml" xmlns:wp14="http://schemas.microsoft.com/office/word/2010/wordprocessingDrawing" xmlns:wp="http://schemas.openxmlformats.org/drawingml/2006/wordprocessingDrawing" xmlns:w10="urn:schemas-microsoft-com:office:word" xmlns:w="http://schemas.openxmlformats.org/wordprocessingml/2006/main" xmlns:w14="http://schemas.microsoft.com/office/word/2010/wordml" xmlns:w15="http://schemas.microsoft.com/office/word/2012/wordml" xmlns:w16se="http://schemas.microsoft.com/office/word/2015/wordml/symex" xmlns:wpg="http://schemas.microsoft.com/office/word/2010/wordprocessingGroup" xmlns:wpi="http://schemas.microsoft.com/office/word/2010/wordprocessingInk" xmlns:wne="http://schemas.microsoft.com/office/word/2006/wordml" xmlns:wps="http://schemas.microsoft.com/office/word/2010/wordprocessingShape" mc:Ignorable="w14 w15 w16se wp14">
+<w:hdr xmlns:wpc="http://schemas.microsoft.com/office/word/2010/wordprocessingCanvas" xmlns:cx="http://schemas.microsoft.com/office/drawing/2014/chartex" xmlns:cx1="http://schemas.microsoft.com/office/drawing/2015/9/8/chartex" xmlns:cx2="http://schemas.microsoft.com/office/drawing/2015/10/21/chartex" xmlns:cx3="http://schemas.microsoft.com/office/drawing/2016/5/9/chartex" xmlns:cx4="http://schemas.microsoft.com/office/drawing/2016/5/10/chartex" xmlns:cx5="http://schemas.microsoft.com/office/drawing/2016/5/11/chartex" xmlns:cx6="http://schemas.microsoft.com/office/drawing/2016/5/12/chartex" xmlns:cx7="http://schemas.microsoft.com/office/drawing/2016/5/13/chartex" xmlns:cx8="http://schemas.microsoft.com/office/drawing/2016/5/14/chartex" xmlns:mc="http://schemas.openxmlformats.org/markup-compatibility/2006" xmlns:aink="http://schemas.microsoft.com/office/drawing/2016/ink" xmlns:am3d="http://schemas.microsoft.com/office/drawing/2017/model3d" xmlns:o="urn:schemas-microsoft-com:office:office" xmlns:oel="http://schemas.microsoft.com/office/2019/extlst" xmlns:r="http://schemas.openxmlformats.org/officeDocument/2006/relationships" xmlns:m="http://schemas.openxmlformats.org/officeDocument/2006/math" xmlns:v="urn:schemas-microsoft-com:vml" xmlns:wp14="http://schemas.microsoft.com/office/word/2010/wordprocessingDrawing" xmlns:wp="http://schemas.openxmlformats.org/drawingml/2006/wordprocessingDrawing" xmlns:w10="urn:schemas-microsoft-com:office:word" xmlns:w="http://schemas.openxmlformats.org/wordprocessingml/2006/main" xmlns:w14="http://schemas.microsoft.com/office/word/2010/wordml" xmlns:w15="http://schemas.microsoft.com/office/word/2012/wordml" xmlns:w16cex="http://schemas.microsoft.com/office/word/2018/wordml/cex" xmlns:w16cid="http://schemas.microsoft.com/office/word/2016/wordml/cid" xmlns:w16="http://schemas.microsoft.com/office/word/2018/wordml" xmlns:w16du="http://schemas.microsoft.com/office/word/2023/wordml/word16du" xmlns:w16sdtdh="http://schemas.microsoft.com/office/word/2020/wordml/sdtdatahash" xmlns:w16sdtfl="http://schemas.microsoft.com/office/word/2024/wordml/sdtformatlock" xmlns:w16se="http://schemas.microsoft.com/office/word/2015/wordml/symex" xmlns:wpg="http://schemas.microsoft.com/office/word/2010/wordprocessingGroup" xmlns:wpi="http://schemas.microsoft.com/office/word/2010/wordprocessingInk" xmlns:wne="http://schemas.microsoft.com/office/word/2006/wordml" xmlns:wps="http://schemas.microsoft.com/office/word/2010/wordprocessingShape" mc:Ignorable="w14 w15 w16se w16cid w16 w16cex w16sdtdh w16sdtfl w16du wp14">
   <w:tbl>
     <w:tblPr>
       <w:tblStyle w:val="Tablaconcuadrcula1"/>
@@ -2620,7 +4990,7 @@
 </file>
 
 <file path=word/numbering.xml><?xml version="1.0" encoding="utf-8"?>
-<w:numbering xmlns:wpc="http://schemas.microsoft.com/office/word/2010/wordprocessingCanvas" xmlns:cx="http://schemas.microsoft.com/office/drawing/2014/chartex" xmlns:mc="http://schemas.openxmlformats.org/markup-compatibility/2006" xmlns:o="urn:schemas-microsoft-com:office:office" xmlns:r="http://schemas.openxmlformats.org/officeDocument/2006/relationships" xmlns:m="http://schemas.openxmlformats.org/officeDocument/2006/math" xmlns:v="urn:schemas-microsoft-com:vml" xmlns:wp14="http://schemas.microsoft.com/office/word/2010/wordprocessingDrawing" xmlns:wp="http://schemas.openxmlformats.org/drawingml/2006/wordprocessingDrawing" xmlns:w10="urn:schemas-microsoft-com:office:word" xmlns:w="http://schemas.openxmlformats.org/wordprocessingml/2006/main" xmlns:w14="http://schemas.microsoft.com/office/word/2010/wordml" xmlns:w15="http://schemas.microsoft.com/office/word/2012/wordml" xmlns:w16se="http://schemas.microsoft.com/office/word/2015/wordml/symex" xmlns:wpg="http://schemas.microsoft.com/office/word/2010/wordprocessingGroup" xmlns:wpi="http://schemas.microsoft.com/office/word/2010/wordprocessingInk" xmlns:wne="http://schemas.microsoft.com/office/word/2006/wordml" xmlns:wps="http://schemas.microsoft.com/office/word/2010/wordprocessingShape" mc:Ignorable="w14 w15 w16se wp14">
+<w:numbering xmlns:wpc="http://schemas.microsoft.com/office/word/2010/wordprocessingCanvas" xmlns:cx="http://schemas.microsoft.com/office/drawing/2014/chartex" xmlns:cx1="http://schemas.microsoft.com/office/drawing/2015/9/8/chartex" xmlns:cx2="http://schemas.microsoft.com/office/drawing/2015/10/21/chartex" xmlns:cx3="http://schemas.microsoft.com/office/drawing/2016/5/9/chartex" xmlns:cx4="http://schemas.microsoft.com/office/drawing/2016/5/10/chartex" xmlns:cx5="http://schemas.microsoft.com/office/drawing/2016/5/11/chartex" xmlns:cx6="http://schemas.microsoft.com/office/drawing/2016/5/12/chartex" xmlns:cx7="http://schemas.microsoft.com/office/drawing/2016/5/13/chartex" xmlns:cx8="http://schemas.microsoft.com/office/drawing/2016/5/14/chartex" xmlns:mc="http://schemas.openxmlformats.org/markup-compatibility/2006" xmlns:aink="http://schemas.microsoft.com/office/drawing/2016/ink" xmlns:am3d="http://schemas.microsoft.com/office/drawing/2017/model3d" xmlns:o="urn:schemas-microsoft-com:office:office" xmlns:oel="http://schemas.microsoft.com/office/2019/extlst" xmlns:r="http://schemas.openxmlformats.org/officeDocument/2006/relationships" xmlns:m="http://schemas.openxmlformats.org/officeDocument/2006/math" xmlns:v="urn:schemas-microsoft-com:vml" xmlns:wp14="http://schemas.microsoft.com/office/word/2010/wordprocessingDrawing" xmlns:wp="http://schemas.openxmlformats.org/drawingml/2006/wordprocessingDrawing" xmlns:w10="urn:schemas-microsoft-com:office:word" xmlns:w="http://schemas.openxmlformats.org/wordprocessingml/2006/main" xmlns:w14="http://schemas.microsoft.com/office/word/2010/wordml" xmlns:w15="http://schemas.microsoft.com/office/word/2012/wordml" xmlns:w16cex="http://schemas.microsoft.com/office/word/2018/wordml/cex" xmlns:w16cid="http://schemas.microsoft.com/office/word/2016/wordml/cid" xmlns:w16="http://schemas.microsoft.com/office/word/2018/wordml" xmlns:w16du="http://schemas.microsoft.com/office/word/2023/wordml/word16du" xmlns:w16sdtdh="http://schemas.microsoft.com/office/word/2020/wordml/sdtdatahash" xmlns:w16sdtfl="http://schemas.microsoft.com/office/word/2024/wordml/sdtformatlock" xmlns:w16se="http://schemas.microsoft.com/office/word/2015/wordml/symex" xmlns:wpg="http://schemas.microsoft.com/office/word/2010/wordprocessingGroup" xmlns:wpi="http://schemas.microsoft.com/office/word/2010/wordprocessingInk" xmlns:wne="http://schemas.microsoft.com/office/word/2006/wordml" xmlns:wps="http://schemas.microsoft.com/office/word/2010/wordprocessingShape" mc:Ignorable="w14 w15 w16se w16cid w16 w16cex w16sdtdh w16sdtfl w16du wp14">
   <w:abstractNum w:abstractNumId="0" w15:restartNumberingAfterBreak="0">
     <w:nsid w:val="114E14AF"/>
     <w:multiLevelType w:val="hybridMultilevel"/>
@@ -3320,29 +5690,29 @@
       </w:pPr>
     </w:lvl>
   </w:abstractNum>
-  <w:num w:numId="1">
+  <w:num w:numId="1" w16cid:durableId="2137134760">
     <w:abstractNumId w:val="0"/>
   </w:num>
-  <w:num w:numId="2">
+  <w:num w:numId="2" w16cid:durableId="1433748305">
     <w:abstractNumId w:val="2"/>
   </w:num>
-  <w:num w:numId="3">
+  <w:num w:numId="3" w16cid:durableId="655063843">
     <w:abstractNumId w:val="5"/>
   </w:num>
-  <w:num w:numId="4">
+  <w:num w:numId="4" w16cid:durableId="1753116937">
     <w:abstractNumId w:val="1"/>
   </w:num>
-  <w:num w:numId="5">
+  <w:num w:numId="5" w16cid:durableId="799497281">
     <w:abstractNumId w:val="3"/>
   </w:num>
-  <w:num w:numId="6">
+  <w:num w:numId="6" w16cid:durableId="445975682">
     <w:abstractNumId w:val="4"/>
   </w:num>
 </w:numbering>
 </file>
 
 <file path=word/styles.xml><?xml version="1.0" encoding="utf-8"?>
-<w:styles xmlns:mc="http://schemas.openxmlformats.org/markup-compatibility/2006" xmlns:r="http://schemas.openxmlformats.org/officeDocument/2006/relationships" xmlns:w="http://schemas.openxmlformats.org/wordprocessingml/2006/main" xmlns:w14="http://schemas.microsoft.com/office/word/2010/wordml" xmlns:w15="http://schemas.microsoft.com/office/word/2012/wordml" xmlns:w16se="http://schemas.microsoft.com/office/word/2015/wordml/symex" mc:Ignorable="w14 w15 w16se">
+<w:styles xmlns:mc="http://schemas.openxmlformats.org/markup-compatibility/2006" xmlns:r="http://schemas.openxmlformats.org/officeDocument/2006/relationships" xmlns:w="http://schemas.openxmlformats.org/wordprocessingml/2006/main" xmlns:w14="http://schemas.microsoft.com/office/word/2010/wordml" xmlns:w15="http://schemas.microsoft.com/office/word/2012/wordml" xmlns:w16cex="http://schemas.microsoft.com/office/word/2018/wordml/cex" xmlns:w16cid="http://schemas.microsoft.com/office/word/2016/wordml/cid" xmlns:w16="http://schemas.microsoft.com/office/word/2018/wordml" xmlns:w16du="http://schemas.microsoft.com/office/word/2023/wordml/word16du" xmlns:w16sdtdh="http://schemas.microsoft.com/office/word/2020/wordml/sdtdatahash" xmlns:w16sdtfl="http://schemas.microsoft.com/office/word/2024/wordml/sdtformatlock" xmlns:w16se="http://schemas.microsoft.com/office/word/2015/wordml/symex" mc:Ignorable="w14 w15 w16se w16cid w16 w16cex w16sdtdh w16sdtfl w16du">
   <w:docDefaults>
     <w:rPrDefault>
       <w:rPr>
@@ -3354,7 +5724,7 @@
     </w:rPrDefault>
     <w:pPrDefault/>
   </w:docDefaults>
-  <w:latentStyles w:defLockedState="0" w:defUIPriority="99" w:defSemiHidden="0" w:defUnhideWhenUsed="0" w:defQFormat="0" w:count="371">
+  <w:latentStyles w:defLockedState="0" w:defUIPriority="99" w:defSemiHidden="0" w:defUnhideWhenUsed="0" w:defQFormat="0" w:count="376">
     <w:lsdException w:name="Normal" w:uiPriority="0" w:qFormat="1"/>
     <w:lsdException w:name="heading 1" w:uiPriority="9" w:qFormat="1"/>
     <w:lsdException w:name="heading 2" w:semiHidden="1" w:uiPriority="9" w:unhideWhenUsed="1" w:qFormat="1"/>
@@ -3726,6 +6096,11 @@
     <w:lsdException w:name="List Table 5 Dark Accent 6" w:uiPriority="50"/>
     <w:lsdException w:name="List Table 6 Colorful Accent 6" w:uiPriority="51"/>
     <w:lsdException w:name="List Table 7 Colorful Accent 6" w:uiPriority="52"/>
+    <w:lsdException w:name="Mention" w:semiHidden="1" w:unhideWhenUsed="1"/>
+    <w:lsdException w:name="Smart Hyperlink" w:semiHidden="1" w:unhideWhenUsed="1"/>
+    <w:lsdException w:name="Hashtag" w:semiHidden="1" w:unhideWhenUsed="1"/>
+    <w:lsdException w:name="Unresolved Mention" w:semiHidden="1" w:unhideWhenUsed="1"/>
+    <w:lsdException w:name="Smart Link" w:semiHidden="1" w:unhideWhenUsed="1"/>
   </w:latentStyles>
   <w:style w:type="paragraph" w:default="1" w:styleId="Normal">
     <w:name w:val="Normal"/>
@@ -3764,7 +6139,6 @@
   <w:style w:type="character" w:default="1" w:styleId="Fuentedeprrafopredeter">
     <w:name w:val="Default Paragraph Font"/>
     <w:uiPriority w:val="1"/>
-    <w:semiHidden/>
     <w:unhideWhenUsed/>
   </w:style>
   <w:style w:type="table" w:default="1" w:styleId="Tablanormal">
@@ -4335,6 +6709,25 @@
 </file>
 
 <file path=customXml/item1.xml><?xml version="1.0" encoding="utf-8"?>
+<b:Sources xmlns:b="http://schemas.openxmlformats.org/officeDocument/2006/bibliography" xmlns="http://schemas.openxmlformats.org/officeDocument/2006/bibliography" SelectedStyle="\APASixthEditionOfficeOnline.xsl" StyleName="APA" Version="6"/>
+</file>
+
+<file path=customXml/item2.xml><?xml version="1.0" encoding="utf-8"?>
+<?mso-contentType ?>
+<FormTemplates xmlns="http://schemas.microsoft.com/sharepoint/v3/contenttype/forms">
+  <Display>DocumentLibraryForm</Display>
+  <Edit>DocumentLibraryForm</Edit>
+  <New>DocumentLibraryForm</New>
+</FormTemplates>
+</file>
+
+<file path=customXml/item3.xml><?xml version="1.0" encoding="utf-8"?>
+<p:properties xmlns:p="http://schemas.microsoft.com/office/2006/metadata/properties" xmlns:xsi="http://www.w3.org/2001/XMLSchema-instance" xmlns:pc="http://schemas.microsoft.com/office/infopath/2007/PartnerControls">
+  <documentManagement/>
+</p:properties>
+</file>
+
+<file path=customXml/item4.xml><?xml version="1.0" encoding="utf-8"?>
 <ct:contentTypeSchema xmlns:ct="http://schemas.microsoft.com/office/2006/metadata/contentType" xmlns:ma="http://schemas.microsoft.com/office/2006/metadata/properties/metaAttributes" ct:_="" ma:_="" ma:contentTypeName="Documento" ma:contentTypeID="0x010100E96778489EE7714D8BD12CC105EB918B" ma:contentTypeVersion="2" ma:contentTypeDescription="Crear nuevo documento." ma:contentTypeScope="" ma:versionID="416c5c7ae9b5d54d83875cd3c65194e3">
   <xsd:schema xmlns:xsd="http://www.w3.org/2001/XMLSchema" xmlns:xs="http://www.w3.org/2001/XMLSchema" xmlns:p="http://schemas.microsoft.com/office/2006/metadata/properties" xmlns:ns2="126e8a1c-9ea9-435a-ac89-d06c80d62e30" targetNamespace="http://schemas.microsoft.com/office/2006/metadata/properties" ma:root="true" ma:fieldsID="70a237c842677bd850644f8595079f5e" ns2:_="">
     <xsd:import namespace="126e8a1c-9ea9-435a-ac89-d06c80d62e30"/>
@@ -4466,26 +6859,32 @@
 </ct:contentTypeSchema>
 </file>
 
-<file path=customXml/item2.xml><?xml version="1.0" encoding="utf-8"?>
-<p:properties xmlns:p="http://schemas.microsoft.com/office/2006/metadata/properties" xmlns:xsi="http://www.w3.org/2001/XMLSchema-instance" xmlns:pc="http://schemas.microsoft.com/office/infopath/2007/PartnerControls">
-  <documentManagement/>
-</p:properties>
+<file path=customXml/itemProps1.xml><?xml version="1.0" encoding="utf-8"?>
+<ds:datastoreItem xmlns:ds="http://schemas.openxmlformats.org/officeDocument/2006/customXml" ds:itemID="{BDCED711-E314-4C22-B587-D275DD8897EC}">
+  <ds:schemaRefs>
+    <ds:schemaRef ds:uri="http://schemas.openxmlformats.org/officeDocument/2006/bibliography"/>
+  </ds:schemaRefs>
+</ds:datastoreItem>
 </file>
 
-<file path=customXml/item3.xml><?xml version="1.0" encoding="utf-8"?>
-<?mso-contentType ?>
-<FormTemplates xmlns="http://schemas.microsoft.com/sharepoint/v3/contenttype/forms">
-  <Display>DocumentLibraryForm</Display>
-  <Edit>DocumentLibraryForm</Edit>
-  <New>DocumentLibraryForm</New>
-</FormTemplates>
+<file path=customXml/itemProps2.xml><?xml version="1.0" encoding="utf-8"?>
+<ds:datastoreItem xmlns:ds="http://schemas.openxmlformats.org/officeDocument/2006/customXml" ds:itemID="{DB26575A-B7B3-4412-B642-D3B0845180CC}">
+  <ds:schemaRefs>
+    <ds:schemaRef ds:uri="http://schemas.microsoft.com/sharepoint/v3/contenttype/forms"/>
+  </ds:schemaRefs>
+</ds:datastoreItem>
 </file>
 
-<file path=customXml/item4.xml><?xml version="1.0" encoding="utf-8"?>
-<b:Sources xmlns:b="http://schemas.openxmlformats.org/officeDocument/2006/bibliography" xmlns="http://schemas.openxmlformats.org/officeDocument/2006/bibliography" SelectedStyle="\APASixthEditionOfficeOnline.xsl" StyleName="APA" Version="6"/>
+<file path=customXml/itemProps3.xml><?xml version="1.0" encoding="utf-8"?>
+<ds:datastoreItem xmlns:ds="http://schemas.openxmlformats.org/officeDocument/2006/customXml" ds:itemID="{372B79FC-6971-4544-98C5-83069028712A}">
+  <ds:schemaRefs>
+    <ds:schemaRef ds:uri="http://schemas.microsoft.com/office/2006/metadata/properties"/>
+    <ds:schemaRef ds:uri="http://schemas.microsoft.com/office/infopath/2007/PartnerControls"/>
+  </ds:schemaRefs>
+</ds:datastoreItem>
 </file>
 
-<file path=customXml/itemProps1.xml><?xml version="1.0" encoding="utf-8"?>
+<file path=customXml/itemProps4.xml><?xml version="1.0" encoding="utf-8"?>
 <ds:datastoreItem xmlns:ds="http://schemas.openxmlformats.org/officeDocument/2006/customXml" ds:itemID="{1A4E63CB-0BBC-477D-B96D-0B1E89CFECED}">
   <ds:schemaRefs>
     <ds:schemaRef ds:uri="http://schemas.microsoft.com/office/2006/metadata/contentType"/>
@@ -4501,36 +6900,4 @@
     <ds:schemaRef ds:uri="http://schemas.microsoft.com/internal/obd"/>
   </ds:schemaRefs>
 </ds:datastoreItem>
-</file>
-
-<file path=customXml/itemProps2.xml><?xml version="1.0" encoding="utf-8"?>
-<ds:datastoreItem xmlns:ds="http://schemas.openxmlformats.org/officeDocument/2006/customXml" ds:itemID="{372B79FC-6971-4544-98C5-83069028712A}">
-  <ds:schemaRefs>
-    <ds:schemaRef ds:uri="http://purl.org/dc/dcmitype/"/>
-    <ds:schemaRef ds:uri="http://purl.org/dc/elements/1.1/"/>
-    <ds:schemaRef ds:uri="http://www.w3.org/XML/1998/namespace"/>
-    <ds:schemaRef ds:uri="126e8a1c-9ea9-435a-ac89-d06c80d62e30"/>
-    <ds:schemaRef ds:uri="http://schemas.microsoft.com/office/2006/documentManagement/types"/>
-    <ds:schemaRef ds:uri="http://purl.org/dc/terms/"/>
-    <ds:schemaRef ds:uri="http://schemas.microsoft.com/office/infopath/2007/PartnerControls"/>
-    <ds:schemaRef ds:uri="http://schemas.openxmlformats.org/package/2006/metadata/core-properties"/>
-    <ds:schemaRef ds:uri="http://schemas.microsoft.com/office/2006/metadata/properties"/>
-  </ds:schemaRefs>
-</ds:datastoreItem>
-</file>
-
-<file path=customXml/itemProps3.xml><?xml version="1.0" encoding="utf-8"?>
-<ds:datastoreItem xmlns:ds="http://schemas.openxmlformats.org/officeDocument/2006/customXml" ds:itemID="{DB26575A-B7B3-4412-B642-D3B0845180CC}">
-  <ds:schemaRefs>
-    <ds:schemaRef ds:uri="http://schemas.microsoft.com/sharepoint/v3/contenttype/forms"/>
-  </ds:schemaRefs>
-</ds:datastoreItem>
-</file>
-
-<file path=customXml/itemProps4.xml><?xml version="1.0" encoding="utf-8"?>
-<ds:datastoreItem xmlns:ds="http://schemas.openxmlformats.org/officeDocument/2006/customXml" ds:itemID="{BDCED711-E314-4C22-B587-D275DD8897EC}">
-  <ds:schemaRefs>
-    <ds:schemaRef ds:uri="http://schemas.openxmlformats.org/officeDocument/2006/bibliography"/>
-  </ds:schemaRefs>
-</ds:datastoreItem>
 </file>
</xml_diff>

<commit_message>
Individual + grupal Nicolás
</commit_message>
<xml_diff>
--- a/Fase 2/Evidencias Grupales/2.6_GuiaEstudiante_Fase 2_Informe Final Proyecto APT.docx
+++ b/Fase 2/Evidencias Grupales/2.6_GuiaEstudiante_Fase 2_Informe Final Proyecto APT.docx
@@ -855,44 +855,20 @@
               <w:rPr>
                 <w:bCs/>
               </w:rPr>
-              <w:t xml:space="preserve">Construir modelos de datos para soportar los requerimientos de la organización </w:t>
-            </w:r>
-            <w:r>
+              <w:t>Construir modelos de datos para soportar los requerimientos de la organización de acuerdo con un diseño definido y escalable en el tiempo.</w:t>
+            </w:r>
+          </w:p>
+          <w:p>
+            <w:pPr>
               <w:rPr>
                 <w:bCs/>
               </w:rPr>
-              <w:t>de acuerdo con</w:t>
-            </w:r>
+            </w:pPr>
             <w:r>
               <w:rPr>
                 <w:bCs/>
               </w:rPr>
-              <w:t xml:space="preserve"> un diseño definido y escalable en el tiempo.</w:t>
-            </w:r>
-          </w:p>
-          <w:p>
-            <w:pPr>
-              <w:rPr>
-                <w:bCs/>
-              </w:rPr>
-            </w:pPr>
-            <w:r>
-              <w:rPr>
-                <w:bCs/>
-              </w:rPr>
-              <w:t xml:space="preserve">Gestionar proyectos informáticos, ofreciendo alternativas para la toma de decisiones </w:t>
-            </w:r>
-            <w:r>
-              <w:rPr>
-                <w:bCs/>
-              </w:rPr>
-              <w:t>de acuerdo con</w:t>
-            </w:r>
-            <w:r>
-              <w:rPr>
-                <w:bCs/>
-              </w:rPr>
-              <w:t xml:space="preserve"> los requerimientos de la organización.</w:t>
+              <w:t>Gestionar proyectos informáticos, ofreciendo alternativas para la toma de decisiones de acuerdo con los requerimientos de la organización.</w:t>
             </w:r>
           </w:p>
           <w:p>
@@ -1064,39 +1040,7 @@
                 <w:sz w:val="18"/>
                 <w:szCs w:val="18"/>
               </w:rPr>
-              <w:t xml:space="preserve"> Lading (BL) en PDF, con un formato distinto por cada naviera, y se transcribe a mano a planillas Excel. Existen además cuatro “verdades” que no están conectadas: la documental (el PDF), la marítima (dónde está el barco), la portuaria (lo que registra el terminal) y la administrativa (el estado ante Aduana). Las multas de </w:t>
-            </w:r>
-            <w:r>
-              <w:rPr>
-                <w:rFonts w:ascii="Calibri" w:hAnsi="Calibri" w:cs="Arial"/>
-                <w:sz w:val="18"/>
-                <w:szCs w:val="18"/>
-              </w:rPr>
-              <w:t>sobreestadía (</w:t>
-            </w:r>
-            <w:r>
-              <w:rPr>
-                <w:rFonts w:ascii="Calibri" w:hAnsi="Calibri" w:cs="Arial"/>
-                <w:sz w:val="18"/>
-                <w:szCs w:val="18"/>
-              </w:rPr>
-              <w:t xml:space="preserve">contenedor que permanece en el puerto más días de los pactados) y de </w:t>
-            </w:r>
-            <w:r>
-              <w:rPr>
-                <w:rFonts w:ascii="Calibri" w:hAnsi="Calibri" w:cs="Arial"/>
-                <w:sz w:val="18"/>
-                <w:szCs w:val="18"/>
-              </w:rPr>
-              <w:t>detención (</w:t>
-            </w:r>
-            <w:r>
-              <w:rPr>
-                <w:rFonts w:ascii="Calibri" w:hAnsi="Calibri" w:cs="Arial"/>
-                <w:sz w:val="18"/>
-                <w:szCs w:val="18"/>
-              </w:rPr>
-              <w:t>contenedor que no se devuelve vacío a tiempo) se cobran sobre la verdad portuaria, pero hoy se gestionan con la documental, por lo que se reacciona tarde.</w:t>
+              <w:t xml:space="preserve"> Lading (BL) en PDF, con un formato distinto por cada naviera, y se transcribe a mano a planillas Excel. Existen además cuatro “verdades” que no están conectadas: la documental (el PDF), la marítima (dónde está el barco), la portuaria (lo que registra el terminal) y la administrativa (el estado ante Aduana). Las multas de sobreestadía (contenedor que permanece en el puerto más días de los pactados) y de detención (contenedor que no se devuelve vacío a tiempo) se cobran sobre la verdad portuaria, pero hoy se gestionan con la documental, por lo que se reacciona tarde.</w:t>
             </w:r>
           </w:p>
           <w:p>
@@ -1165,31 +1109,7 @@
                 <w:sz w:val="18"/>
                 <w:szCs w:val="18"/>
               </w:rPr>
-              <w:t>A los encargados de Comercio Exterior, que hoy coordinan la logística con Excel, correos y WhatsApp y cargan con una alta carga cognitiva; a sus jefaturas, que no tienen visibilidad consolidada del equipo; y a la empresa, que asume multas estimadas en 150</w:t>
-            </w:r>
-            <w:r>
-              <w:rPr>
-                <w:rFonts w:ascii="Calibri" w:hAnsi="Calibri" w:cs="Arial"/>
-                <w:sz w:val="18"/>
-                <w:szCs w:val="18"/>
-              </w:rPr>
-              <w:t>-</w:t>
-            </w:r>
-            <w:r>
-              <w:rPr>
-                <w:rFonts w:ascii="Calibri" w:hAnsi="Calibri" w:cs="Arial"/>
-                <w:sz w:val="18"/>
-                <w:szCs w:val="18"/>
-              </w:rPr>
-              <w:t>400 USD diarios por sobreestadía y 100–250 USD diarios por detención.</w:t>
-            </w:r>
-            <w:r>
-              <w:rPr>
-                <w:rFonts w:ascii="Calibri" w:hAnsi="Calibri" w:cs="Arial"/>
-                <w:sz w:val="18"/>
-                <w:szCs w:val="18"/>
-              </w:rPr>
-              <w:t xml:space="preserve"> </w:t>
+              <w:t xml:space="preserve">A los encargados de Comercio Exterior, que hoy coordinan la logística con Excel, correos y WhatsApp y cargan con una alta carga cognitiva; a sus jefaturas, que no tienen visibilidad consolidada del equipo; y a la empresa, que asume multas estimadas en 150-400 USD diarios por sobreestadía y 100–250 USD diarios por detención. </w:t>
             </w:r>
           </w:p>
           <w:p>
@@ -1231,15 +1151,7 @@
                 <w:sz w:val="18"/>
                 <w:szCs w:val="18"/>
               </w:rPr>
-              <w:t xml:space="preserve"> lee los BL con IA, los registra en una grilla centralizada, contrasta la información con el estado real del terminal y calcula las fechas límite de sobreestadía y detención. Un semáforo de riesgo y alertas en tiempo real (objetivo menor a 60 segundos) permiten actuar con unas 48 horas de anticipación, y los borradores de correo al agente de aduana se generan automáticamente pero nunca se envían sin aprobación humana. Para el proyecto el valor se valida con documentos BL sintéticos y una estrategia de contingencia simulada (Mock) de los terminales; además, el diseño considera la Ley 21.719 de protección de datos personales, ya que el PDF original nunca se guarda en la base de datos.</w:t>
-            </w:r>
-            <w:r>
-              <w:rPr>
-                <w:rFonts w:ascii="Calibri" w:hAnsi="Calibri" w:cs="Arial"/>
-                <w:sz w:val="18"/>
-                <w:szCs w:val="18"/>
-              </w:rPr>
-              <w:t xml:space="preserve"> </w:t>
+              <w:t xml:space="preserve"> lee los BL con IA, los registra en una grilla centralizada, contrasta la información con el estado real del terminal y calcula las fechas límite de sobreestadía y detención. Un semáforo de riesgo y alertas en tiempo real (objetivo menor a 60 segundos) permiten actuar con unas 48 horas de anticipación, y los borradores de correo al agente de aduana se generan automáticamente pero nunca se envían sin aprobación humana. Para el proyecto el valor se valida con documentos BL sintéticos y una estrategia de contingencia simulada (Mock) de los terminales; además, el diseño considera la Ley 21.719 de protección de datos personales, ya que el PDF original nunca se guarda en la base de datos. </w:t>
             </w:r>
           </w:p>
         </w:tc>
@@ -1569,23 +1481,7 @@
                 <w:sz w:val="18"/>
                 <w:szCs w:val="18"/>
               </w:rPr>
-              <w:t xml:space="preserve"> real y una estrategia simulada (Mock), con conmutación automática mediante un </w:t>
-            </w:r>
-            <w:r>
-              <w:rPr>
-                <w:rFonts w:ascii="Calibri" w:hAnsi="Calibri" w:cs="Arial"/>
-                <w:sz w:val="18"/>
-                <w:szCs w:val="18"/>
-              </w:rPr>
-              <w:t>disyuntor</w:t>
-            </w:r>
-            <w:r>
-              <w:rPr>
-                <w:rFonts w:ascii="Calibri" w:hAnsi="Calibri" w:cs="Arial"/>
-                <w:sz w:val="18"/>
-                <w:szCs w:val="18"/>
-              </w:rPr>
-              <w:t>.</w:t>
+              <w:t xml:space="preserve"> real y una estrategia simulada (Mock), con conmutación automática mediante un disyuntor.</w:t>
             </w:r>
           </w:p>
           <w:p>
@@ -1617,15 +1513,7 @@
                 <w:sz w:val="18"/>
                 <w:szCs w:val="18"/>
               </w:rPr>
-              <w:t>Implementar el motor de reglas de negocio que calcule las fechas límite de sobreestadía y detención, determine el nivel de riesgo de cada contenedor y dispare notificaciones en tiempo real.</w:t>
-            </w:r>
-            <w:r>
-              <w:rPr>
-                <w:rFonts w:ascii="Calibri" w:hAnsi="Calibri" w:cs="Arial"/>
-                <w:sz w:val="18"/>
-                <w:szCs w:val="18"/>
-              </w:rPr>
-              <w:t xml:space="preserve"> </w:t>
+              <w:t xml:space="preserve">Implementar el motor de reglas de negocio que calcule las fechas límite de sobreestadía y detención, determine el nivel de riesgo de cada contenedor y dispare notificaciones en tiempo real. </w:t>
             </w:r>
           </w:p>
           <w:p>
@@ -1866,23 +1754,7 @@
                 <w:sz w:val="18"/>
                 <w:szCs w:val="18"/>
               </w:rPr>
-              <w:t xml:space="preserve">Scrum, con 8 </w:t>
-            </w:r>
-            <w:r>
-              <w:rPr>
-                <w:rFonts w:ascii="Calibri" w:hAnsi="Calibri" w:cs="Arial"/>
-                <w:sz w:val="18"/>
-                <w:szCs w:val="18"/>
-              </w:rPr>
-              <w:t>iteraciones</w:t>
-            </w:r>
-            <w:r>
-              <w:rPr>
-                <w:rFonts w:ascii="Calibri" w:hAnsi="Calibri" w:cs="Arial"/>
-                <w:sz w:val="18"/>
-                <w:szCs w:val="18"/>
-              </w:rPr>
-              <w:t xml:space="preserve"> de dos semanas a lo largo de las 16 semanas del proyecto. El trabajo se gestiona con un </w:t>
+              <w:t xml:space="preserve">Scrum, con 8 iteraciones de dos semanas a lo largo de las 16 semanas del proyecto. El trabajo se gestiona con un </w:t>
             </w:r>
             <w:proofErr w:type="spellStart"/>
             <w:r>
@@ -1900,23 +1772,7 @@
                 <w:sz w:val="18"/>
                 <w:szCs w:val="18"/>
               </w:rPr>
-              <w:t xml:space="preserve"> Backlog de 16 historias de usuario</w:t>
-            </w:r>
-            <w:r>
-              <w:rPr>
-                <w:rFonts w:ascii="Calibri" w:hAnsi="Calibri" w:cs="Arial"/>
-                <w:sz w:val="18"/>
-                <w:szCs w:val="18"/>
-              </w:rPr>
-              <w:t xml:space="preserve"> </w:t>
-            </w:r>
-            <w:r>
-              <w:rPr>
-                <w:rFonts w:ascii="Calibri" w:hAnsi="Calibri" w:cs="Arial"/>
-                <w:sz w:val="18"/>
-                <w:szCs w:val="18"/>
-              </w:rPr>
-              <w:t xml:space="preserve">con criterios de aceptación en formato Dado/Cuando/Entonces y un </w:t>
+              <w:t xml:space="preserve"> Backlog de 16 historias de usuario con criterios de aceptación en formato Dado/Cuando/Entonces y un </w:t>
             </w:r>
             <w:proofErr w:type="spellStart"/>
             <w:r>
@@ -2190,23 +2046,7 @@
                 <w:sz w:val="18"/>
                 <w:szCs w:val="18"/>
               </w:rPr>
-              <w:t xml:space="preserve">desarrollo por </w:t>
-            </w:r>
-            <w:r>
-              <w:rPr>
-                <w:rFonts w:ascii="Calibri" w:hAnsi="Calibri" w:cs="Arial"/>
-                <w:sz w:val="18"/>
-                <w:szCs w:val="18"/>
-              </w:rPr>
-              <w:t>iteraciones</w:t>
-            </w:r>
-            <w:r>
-              <w:rPr>
-                <w:rFonts w:ascii="Calibri" w:hAnsi="Calibri" w:cs="Arial"/>
-                <w:sz w:val="18"/>
-                <w:szCs w:val="18"/>
-              </w:rPr>
-              <w:t xml:space="preserve"> en ramas </w:t>
+              <w:t xml:space="preserve">desarrollo por iteraciones en ramas </w:t>
             </w:r>
             <w:proofErr w:type="spellStart"/>
             <w:r>
@@ -2477,23 +2317,7 @@
                 <w:sz w:val="18"/>
                 <w:szCs w:val="18"/>
               </w:rPr>
-              <w:t xml:space="preserve"> con </w:t>
-            </w:r>
-            <w:r>
-              <w:rPr>
-                <w:rFonts w:ascii="Calibri" w:hAnsi="Calibri" w:cs="Arial"/>
-                <w:sz w:val="18"/>
-                <w:szCs w:val="18"/>
-              </w:rPr>
-              <w:t>disyuntor</w:t>
-            </w:r>
-            <w:r>
-              <w:rPr>
-                <w:rFonts w:ascii="Calibri" w:hAnsi="Calibri" w:cs="Arial"/>
-                <w:sz w:val="18"/>
-                <w:szCs w:val="18"/>
-              </w:rPr>
-              <w:t xml:space="preserve"> permite avanzar aun si el </w:t>
+              <w:t xml:space="preserve"> con disyuntor permite avanzar aun si el </w:t>
             </w:r>
             <w:proofErr w:type="spellStart"/>
             <w:r>
@@ -2582,25 +2406,7 @@
                 <w:sz w:val="18"/>
                 <w:szCs w:val="18"/>
               </w:rPr>
-              <w:t xml:space="preserve">Semanas 1-2, análisis y </w:t>
-            </w:r>
-            <w:r>
-              <w:rPr>
-                <w:rFonts w:ascii="Calibri" w:hAnsi="Calibri" w:cs="Arial"/>
-                <w:b/>
-                <w:sz w:val="18"/>
-                <w:szCs w:val="18"/>
-              </w:rPr>
-              <w:t>configuración</w:t>
-            </w:r>
-            <w:r>
-              <w:rPr>
-                <w:rFonts w:ascii="Calibri" w:hAnsi="Calibri" w:cs="Arial"/>
-                <w:b/>
-                <w:sz w:val="18"/>
-                <w:szCs w:val="18"/>
-              </w:rPr>
-              <w:t xml:space="preserve">: </w:t>
+              <w:t xml:space="preserve">Semanas 1-2, análisis y configuración: </w:t>
             </w:r>
             <w:r>
               <w:rPr>
@@ -2910,23 +2716,7 @@
                 <w:sz w:val="18"/>
                 <w:szCs w:val="18"/>
               </w:rPr>
-              <w:t>catálogo de casos de uso, storyboards, diagrama de arquitectura, diagrama de secuencia usuario-</w:t>
-            </w:r>
-            <w:r>
-              <w:rPr>
-                <w:rFonts w:ascii="Calibri" w:hAnsi="Calibri" w:cs="Arial"/>
-                <w:sz w:val="18"/>
-                <w:szCs w:val="18"/>
-              </w:rPr>
-              <w:t>sistema y</w:t>
-            </w:r>
-            <w:r>
-              <w:rPr>
-                <w:rFonts w:ascii="Calibri" w:hAnsi="Calibri" w:cs="Arial"/>
-                <w:sz w:val="18"/>
-                <w:szCs w:val="18"/>
-              </w:rPr>
-              <w:t xml:space="preserve"> análisis de almacenamiento y cumplimiento de la Ley 21.719.</w:t>
+              <w:t>catálogo de casos de uso, storyboards, diagrama de arquitectura, diagrama de secuencia usuario-sistema y análisis de almacenamiento y cumplimiento de la Ley 21.719.</w:t>
             </w:r>
           </w:p>
           <w:p>
@@ -2949,16 +2739,7 @@
                 <w:sz w:val="18"/>
                 <w:szCs w:val="18"/>
               </w:rPr>
-              <w:t>Iteraciones</w:t>
-            </w:r>
-            <w:r>
-              <w:rPr>
-                <w:rFonts w:ascii="Calibri" w:hAnsi="Calibri" w:cs="Arial"/>
-                <w:b/>
-                <w:sz w:val="18"/>
-                <w:szCs w:val="18"/>
-              </w:rPr>
-              <w:t xml:space="preserve"> siguientes (en ejecución y planificados): </w:t>
+              <w:t xml:space="preserve">Iteraciones siguientes (en ejecución y planificados): </w:t>
             </w:r>
             <w:r>
               <w:rPr>
@@ -2984,23 +2765,7 @@
                 <w:sz w:val="18"/>
                 <w:szCs w:val="18"/>
               </w:rPr>
-              <w:t xml:space="preserve"> + Mock + </w:t>
-            </w:r>
-            <w:r>
-              <w:rPr>
-                <w:rFonts w:ascii="Calibri" w:hAnsi="Calibri" w:cs="Arial"/>
-                <w:sz w:val="18"/>
-                <w:szCs w:val="18"/>
-              </w:rPr>
-              <w:t>disyuntor</w:t>
-            </w:r>
-            <w:r>
-              <w:rPr>
-                <w:rFonts w:ascii="Calibri" w:hAnsi="Calibri" w:cs="Arial"/>
-                <w:sz w:val="18"/>
-                <w:szCs w:val="18"/>
-              </w:rPr>
-              <w:t>, aprobación humana de correos, rol de jefe de analistas, pruebas integrales y cierre.</w:t>
+              <w:t xml:space="preserve"> + Mock + disyuntor, aprobación humana de correos, rol de jefe de analistas, pruebas integrales y cierre.</w:t>
             </w:r>
           </w:p>
           <w:p>
@@ -3078,15 +2843,7 @@
                 <w:sz w:val="18"/>
                 <w:szCs w:val="18"/>
               </w:rPr>
-              <w:t xml:space="preserve"> permite levantar el mismo entorno en los equipos de los tres integrantes.</w:t>
-            </w:r>
-            <w:r>
-              <w:rPr>
-                <w:rFonts w:ascii="Calibri" w:hAnsi="Calibri" w:cs="Arial"/>
-                <w:sz w:val="18"/>
-                <w:szCs w:val="18"/>
-              </w:rPr>
-              <w:t xml:space="preserve"> </w:t>
+              <w:t xml:space="preserve"> permite levantar el mismo entorno en los equipos de los tres integrantes. </w:t>
             </w:r>
           </w:p>
           <w:p>
@@ -3214,23 +2971,7 @@
                 <w:sz w:val="18"/>
                 <w:szCs w:val="18"/>
               </w:rPr>
-              <w:t xml:space="preserve"> no era accesible; Swagger no cargaba en el contenedor del Core por correr en modo </w:t>
-            </w:r>
-            <w:r>
-              <w:rPr>
-                <w:rFonts w:ascii="Calibri" w:hAnsi="Calibri" w:cs="Arial"/>
-                <w:sz w:val="18"/>
-                <w:szCs w:val="18"/>
-              </w:rPr>
-              <w:t>equivocado</w:t>
-            </w:r>
-            <w:r>
-              <w:rPr>
-                <w:rFonts w:ascii="Calibri" w:hAnsi="Calibri" w:cs="Arial"/>
-                <w:sz w:val="18"/>
-                <w:szCs w:val="18"/>
-              </w:rPr>
-              <w:t xml:space="preserve">; el CLI de Angular rechazó la creación del proyecto en una carpeta ya existente; y hubo conflictos de ramas y de Pull </w:t>
+              <w:t xml:space="preserve"> no era accesible; Swagger no cargaba en el contenedor del Core por correr en modo equivocado; el CLI de Angular rechazó la creación del proyecto en una carpeta ya existente; y hubo conflictos de ramas y de Pull </w:t>
             </w:r>
             <w:proofErr w:type="spellStart"/>
             <w:r>
@@ -3699,23 +3440,7 @@
                 <w:sz w:val="18"/>
                 <w:szCs w:val="18"/>
               </w:rPr>
-              <w:t xml:space="preserve">se evaluaron </w:t>
-            </w:r>
-            <w:r>
-              <w:rPr>
-                <w:rFonts w:ascii="Calibri" w:hAnsi="Calibri" w:cs="Arial"/>
-                <w:sz w:val="18"/>
-                <w:szCs w:val="18"/>
-              </w:rPr>
-              <w:t>iteraciones</w:t>
-            </w:r>
-            <w:r>
-              <w:rPr>
-                <w:rFonts w:ascii="Calibri" w:hAnsi="Calibri" w:cs="Arial"/>
-                <w:sz w:val="18"/>
-                <w:szCs w:val="18"/>
-              </w:rPr>
-              <w:t xml:space="preserve"> de una semana y se descartaron por la carga horaria (10 a 15 horas semanales por integrante); se mantuvieron de dos semanas.</w:t>
+              <w:t>se evaluaron iteraciones de una semana y se descartaron por la carga horaria (10 a 15 horas semanales por integrante); se mantuvieron de dos semanas.</w:t>
             </w:r>
             <w:r>
               <w:rPr>
@@ -4664,6 +4389,182 @@
                 <w:szCs w:val="18"/>
               </w:rPr>
               <w:t>.</w:t>
+            </w:r>
+            <w:r>
+              <w:rPr>
+                <w:rFonts w:ascii="Calibri" w:hAnsi="Calibri" w:cs="Arial"/>
+                <w:sz w:val="18"/>
+                <w:szCs w:val="18"/>
+              </w:rPr>
+              <w:br/>
+            </w:r>
+            <w:r>
+              <w:rPr>
+                <w:rFonts w:ascii="Calibri" w:hAnsi="Calibri" w:cs="Arial"/>
+                <w:i/>
+                <w:color w:val="0070C0"/>
+                <w:sz w:val="18"/>
+                <w:szCs w:val="18"/>
+                <w:lang w:eastAsia="es-CL"/>
+              </w:rPr>
+              <w:br/>
+            </w:r>
+            <w:r>
+              <w:rPr>
+                <w:rFonts w:ascii="Calibri" w:hAnsi="Calibri" w:cs="Arial"/>
+                <w:i/>
+                <w:color w:val="0070C0"/>
+                <w:sz w:val="18"/>
+                <w:szCs w:val="20"/>
+                <w:lang w:eastAsia="es-CL"/>
+              </w:rPr>
+              <w:t>Nicolás Soto</w:t>
+            </w:r>
+          </w:p>
+          <w:p>
+            <w:pPr>
+              <w:jc w:val="both"/>
+              <w:rPr>
+                <w:rFonts w:ascii="Calibri" w:hAnsi="Calibri" w:cs="Arial"/>
+                <w:iCs/>
+                <w:sz w:val="18"/>
+                <w:szCs w:val="20"/>
+                <w:lang w:eastAsia="es-CL"/>
+              </w:rPr>
+            </w:pPr>
+            <w:r>
+              <w:rPr>
+                <w:rFonts w:ascii="Calibri" w:hAnsi="Calibri" w:cs="Arial"/>
+                <w:iCs/>
+                <w:sz w:val="18"/>
+                <w:szCs w:val="20"/>
+                <w:lang w:eastAsia="es-CL"/>
+              </w:rPr>
+              <w:t>Aporte al desarrollo de mis interese</w:t>
+            </w:r>
+            <w:r>
+              <w:rPr>
+                <w:rFonts w:ascii="Calibri" w:hAnsi="Calibri" w:cs="Arial"/>
+                <w:iCs/>
+                <w:sz w:val="18"/>
+                <w:szCs w:val="20"/>
+                <w:lang w:eastAsia="es-CL"/>
+              </w:rPr>
+              <w:t>s:</w:t>
+            </w:r>
+            <w:r>
+              <w:rPr>
+                <w:rFonts w:ascii="Calibri" w:hAnsi="Calibri" w:cs="Arial"/>
+                <w:iCs/>
+                <w:sz w:val="18"/>
+                <w:szCs w:val="20"/>
+                <w:lang w:eastAsia="es-CL"/>
+              </w:rPr>
+              <w:t xml:space="preserve"> En lo personal, me atrae profundamente el desarrollo </w:t>
+            </w:r>
+            <w:proofErr w:type="spellStart"/>
+            <w:r>
+              <w:rPr>
+                <w:rFonts w:ascii="Calibri" w:hAnsi="Calibri" w:cs="Arial"/>
+                <w:iCs/>
+                <w:sz w:val="18"/>
+                <w:szCs w:val="20"/>
+                <w:lang w:eastAsia="es-CL"/>
+              </w:rPr>
+              <w:t>backend</w:t>
+            </w:r>
+            <w:proofErr w:type="spellEnd"/>
+            <w:r>
+              <w:rPr>
+                <w:rFonts w:ascii="Calibri" w:hAnsi="Calibri" w:cs="Arial"/>
+                <w:iCs/>
+                <w:sz w:val="18"/>
+                <w:szCs w:val="20"/>
+                <w:lang w:eastAsia="es-CL"/>
+              </w:rPr>
+              <w:t xml:space="preserve">, particularmente la planificación de arquitectura y el desafío de ver funcionar un sistema integrado por múltiples capas y partes en movimiento. Mi participación en el proyecto me </w:t>
+            </w:r>
+            <w:r>
+              <w:rPr>
+                <w:rFonts w:ascii="Calibri" w:hAnsi="Calibri" w:cs="Arial"/>
+                <w:iCs/>
+                <w:sz w:val="18"/>
+                <w:szCs w:val="20"/>
+                <w:lang w:eastAsia="es-CL"/>
+              </w:rPr>
+              <w:t>esta permitiendo</w:t>
+            </w:r>
+            <w:r>
+              <w:rPr>
+                <w:rFonts w:ascii="Calibri" w:hAnsi="Calibri" w:cs="Arial"/>
+                <w:iCs/>
+                <w:sz w:val="18"/>
+                <w:szCs w:val="20"/>
+                <w:lang w:eastAsia="es-CL"/>
+              </w:rPr>
+              <w:t xml:space="preserve"> llevar esa curiosidad a la práctica, entendiendo el impacto directo que cada decisión de diseño tiene sobre la cohesión, el rendimiento</w:t>
+            </w:r>
+            <w:r>
+              <w:rPr>
+                <w:rFonts w:ascii="Calibri" w:hAnsi="Calibri" w:cs="Arial"/>
+                <w:iCs/>
+                <w:sz w:val="18"/>
+                <w:szCs w:val="20"/>
+                <w:lang w:eastAsia="es-CL"/>
+              </w:rPr>
+              <w:t xml:space="preserve"> </w:t>
+            </w:r>
+            <w:r>
+              <w:rPr>
+                <w:rFonts w:ascii="Calibri" w:hAnsi="Calibri" w:cs="Arial"/>
+                <w:iCs/>
+                <w:sz w:val="18"/>
+                <w:szCs w:val="20"/>
+                <w:lang w:eastAsia="es-CL"/>
+              </w:rPr>
+              <w:t>y la estabilidad global de la solución.</w:t>
+            </w:r>
+          </w:p>
+          <w:p>
+            <w:pPr>
+              <w:jc w:val="both"/>
+              <w:rPr>
+                <w:rFonts w:ascii="Calibri" w:hAnsi="Calibri" w:cs="Arial"/>
+                <w:iCs/>
+                <w:sz w:val="18"/>
+                <w:szCs w:val="20"/>
+                <w:lang w:eastAsia="es-CL"/>
+              </w:rPr>
+            </w:pPr>
+            <w:r>
+              <w:rPr>
+                <w:rFonts w:ascii="Calibri" w:hAnsi="Calibri" w:cs="Arial"/>
+                <w:iCs/>
+                <w:sz w:val="18"/>
+                <w:szCs w:val="20"/>
+                <w:lang w:eastAsia="es-CL"/>
+              </w:rPr>
+              <w:t>Proyecciones laboral</w:t>
+            </w:r>
+            <w:r>
+              <w:rPr>
+                <w:rFonts w:ascii="Calibri" w:hAnsi="Calibri" w:cs="Arial"/>
+                <w:iCs/>
+                <w:sz w:val="18"/>
+                <w:szCs w:val="20"/>
+                <w:lang w:eastAsia="es-CL"/>
+              </w:rPr>
+              <w:t xml:space="preserve">: </w:t>
+            </w:r>
+            <w:r>
+              <w:rPr>
+                <w:rFonts w:ascii="Calibri" w:hAnsi="Calibri" w:cs="Arial"/>
+                <w:iCs/>
+                <w:sz w:val="18"/>
+                <w:szCs w:val="20"/>
+                <w:lang w:eastAsia="es-CL"/>
+              </w:rPr>
+              <w:t>En lo laboral, este proyecto me está entregando una experiencia tangible al enfrentarme a problemas reales dentro de un sistema de mayor escala que los abordados anteriormente en la carrera. Valoro mucho poder vivir este proceso en tiempo real, ya que me permite construir bases sólidas sobre cómo abordar desafíos complejos, las cuales espero seguir expandiendo y aplicando a lo largo de toda mi carrera profesional.</w:t>
             </w:r>
           </w:p>
         </w:tc>
@@ -6709,10 +6610,6 @@
 </file>
 
 <file path=customXml/item1.xml><?xml version="1.0" encoding="utf-8"?>
-<b:Sources xmlns:b="http://schemas.openxmlformats.org/officeDocument/2006/bibliography" xmlns="http://schemas.openxmlformats.org/officeDocument/2006/bibliography" SelectedStyle="\APASixthEditionOfficeOnline.xsl" StyleName="APA" Version="6"/>
-</file>
-
-<file path=customXml/item2.xml><?xml version="1.0" encoding="utf-8"?>
 <?mso-contentType ?>
 <FormTemplates xmlns="http://schemas.microsoft.com/sharepoint/v3/contenttype/forms">
   <Display>DocumentLibraryForm</Display>
@@ -6721,13 +6618,11 @@
 </FormTemplates>
 </file>
 
-<file path=customXml/item3.xml><?xml version="1.0" encoding="utf-8"?>
-<p:properties xmlns:p="http://schemas.microsoft.com/office/2006/metadata/properties" xmlns:xsi="http://www.w3.org/2001/XMLSchema-instance" xmlns:pc="http://schemas.microsoft.com/office/infopath/2007/PartnerControls">
-  <documentManagement/>
-</p:properties>
+<file path=customXml/item2.xml><?xml version="1.0" encoding="utf-8"?>
+<b:Sources xmlns:b="http://schemas.openxmlformats.org/officeDocument/2006/bibliography" xmlns="http://schemas.openxmlformats.org/officeDocument/2006/bibliography" SelectedStyle="\APASixthEditionOfficeOnline.xsl" StyleName="APA" Version="6"/>
 </file>
 
-<file path=customXml/item4.xml><?xml version="1.0" encoding="utf-8"?>
+<file path=customXml/item3.xml><?xml version="1.0" encoding="utf-8"?>
 <ct:contentTypeSchema xmlns:ct="http://schemas.microsoft.com/office/2006/metadata/contentType" xmlns:ma="http://schemas.microsoft.com/office/2006/metadata/properties/metaAttributes" ct:_="" ma:_="" ma:contentTypeName="Documento" ma:contentTypeID="0x010100E96778489EE7714D8BD12CC105EB918B" ma:contentTypeVersion="2" ma:contentTypeDescription="Crear nuevo documento." ma:contentTypeScope="" ma:versionID="416c5c7ae9b5d54d83875cd3c65194e3">
   <xsd:schema xmlns:xsd="http://www.w3.org/2001/XMLSchema" xmlns:xs="http://www.w3.org/2001/XMLSchema" xmlns:p="http://schemas.microsoft.com/office/2006/metadata/properties" xmlns:ns2="126e8a1c-9ea9-435a-ac89-d06c80d62e30" targetNamespace="http://schemas.microsoft.com/office/2006/metadata/properties" ma:root="true" ma:fieldsID="70a237c842677bd850644f8595079f5e" ns2:_="">
     <xsd:import namespace="126e8a1c-9ea9-435a-ac89-d06c80d62e30"/>
@@ -6859,7 +6754,21 @@
 </ct:contentTypeSchema>
 </file>
 
+<file path=customXml/item4.xml><?xml version="1.0" encoding="utf-8"?>
+<p:properties xmlns:p="http://schemas.microsoft.com/office/2006/metadata/properties" xmlns:xsi="http://www.w3.org/2001/XMLSchema-instance" xmlns:pc="http://schemas.microsoft.com/office/infopath/2007/PartnerControls">
+  <documentManagement/>
+</p:properties>
+</file>
+
 <file path=customXml/itemProps1.xml><?xml version="1.0" encoding="utf-8"?>
+<ds:datastoreItem xmlns:ds="http://schemas.openxmlformats.org/officeDocument/2006/customXml" ds:itemID="{DB26575A-B7B3-4412-B642-D3B0845180CC}">
+  <ds:schemaRefs>
+    <ds:schemaRef ds:uri="http://schemas.microsoft.com/sharepoint/v3/contenttype/forms"/>
+  </ds:schemaRefs>
+</ds:datastoreItem>
+</file>
+
+<file path=customXml/itemProps2.xml><?xml version="1.0" encoding="utf-8"?>
 <ds:datastoreItem xmlns:ds="http://schemas.openxmlformats.org/officeDocument/2006/customXml" ds:itemID="{BDCED711-E314-4C22-B587-D275DD8897EC}">
   <ds:schemaRefs>
     <ds:schemaRef ds:uri="http://schemas.openxmlformats.org/officeDocument/2006/bibliography"/>
@@ -6867,24 +6776,7 @@
 </ds:datastoreItem>
 </file>
 
-<file path=customXml/itemProps2.xml><?xml version="1.0" encoding="utf-8"?>
-<ds:datastoreItem xmlns:ds="http://schemas.openxmlformats.org/officeDocument/2006/customXml" ds:itemID="{DB26575A-B7B3-4412-B642-D3B0845180CC}">
-  <ds:schemaRefs>
-    <ds:schemaRef ds:uri="http://schemas.microsoft.com/sharepoint/v3/contenttype/forms"/>
-  </ds:schemaRefs>
-</ds:datastoreItem>
-</file>
-
 <file path=customXml/itemProps3.xml><?xml version="1.0" encoding="utf-8"?>
-<ds:datastoreItem xmlns:ds="http://schemas.openxmlformats.org/officeDocument/2006/customXml" ds:itemID="{372B79FC-6971-4544-98C5-83069028712A}">
-  <ds:schemaRefs>
-    <ds:schemaRef ds:uri="http://schemas.microsoft.com/office/2006/metadata/properties"/>
-    <ds:schemaRef ds:uri="http://schemas.microsoft.com/office/infopath/2007/PartnerControls"/>
-  </ds:schemaRefs>
-</ds:datastoreItem>
-</file>
-
-<file path=customXml/itemProps4.xml><?xml version="1.0" encoding="utf-8"?>
 <ds:datastoreItem xmlns:ds="http://schemas.openxmlformats.org/officeDocument/2006/customXml" ds:itemID="{1A4E63CB-0BBC-477D-B96D-0B1E89CFECED}">
   <ds:schemaRefs>
     <ds:schemaRef ds:uri="http://schemas.microsoft.com/office/2006/metadata/contentType"/>
@@ -6900,4 +6792,13 @@
     <ds:schemaRef ds:uri="http://schemas.microsoft.com/internal/obd"/>
   </ds:schemaRefs>
 </ds:datastoreItem>
+</file>
+
+<file path=customXml/itemProps4.xml><?xml version="1.0" encoding="utf-8"?>
+<ds:datastoreItem xmlns:ds="http://schemas.openxmlformats.org/officeDocument/2006/customXml" ds:itemID="{372B79FC-6971-4544-98C5-83069028712A}">
+  <ds:schemaRefs>
+    <ds:schemaRef ds:uri="http://schemas.microsoft.com/office/2006/metadata/properties"/>
+    <ds:schemaRef ds:uri="http://schemas.microsoft.com/office/infopath/2007/PartnerControls"/>
+  </ds:schemaRefs>
+</ds:datastoreItem>
 </file>
</xml_diff>